<commit_message>
Docs: methode a 10 marqueurs ArUco (manuel, guide de pose, planche)
- Manuel de calibration mis a jour pour 10 marqueurs (schema section 2,
  liste section 6, tableau section 11, distances depuis la poche du milieu).
- Nouveau guide de pose (schema de la table + tableau + consignes).
- Nouvelle planche de 10 marqueurs a imprimer (60 mm). L'ancienne planche
  a 6 marqueurs (planche_6_*, marker_0..5) est perimee.

Co-Authored-By: Claude Sonnet 5.5 <noreply@anthropic.com>
</commit_message>
<xml_diff>
--- a/docs/manuel_calibration_cameras.docx
+++ b/docs/manuel_calibration_cameras.docx
@@ -29,7 +29,7 @@
           <w:sz w:val="26"/>
           <w:szCs w:val="26"/>
         </w:rPr>
-        <w:t xml:space="preserve">Snooker Player 3.0 — Méthode simplifiée à 6 marqueurs ArUco</w:t>
+        <w:t>Snooker Player 3.0 — Méthode à 10 marqueurs ArUco</w:t>
       </w:r>
     </w:p>
     <w:p>
@@ -46,7 +46,7 @@
         <w:spacing w:after="120"/>
       </w:pPr>
       <w:r>
-        <w:t xml:space="preserve">Ce manuel explique comment calibrer les 3 caméras du système Snooker Player 3.0, avec la méthode simplifiée à 6 marqueurs ArUco (2 par caméra), positionnés sur le rebord de la table.</w:t>
+        <w:t>Ce manuel explique comment calibrer les 3 caméras du système Snooker Player 3.0, avec la méthode à 10 marqueurs ArUco : 4 marqueurs pour la caméra 1, 2 pour la caméra 2 et 4 pour la caméra 3, positionnés sur la bordure de la table. Les caméras 1 et 3 sont inclinées d'environ 4° vers l'extérieur (4 marqueurs, calibration par homographie) ; la caméra 2 est verticale, au centre (2 marqueurs suffisent).</w:t>
       </w:r>
     </w:p>
     <w:p>
@@ -66,7 +66,7 @@
       <w:r>
         <w:drawing>
           <wp:inline distT="0" distB="0" distL="0" distR="0">
-            <wp:extent cx="5334000" cy="3295650"/>
+            <wp:extent cx="5334000" cy="2133600"/>
             <wp:effectExtent t="0" r="0" b="0" l="0"/>
             <wp:docPr id="1" name="" descr="" title=""/>
             <wp:cNvGraphicFramePr>
@@ -91,7 +91,7 @@
                   <pic:spPr bwMode="auto">
                     <a:xfrm>
                       <a:off x="0" y="0"/>
-                      <a:ext cx="5334000" cy="3295650"/>
+                      <a:ext cx="5334000" cy="2133600"/>
                     </a:xfrm>
                     <a:prstGeom prst="rect">
                       <a:avLst/>
@@ -109,7 +109,7 @@
         <w:spacing w:after="120"/>
       </w:pPr>
       <w:r>
-        <w:t xml:space="preserve">Les 3 caméras sont alignées avec les billes marron, bleue, et le milieu rose/noire. Jaune et verte sont de part et d'autre de la ligne centrale, à la même position que marron (ligne de baulk). Les 6 marqueurs ArUco sont collés sur le rebord (5mm), 2 par caméra.</w:t>
+        <w:t>Les 3 caméras sont alignées avec les billes marron, bleue, et le milieu rose/noire. Jaune et verte sont de part et d'autre de la ligne centrale, à la même position que marron (ligne de baulk). Les 10 marqueurs ArUco sont collés sur la bordure de la table (le rail marron), aux positions du schéma et du tableau de la section 11.</w:t>
       </w:r>
     </w:p>
     <w:p>
@@ -226,7 +226,7 @@
         <w:spacing w:after="150" w:before="300"/>
       </w:pPr>
       <w:r>
-        <w:t xml:space="preserve">5. Étape 1 — Générer les 6 marqueurs</w:t>
+        <w:t>5. Étape 1 — Générer les 10 marqueurs</w:t>
       </w:r>
     </w:p>
     <w:p>
@@ -254,7 +254,7 @@
         <w:spacing w:after="120"/>
       </w:pPr>
       <w:r>
-        <w:t xml:space="preserve">Crée marker_0.png à marker_5.png. La planche prête à imprimer est fournie en page suivante — ou générez-les vous-même avec la commande ci-dessus.</w:t>
+        <w:t>Crée marker_1.png à marker_10.png. La planche prête à imprimer est le fichier planche_10_marqueurs_aruco_a_imprimer.pdf (section 10) — ou générez-les vous-même avec la commande ci-dessus.</w:t>
       </w:r>
     </w:p>
     <w:p>
@@ -263,7 +263,7 @@
         <w:spacing w:after="150" w:before="300"/>
       </w:pPr>
       <w:r>
-        <w:t xml:space="preserve">6. Étape 2 — Coller les marqueurs sur le rebord</w:t>
+        <w:t>6. Étape 2 — Coller les marqueurs sur la bordure</w:t>
       </w:r>
     </w:p>
     <w:p>
@@ -276,7 +276,7 @@
         <w:spacing w:after="80"/>
       </w:pPr>
       <w:r>
-        <w:t xml:space="preserve">marker_0.png → Caméra 1 (jaune/verte/marron), rebord HAUT</w:t>
+        <w:t>marker_1.png → Caméra 1 (jaune/verte/marron), bord HAUT, coin côté baulk (178,5 cm de la poche du milieu, vers le baulk)</w:t>
       </w:r>
     </w:p>
     <w:p>
@@ -289,7 +289,7 @@
         <w:spacing w:after="80"/>
       </w:pPr>
       <w:r>
-        <w:t xml:space="preserve">marker_1.png → Caméra 1 (jaune/verte/marron), rebord BAS</w:t>
+        <w:t>marker_2.png → Caméra 1 (jaune/verte/marron), bord HAUT, côté caméra 2 (48,5 cm de la poche du milieu, vers le baulk)</w:t>
       </w:r>
     </w:p>
     <w:p>
@@ -302,7 +302,7 @@
         <w:spacing w:after="80"/>
       </w:pPr>
       <w:r>
-        <w:t xml:space="preserve">marker_2.png → Caméra 2 (bleue, centre), rebord HAUT</w:t>
+        <w:t>marker_3.png → Caméra 1 (jaune/verte/marron), bord BAS, coin côté baulk (178,5 cm de la poche du milieu, vers le baulk)</w:t>
       </w:r>
     </w:p>
     <w:p>
@@ -315,7 +315,7 @@
         <w:spacing w:after="80"/>
       </w:pPr>
       <w:r>
-        <w:t xml:space="preserve">marker_3.png → Caméra 2 (bleue, centre), rebord BAS</w:t>
+        <w:t>marker_4.png → Caméra 1 (jaune/verte/marron), bord BAS, côté caméra 2 (48,5 cm de la poche du milieu, vers le baulk)</w:t>
       </w:r>
     </w:p>
     <w:p>
@@ -328,7 +328,7 @@
         <w:spacing w:after="80"/>
       </w:pPr>
       <w:r>
-        <w:t xml:space="preserve">marker_4.png → Caméra 3 (rouges/rose/noire), rebord HAUT</w:t>
+        <w:t>marker_5.png → Caméra 2 (bleue, centre), bord HAUT, à droite de la poche du milieu (décalage d vers le baulk)</w:t>
       </w:r>
     </w:p>
     <w:p>
@@ -341,7 +341,59 @@
         <w:spacing w:after="80"/>
       </w:pPr>
       <w:r>
-        <w:t xml:space="preserve">marker_5.png → Caméra 3 (rouges/rose/noire), rebord BAS</w:t>
+        <w:t>marker_6.png → Caméra 2 (bleue, centre), bord BAS, à gauche de la poche du milieu (décalage d vers la noire)</w:t>
+      </w:r>
+    </w:p>
+    <w:p>
+      <w:pPr>
+        <w:pStyle w:val="ListParagraph"/>
+        <w:numPr>
+          <w:ilvl w:val="0"/>
+          <w:numId w:val="3"/>
+        </w:numPr>
+        <w:spacing w:after="80"/>
+      </w:pPr>
+      <w:r>
+        <w:t>marker_7.png → Caméra 3 (rouges/rose/noire), bord HAUT, côté caméra 2 (48,5 cm de la poche du milieu, vers la noire)</w:t>
+      </w:r>
+    </w:p>
+    <w:p>
+      <w:pPr>
+        <w:pStyle w:val="ListParagraph"/>
+        <w:numPr>
+          <w:ilvl w:val="0"/>
+          <w:numId w:val="3"/>
+        </w:numPr>
+        <w:spacing w:after="80"/>
+      </w:pPr>
+      <w:r>
+        <w:t>marker_8.png → Caméra 3 (rouges/rose/noire), bord HAUT, coin côté noire (178,5 cm de la poche du milieu, vers la noire)</w:t>
+      </w:r>
+    </w:p>
+    <w:p>
+      <w:pPr>
+        <w:pStyle w:val="ListParagraph"/>
+        <w:numPr>
+          <w:ilvl w:val="0"/>
+          <w:numId w:val="3"/>
+        </w:numPr>
+        <w:spacing w:after="80"/>
+      </w:pPr>
+      <w:r>
+        <w:t>marker_9.png → Caméra 3 (rouges/rose/noire), bord BAS, côté caméra 2 (48,5 cm de la poche du milieu, vers la noire)</w:t>
+      </w:r>
+    </w:p>
+    <w:p>
+      <w:pPr>
+        <w:pStyle w:val="ListParagraph"/>
+        <w:numPr>
+          <w:ilvl w:val="0"/>
+          <w:numId w:val="3"/>
+        </w:numPr>
+        <w:spacing w:after="80"/>
+      </w:pPr>
+      <w:r>
+        <w:t>marker_10.png → Caméra 3 (rouges/rose/noire), bord BAS, coin côté noire (178,5 cm de la poche du milieu, vers la noire)</w:t>
       </w:r>
     </w:p>
     <w:p>
@@ -353,7 +405,7 @@
           <w:i/>
           <w:iCs/>
         </w:rPr>
-        <w:t xml:space="preserve">Important : les marqueurs centraux (2 et 3) sont légèrement décalés de la poche du milieu (quelques cm sur le côté), pour ne pas la chevaucher — voir le schéma.</w:t>
+        <w:t>Important : les marqueurs 5 et 6 sont légèrement décalés de la poche du milieu (quelques cm, notés d) pour ne pas la chevaucher : le 5 (bord haut) à droite de la poche, le 6 (bord bas) à gauche — voir le schéma. Mesurer d à l'installation et le noter (section 11) : l'outil doit connaître les vraies positions des marqueurs 5 et 6.</w:t>
       </w:r>
     </w:p>
     <w:p>
@@ -382,7 +434,7 @@
           <w:sz w:val="20"/>
           <w:szCs w:val="20"/>
         </w:rPr>
-        <w:t xml:space="preserve">ArucoCalibrationTool.exe 0 photo_camera_0.jpg</w:t>
+        <w:t>ArucoCalibrationTool.exe 0 photo_camera_0.jpg</w:t>
       </w:r>
     </w:p>
     <w:p>
@@ -390,7 +442,7 @@
         <w:spacing w:after="120"/>
       </w:pPr>
       <w:r>
-        <w:t xml:space="preserve">(remplacez 0 par 1 ou 2 selon la caméra). Le programme détecte automatiquement les 2 marqueurs de cette caméra, calcule la calibration (rotation + échelle + position), et sauvegarde dans camera_0.yml (ou 1/2).</w:t>
+        <w:t>(remplacez 0 par 1 ou 2 selon la caméra). Avant de calibrer, testez le positionnement : ArucoCalibrationTool.exe --check &lt;index caméra&gt; &lt;photo ou flux&gt;. Le programme détecte ensuite automatiquement les marqueurs de cette caméra (4 pour les caméras 1 et 3, 2 pour la caméra 2), calcule la calibration (rotation + échelle + position), et sauvegarde dans camera_0.yml (ou 1/2).</w:t>
       </w:r>
     </w:p>
     <w:p>
@@ -412,7 +464,7 @@
         <w:spacing w:after="60"/>
       </w:pPr>
       <w:r>
-        <w:t xml:space="preserve">Le programme doit afficher les 2 marqueurs détectés avec leurs coordonnées.</w:t>
+        <w:t>Le programme doit afficher les marqueurs détectés (4, 2 ou 4 selon la caméra) avec leurs coordonnées.</w:t>
       </w:r>
     </w:p>
     <w:p>
@@ -469,7 +521,7 @@
         <w:spacing w:after="150" w:before="300"/>
       </w:pPr>
       <w:r>
-        <w:t xml:space="preserve">10. Planche des 6 marqueurs à imprimer</w:t>
+        <w:t>10. Planche des 10 marqueurs à imprimer</w:t>
       </w:r>
     </w:p>
     <w:p>
@@ -481,59 +533,874 @@
           <w:b/>
           <w:bCs/>
         </w:rPr>
-        <w:t xml:space="preserve">Imprimez cette page à 100% / taille réelle (PAS "ajuster à la page"). Découpez chaque marqueur en suivant le trait pointillé.</w:t>
-      </w:r>
-    </w:p>
-    <w:p>
-      <w:pPr>
-        <w:spacing w:after="200"/>
+        <w:t>La planche est fournie dans le fichier planche_10_marqueurs_aruco_a_imprimer.pdf (2 pages A4, marqueurs de 60 mm). Imprimez-la à 100% / taille réelle (PAS "ajuster à la page") et découpez chaque marqueur en suivant le trait pointillé, en gardant le bord blanc. Pour un premier test avec une seule caméra (caméra 2), seuls les marqueurs 5 et 6 sont nécessaires.</w:t>
+      </w:r>
+    </w:p>
+    <w:p>
+      <w:pPr>
+        <w:spacing w:before="300"/>
+      </w:pPr>
+    </w:p>
+    <w:p>
+      <w:r>
+        <w:br w:type="page"/>
+      </w:r>
+    </w:p>
+    <w:p>
+      <w:pPr>
+        <w:pStyle w:val="Heading1"/>
+      </w:pPr>
+      <w:r>
+        <w:t>11. Positions des marqueurs</w:t>
+      </w:r>
+    </w:p>
+    <w:p>
+      <w:r>
+        <w:rPr>
+          <w:b/>
+        </w:rPr>
+        <w:t>Le tableau ci-dessous donne la position exacte de chaque marqueur, mesurée le long du bord à partir de la poche du milieu (le centre de la table, à 178,5 cm de chaque bout). Voir le schéma de la section 2.</w:t>
+      </w:r>
+      <w:r/>
+    </w:p>
+    <w:p>
+      <w:pPr>
         <w:jc w:val="center"/>
       </w:pPr>
       <w:r>
-        <w:drawing>
-          <wp:inline distT="0" distB="0" distL="0" distR="0">
-            <wp:extent cx="4953000" cy="7000875"/>
-            <wp:effectExtent t="0" r="0" b="0" l="0"/>
-            <wp:docPr id="1" name="" descr="" title=""/>
-            <wp:cNvGraphicFramePr>
-              <a:graphicFrameLocks xmlns:a="http://schemas.openxmlformats.org/drawingml/2006/main" noChangeAspect="1"/>
-            </wp:cNvGraphicFramePr>
-            <a:graphic xmlns:a="http://schemas.openxmlformats.org/drawingml/2006/main">
-              <a:graphicData uri="http://schemas.openxmlformats.org/drawingml/2006/picture">
-                <pic:pic xmlns:pic="http://schemas.openxmlformats.org/drawingml/2006/picture">
-                  <pic:nvPicPr>
-                    <pic:cNvPr id="0" name="" descr=""/>
-                    <pic:cNvPicPr>
-                      <a:picLocks noChangeAspect="1" noChangeArrowheads="1"/>
-                    </pic:cNvPicPr>
-                  </pic:nvPicPr>
-                  <pic:blipFill>
-                    <a:blip r:embed="rId8" cstate="none"/>
-                    <a:srcRect/>
-                    <a:stretch>
-                      <a:fillRect/>
-                    </a:stretch>
-                  </pic:blipFill>
-                  <pic:spPr bwMode="auto">
-                    <a:xfrm>
-                      <a:off x="0" y="0"/>
-                      <a:ext cx="4953000" cy="7000875"/>
-                    </a:xfrm>
-                    <a:prstGeom prst="rect">
-                      <a:avLst/>
-                    </a:prstGeom>
-                  </pic:spPr>
-                </pic:pic>
-              </a:graphicData>
-            </a:graphic>
-          </wp:inline>
-        </w:drawing>
-      </w:r>
-    </w:p>
-    <w:p>
-      <w:pPr>
-        <w:spacing w:before="300"/>
-      </w:pPr>
+        <w:rPr>
+          <w:i/>
+          <w:sz w:val="18"/>
+        </w:rPr>
+        <w:t>Vue de dessus de la table (357 × 178 cm) : côté baulk à droite, côté noire à gauche.</w:t>
+      </w:r>
+    </w:p>
+    <w:tbl>
+      <w:tblPr>
+        <w:tblW w:type="auto" w:w="0"/>
+        <w:tblLook w:firstColumn="1" w:firstRow="1" w:lastColumn="0" w:lastRow="0" w:noHBand="0" w:noVBand="1" w:val="04A0"/>
+        <w:tblBorders>
+          <w:top w:val="single" w:sz="4" w:space="0" w:color="888888"/>
+          <w:left w:val="single" w:sz="4" w:space="0" w:color="888888"/>
+          <w:bottom w:val="single" w:sz="4" w:space="0" w:color="888888"/>
+          <w:right w:val="single" w:sz="4" w:space="0" w:color="888888"/>
+          <w:insideH w:val="single" w:sz="4" w:space="0" w:color="888888"/>
+          <w:insideV w:val="single" w:sz="4" w:space="0" w:color="888888"/>
+        </w:tblBorders>
+      </w:tblPr>
+      <w:tblGrid>
+        <w:gridCol w:w="1941"/>
+        <w:gridCol w:w="1941"/>
+        <w:gridCol w:w="1941"/>
+        <w:gridCol w:w="1941"/>
+        <w:gridCol w:w="1941"/>
+      </w:tblGrid>
+      <w:tr>
+        <w:tc>
+          <w:tcPr>
+            <w:tcW w:type="dxa" w:w="1941"/>
+          </w:tcPr>
+          <w:p>
+            <w:r>
+              <w:rPr>
+                <w:b/>
+                <w:sz w:val="18"/>
+              </w:rPr>
+              <w:t>N°</w:t>
+            </w:r>
+          </w:p>
+        </w:tc>
+        <w:tc>
+          <w:tcPr>
+            <w:tcW w:type="dxa" w:w="1941"/>
+          </w:tcPr>
+          <w:p>
+            <w:r>
+              <w:rPr>
+                <w:b/>
+                <w:sz w:val="18"/>
+              </w:rPr>
+              <w:t>Caméra</w:t>
+            </w:r>
+          </w:p>
+        </w:tc>
+        <w:tc>
+          <w:tcPr>
+            <w:tcW w:type="dxa" w:w="1941"/>
+          </w:tcPr>
+          <w:p>
+            <w:r>
+              <w:rPr>
+                <w:b/>
+                <w:sz w:val="18"/>
+              </w:rPr>
+              <w:t>Bord</w:t>
+            </w:r>
+          </w:p>
+        </w:tc>
+        <w:tc>
+          <w:tcPr>
+            <w:tcW w:type="dxa" w:w="1941"/>
+          </w:tcPr>
+          <w:p>
+            <w:r>
+              <w:rPr>
+                <w:b/>
+                <w:sz w:val="18"/>
+              </w:rPr>
+              <w:t>Distance de la poche du milieu</w:t>
+            </w:r>
+          </w:p>
+        </w:tc>
+        <w:tc>
+          <w:tcPr>
+            <w:tcW w:type="dxa" w:w="1941"/>
+          </w:tcPr>
+          <w:p>
+            <w:r>
+              <w:rPr>
+                <w:b/>
+                <w:sz w:val="18"/>
+              </w:rPr>
+              <w:t>Remarque</w:t>
+            </w:r>
+          </w:p>
+        </w:tc>
+      </w:tr>
+      <w:tr>
+        <w:tc>
+          <w:tcPr>
+            <w:tcW w:type="dxa" w:w="1941"/>
+          </w:tcPr>
+          <w:p>
+            <w:r>
+              <w:rPr>
+                <w:b w:val="0"/>
+                <w:sz w:val="18"/>
+              </w:rPr>
+              <w:t>1</w:t>
+            </w:r>
+          </w:p>
+        </w:tc>
+        <w:tc>
+          <w:tcPr>
+            <w:tcW w:type="dxa" w:w="1941"/>
+          </w:tcPr>
+          <w:p>
+            <w:r>
+              <w:rPr>
+                <w:b w:val="0"/>
+                <w:sz w:val="18"/>
+              </w:rPr>
+              <w:t>1 (jaune/verte/marron)</w:t>
+            </w:r>
+          </w:p>
+        </w:tc>
+        <w:tc>
+          <w:tcPr>
+            <w:tcW w:type="dxa" w:w="1941"/>
+          </w:tcPr>
+          <w:p>
+            <w:r>
+              <w:rPr>
+                <w:b w:val="0"/>
+                <w:sz w:val="18"/>
+              </w:rPr>
+              <w:t>HAUT</w:t>
+            </w:r>
+          </w:p>
+        </w:tc>
+        <w:tc>
+          <w:tcPr>
+            <w:tcW w:type="dxa" w:w="1941"/>
+          </w:tcPr>
+          <w:p>
+            <w:r>
+              <w:rPr>
+                <w:b w:val="0"/>
+                <w:sz w:val="18"/>
+              </w:rPr>
+              <w:t>178,5 cm vers le baulk</w:t>
+            </w:r>
+          </w:p>
+        </w:tc>
+        <w:tc>
+          <w:tcPr>
+            <w:tcW w:type="dxa" w:w="1941"/>
+          </w:tcPr>
+          <w:p>
+            <w:r>
+              <w:rPr>
+                <w:b w:val="0"/>
+                <w:sz w:val="18"/>
+              </w:rPr>
+              <w:t>coin, côté baulk</w:t>
+            </w:r>
+          </w:p>
+        </w:tc>
+      </w:tr>
+      <w:tr>
+        <w:tc>
+          <w:tcPr>
+            <w:tcW w:type="dxa" w:w="1941"/>
+          </w:tcPr>
+          <w:p>
+            <w:r>
+              <w:rPr>
+                <w:b w:val="0"/>
+                <w:sz w:val="18"/>
+              </w:rPr>
+              <w:t>2</w:t>
+            </w:r>
+          </w:p>
+        </w:tc>
+        <w:tc>
+          <w:tcPr>
+            <w:tcW w:type="dxa" w:w="1941"/>
+          </w:tcPr>
+          <w:p>
+            <w:r>
+              <w:rPr>
+                <w:b w:val="0"/>
+                <w:sz w:val="18"/>
+              </w:rPr>
+              <w:t>1</w:t>
+            </w:r>
+          </w:p>
+        </w:tc>
+        <w:tc>
+          <w:tcPr>
+            <w:tcW w:type="dxa" w:w="1941"/>
+          </w:tcPr>
+          <w:p>
+            <w:r>
+              <w:rPr>
+                <w:b w:val="0"/>
+                <w:sz w:val="18"/>
+              </w:rPr>
+              <w:t>HAUT</w:t>
+            </w:r>
+          </w:p>
+        </w:tc>
+        <w:tc>
+          <w:tcPr>
+            <w:tcW w:type="dxa" w:w="1941"/>
+          </w:tcPr>
+          <w:p>
+            <w:r>
+              <w:rPr>
+                <w:b w:val="0"/>
+                <w:sz w:val="18"/>
+              </w:rPr>
+              <w:t>48,5 cm vers le baulk</w:t>
+            </w:r>
+          </w:p>
+        </w:tc>
+        <w:tc>
+          <w:tcPr>
+            <w:tcW w:type="dxa" w:w="1941"/>
+          </w:tcPr>
+          <w:p>
+            <w:r>
+              <w:rPr>
+                <w:b w:val="0"/>
+                <w:sz w:val="18"/>
+              </w:rPr>
+              <w:t>côté caméra 2</w:t>
+            </w:r>
+          </w:p>
+        </w:tc>
+      </w:tr>
+      <w:tr>
+        <w:tc>
+          <w:tcPr>
+            <w:tcW w:type="dxa" w:w="1941"/>
+          </w:tcPr>
+          <w:p>
+            <w:r>
+              <w:rPr>
+                <w:b w:val="0"/>
+                <w:sz w:val="18"/>
+              </w:rPr>
+              <w:t>3</w:t>
+            </w:r>
+          </w:p>
+        </w:tc>
+        <w:tc>
+          <w:tcPr>
+            <w:tcW w:type="dxa" w:w="1941"/>
+          </w:tcPr>
+          <w:p>
+            <w:r>
+              <w:rPr>
+                <w:b w:val="0"/>
+                <w:sz w:val="18"/>
+              </w:rPr>
+              <w:t>1</w:t>
+            </w:r>
+          </w:p>
+        </w:tc>
+        <w:tc>
+          <w:tcPr>
+            <w:tcW w:type="dxa" w:w="1941"/>
+          </w:tcPr>
+          <w:p>
+            <w:r>
+              <w:rPr>
+                <w:b w:val="0"/>
+                <w:sz w:val="18"/>
+              </w:rPr>
+              <w:t>BAS</w:t>
+            </w:r>
+          </w:p>
+        </w:tc>
+        <w:tc>
+          <w:tcPr>
+            <w:tcW w:type="dxa" w:w="1941"/>
+          </w:tcPr>
+          <w:p>
+            <w:r>
+              <w:rPr>
+                <w:b w:val="0"/>
+                <w:sz w:val="18"/>
+              </w:rPr>
+              <w:t>178,5 cm vers le baulk</w:t>
+            </w:r>
+          </w:p>
+        </w:tc>
+        <w:tc>
+          <w:tcPr>
+            <w:tcW w:type="dxa" w:w="1941"/>
+          </w:tcPr>
+          <w:p>
+            <w:r>
+              <w:rPr>
+                <w:b w:val="0"/>
+                <w:sz w:val="18"/>
+              </w:rPr>
+              <w:t>coin, côté baulk</w:t>
+            </w:r>
+          </w:p>
+        </w:tc>
+      </w:tr>
+      <w:tr>
+        <w:tc>
+          <w:tcPr>
+            <w:tcW w:type="dxa" w:w="1941"/>
+          </w:tcPr>
+          <w:p>
+            <w:r>
+              <w:rPr>
+                <w:b w:val="0"/>
+                <w:sz w:val="18"/>
+              </w:rPr>
+              <w:t>4</w:t>
+            </w:r>
+          </w:p>
+        </w:tc>
+        <w:tc>
+          <w:tcPr>
+            <w:tcW w:type="dxa" w:w="1941"/>
+          </w:tcPr>
+          <w:p>
+            <w:r>
+              <w:rPr>
+                <w:b w:val="0"/>
+                <w:sz w:val="18"/>
+              </w:rPr>
+              <w:t>1</w:t>
+            </w:r>
+          </w:p>
+        </w:tc>
+        <w:tc>
+          <w:tcPr>
+            <w:tcW w:type="dxa" w:w="1941"/>
+          </w:tcPr>
+          <w:p>
+            <w:r>
+              <w:rPr>
+                <w:b w:val="0"/>
+                <w:sz w:val="18"/>
+              </w:rPr>
+              <w:t>BAS</w:t>
+            </w:r>
+          </w:p>
+        </w:tc>
+        <w:tc>
+          <w:tcPr>
+            <w:tcW w:type="dxa" w:w="1941"/>
+          </w:tcPr>
+          <w:p>
+            <w:r>
+              <w:rPr>
+                <w:b w:val="0"/>
+                <w:sz w:val="18"/>
+              </w:rPr>
+              <w:t>48,5 cm vers le baulk</w:t>
+            </w:r>
+          </w:p>
+        </w:tc>
+        <w:tc>
+          <w:tcPr>
+            <w:tcW w:type="dxa" w:w="1941"/>
+          </w:tcPr>
+          <w:p>
+            <w:r>
+              <w:rPr>
+                <w:b w:val="0"/>
+                <w:sz w:val="18"/>
+              </w:rPr>
+              <w:t>côté caméra 2</w:t>
+            </w:r>
+          </w:p>
+        </w:tc>
+      </w:tr>
+      <w:tr>
+        <w:tc>
+          <w:tcPr>
+            <w:tcW w:type="dxa" w:w="1941"/>
+          </w:tcPr>
+          <w:p>
+            <w:r>
+              <w:rPr>
+                <w:b w:val="0"/>
+                <w:sz w:val="18"/>
+              </w:rPr>
+              <w:t>5</w:t>
+            </w:r>
+          </w:p>
+        </w:tc>
+        <w:tc>
+          <w:tcPr>
+            <w:tcW w:type="dxa" w:w="1941"/>
+          </w:tcPr>
+          <w:p>
+            <w:r>
+              <w:rPr>
+                <w:b w:val="0"/>
+                <w:sz w:val="18"/>
+              </w:rPr>
+              <w:t>2 (bleue, centre)</w:t>
+            </w:r>
+          </w:p>
+        </w:tc>
+        <w:tc>
+          <w:tcPr>
+            <w:tcW w:type="dxa" w:w="1941"/>
+          </w:tcPr>
+          <w:p>
+            <w:r>
+              <w:rPr>
+                <w:b w:val="0"/>
+                <w:sz w:val="18"/>
+              </w:rPr>
+              <w:t>HAUT</w:t>
+            </w:r>
+          </w:p>
+        </w:tc>
+        <w:tc>
+          <w:tcPr>
+            <w:tcW w:type="dxa" w:w="1941"/>
+          </w:tcPr>
+          <w:p>
+            <w:r>
+              <w:rPr>
+                <w:b w:val="0"/>
+                <w:sz w:val="18"/>
+              </w:rPr>
+              <w:t>d vers le baulk</w:t>
+            </w:r>
+          </w:p>
+        </w:tc>
+        <w:tc>
+          <w:tcPr>
+            <w:tcW w:type="dxa" w:w="1941"/>
+          </w:tcPr>
+          <w:p>
+            <w:r>
+              <w:rPr>
+                <w:b w:val="0"/>
+                <w:sz w:val="18"/>
+              </w:rPr>
+              <w:t>à DROITE de la poche du milieu</w:t>
+            </w:r>
+          </w:p>
+        </w:tc>
+      </w:tr>
+      <w:tr>
+        <w:tc>
+          <w:tcPr>
+            <w:tcW w:type="dxa" w:w="1941"/>
+          </w:tcPr>
+          <w:p>
+            <w:r>
+              <w:rPr>
+                <w:b w:val="0"/>
+                <w:sz w:val="18"/>
+              </w:rPr>
+              <w:t>6</w:t>
+            </w:r>
+          </w:p>
+        </w:tc>
+        <w:tc>
+          <w:tcPr>
+            <w:tcW w:type="dxa" w:w="1941"/>
+          </w:tcPr>
+          <w:p>
+            <w:r>
+              <w:rPr>
+                <w:b w:val="0"/>
+                <w:sz w:val="18"/>
+              </w:rPr>
+              <w:t>2</w:t>
+            </w:r>
+          </w:p>
+        </w:tc>
+        <w:tc>
+          <w:tcPr>
+            <w:tcW w:type="dxa" w:w="1941"/>
+          </w:tcPr>
+          <w:p>
+            <w:r>
+              <w:rPr>
+                <w:b w:val="0"/>
+                <w:sz w:val="18"/>
+              </w:rPr>
+              <w:t>BAS</w:t>
+            </w:r>
+          </w:p>
+        </w:tc>
+        <w:tc>
+          <w:tcPr>
+            <w:tcW w:type="dxa" w:w="1941"/>
+          </w:tcPr>
+          <w:p>
+            <w:r>
+              <w:rPr>
+                <w:b w:val="0"/>
+                <w:sz w:val="18"/>
+              </w:rPr>
+              <w:t>d vers la noire</w:t>
+            </w:r>
+          </w:p>
+        </w:tc>
+        <w:tc>
+          <w:tcPr>
+            <w:tcW w:type="dxa" w:w="1941"/>
+          </w:tcPr>
+          <w:p>
+            <w:r>
+              <w:rPr>
+                <w:b w:val="0"/>
+                <w:sz w:val="18"/>
+              </w:rPr>
+              <w:t>à GAUCHE de la poche du milieu</w:t>
+            </w:r>
+          </w:p>
+        </w:tc>
+      </w:tr>
+      <w:tr>
+        <w:tc>
+          <w:tcPr>
+            <w:tcW w:type="dxa" w:w="1941"/>
+          </w:tcPr>
+          <w:p>
+            <w:r>
+              <w:rPr>
+                <w:b w:val="0"/>
+                <w:sz w:val="18"/>
+              </w:rPr>
+              <w:t>7</w:t>
+            </w:r>
+          </w:p>
+        </w:tc>
+        <w:tc>
+          <w:tcPr>
+            <w:tcW w:type="dxa" w:w="1941"/>
+          </w:tcPr>
+          <w:p>
+            <w:r>
+              <w:rPr>
+                <w:b w:val="0"/>
+                <w:sz w:val="18"/>
+              </w:rPr>
+              <w:t>3 (rouges/rose/noire)</w:t>
+            </w:r>
+          </w:p>
+        </w:tc>
+        <w:tc>
+          <w:tcPr>
+            <w:tcW w:type="dxa" w:w="1941"/>
+          </w:tcPr>
+          <w:p>
+            <w:r>
+              <w:rPr>
+                <w:b w:val="0"/>
+                <w:sz w:val="18"/>
+              </w:rPr>
+              <w:t>HAUT</w:t>
+            </w:r>
+          </w:p>
+        </w:tc>
+        <w:tc>
+          <w:tcPr>
+            <w:tcW w:type="dxa" w:w="1941"/>
+          </w:tcPr>
+          <w:p>
+            <w:r>
+              <w:rPr>
+                <w:b w:val="0"/>
+                <w:sz w:val="18"/>
+              </w:rPr>
+              <w:t>48,5 cm vers la noire</w:t>
+            </w:r>
+          </w:p>
+        </w:tc>
+        <w:tc>
+          <w:tcPr>
+            <w:tcW w:type="dxa" w:w="1941"/>
+          </w:tcPr>
+          <w:p>
+            <w:r>
+              <w:rPr>
+                <w:b w:val="0"/>
+                <w:sz w:val="18"/>
+              </w:rPr>
+              <w:t>côté caméra 2</w:t>
+            </w:r>
+          </w:p>
+        </w:tc>
+      </w:tr>
+      <w:tr>
+        <w:tc>
+          <w:tcPr>
+            <w:tcW w:type="dxa" w:w="1941"/>
+          </w:tcPr>
+          <w:p>
+            <w:r>
+              <w:rPr>
+                <w:b w:val="0"/>
+                <w:sz w:val="18"/>
+              </w:rPr>
+              <w:t>8</w:t>
+            </w:r>
+          </w:p>
+        </w:tc>
+        <w:tc>
+          <w:tcPr>
+            <w:tcW w:type="dxa" w:w="1941"/>
+          </w:tcPr>
+          <w:p>
+            <w:r>
+              <w:rPr>
+                <w:b w:val="0"/>
+                <w:sz w:val="18"/>
+              </w:rPr>
+              <w:t>3</w:t>
+            </w:r>
+          </w:p>
+        </w:tc>
+        <w:tc>
+          <w:tcPr>
+            <w:tcW w:type="dxa" w:w="1941"/>
+          </w:tcPr>
+          <w:p>
+            <w:r>
+              <w:rPr>
+                <w:b w:val="0"/>
+                <w:sz w:val="18"/>
+              </w:rPr>
+              <w:t>HAUT</w:t>
+            </w:r>
+          </w:p>
+        </w:tc>
+        <w:tc>
+          <w:tcPr>
+            <w:tcW w:type="dxa" w:w="1941"/>
+          </w:tcPr>
+          <w:p>
+            <w:r>
+              <w:rPr>
+                <w:b w:val="0"/>
+                <w:sz w:val="18"/>
+              </w:rPr>
+              <w:t>178,5 cm vers la noire</w:t>
+            </w:r>
+          </w:p>
+        </w:tc>
+        <w:tc>
+          <w:tcPr>
+            <w:tcW w:type="dxa" w:w="1941"/>
+          </w:tcPr>
+          <w:p>
+            <w:r>
+              <w:rPr>
+                <w:b w:val="0"/>
+                <w:sz w:val="18"/>
+              </w:rPr>
+              <w:t>coin, côté noire</w:t>
+            </w:r>
+          </w:p>
+        </w:tc>
+      </w:tr>
+      <w:tr>
+        <w:tc>
+          <w:tcPr>
+            <w:tcW w:type="dxa" w:w="1941"/>
+          </w:tcPr>
+          <w:p>
+            <w:r>
+              <w:rPr>
+                <w:b w:val="0"/>
+                <w:sz w:val="18"/>
+              </w:rPr>
+              <w:t>9</w:t>
+            </w:r>
+          </w:p>
+        </w:tc>
+        <w:tc>
+          <w:tcPr>
+            <w:tcW w:type="dxa" w:w="1941"/>
+          </w:tcPr>
+          <w:p>
+            <w:r>
+              <w:rPr>
+                <w:b w:val="0"/>
+                <w:sz w:val="18"/>
+              </w:rPr>
+              <w:t>3</w:t>
+            </w:r>
+          </w:p>
+        </w:tc>
+        <w:tc>
+          <w:tcPr>
+            <w:tcW w:type="dxa" w:w="1941"/>
+          </w:tcPr>
+          <w:p>
+            <w:r>
+              <w:rPr>
+                <w:b w:val="0"/>
+                <w:sz w:val="18"/>
+              </w:rPr>
+              <w:t>BAS</w:t>
+            </w:r>
+          </w:p>
+        </w:tc>
+        <w:tc>
+          <w:tcPr>
+            <w:tcW w:type="dxa" w:w="1941"/>
+          </w:tcPr>
+          <w:p>
+            <w:r>
+              <w:rPr>
+                <w:b w:val="0"/>
+                <w:sz w:val="18"/>
+              </w:rPr>
+              <w:t>48,5 cm vers la noire</w:t>
+            </w:r>
+          </w:p>
+        </w:tc>
+        <w:tc>
+          <w:tcPr>
+            <w:tcW w:type="dxa" w:w="1941"/>
+          </w:tcPr>
+          <w:p>
+            <w:r>
+              <w:rPr>
+                <w:b w:val="0"/>
+                <w:sz w:val="18"/>
+              </w:rPr>
+              <w:t>côté caméra 2</w:t>
+            </w:r>
+          </w:p>
+        </w:tc>
+      </w:tr>
+      <w:tr>
+        <w:tc>
+          <w:tcPr>
+            <w:tcW w:type="dxa" w:w="1941"/>
+          </w:tcPr>
+          <w:p>
+            <w:r>
+              <w:rPr>
+                <w:b w:val="0"/>
+                <w:sz w:val="18"/>
+              </w:rPr>
+              <w:t>10</w:t>
+            </w:r>
+          </w:p>
+        </w:tc>
+        <w:tc>
+          <w:tcPr>
+            <w:tcW w:type="dxa" w:w="1941"/>
+          </w:tcPr>
+          <w:p>
+            <w:r>
+              <w:rPr>
+                <w:b w:val="0"/>
+                <w:sz w:val="18"/>
+              </w:rPr>
+              <w:t>3</w:t>
+            </w:r>
+          </w:p>
+        </w:tc>
+        <w:tc>
+          <w:tcPr>
+            <w:tcW w:type="dxa" w:w="1941"/>
+          </w:tcPr>
+          <w:p>
+            <w:r>
+              <w:rPr>
+                <w:b w:val="0"/>
+                <w:sz w:val="18"/>
+              </w:rPr>
+              <w:t>BAS</w:t>
+            </w:r>
+          </w:p>
+        </w:tc>
+        <w:tc>
+          <w:tcPr>
+            <w:tcW w:type="dxa" w:w="1941"/>
+          </w:tcPr>
+          <w:p>
+            <w:r>
+              <w:rPr>
+                <w:b w:val="0"/>
+                <w:sz w:val="18"/>
+              </w:rPr>
+              <w:t>178,5 cm vers la noire</w:t>
+            </w:r>
+          </w:p>
+        </w:tc>
+        <w:tc>
+          <w:tcPr>
+            <w:tcW w:type="dxa" w:w="1941"/>
+          </w:tcPr>
+          <w:p>
+            <w:r>
+              <w:rPr>
+                <w:b w:val="0"/>
+                <w:sz w:val="18"/>
+              </w:rPr>
+              <w:t>coin, côté noire</w:t>
+            </w:r>
+          </w:p>
+        </w:tc>
+      </w:tr>
+    </w:tbl>
+    <w:p>
+      <w:r>
+        <w:rPr>
+          <w:b/>
+        </w:rPr>
+        <w:t>d = décalage de quelques centimètres par rapport à la poche du milieu, pour ne pas la chevaucher : le marqueur 5 (bord haut) à droite de la poche, le marqueur 6 (bord bas) à gauche. Mesurer d lors de l'installation.   d mesuré : ________ cm</w:t>
+      </w:r>
+      <w:r/>
+    </w:p>
+    <w:p>
+      <w:r>
+        <w:t>L'orientation (rotation) d'un marqueur n'a aucune importance : seuls comptent le bon numéro et le bon endroit.</w:t>
+      </w:r>
     </w:p>
     <w:p>
       <w:pPr>

</xml_diff>

<commit_message>
Camera mire dialog, positioning guide, manual reordered (positioning before calibration)
- CameraMireDialog (Settings > Camera > "Mire..."): live preview with centre
  cross, thirds grid, table frame computed from height / FOV (100 deg default),
  image orientation (0/90/180/270), free frame rotation and camera tilt
  (trapezoid frame). ArUco overlay only outside Windows.
- docs/guide_positionnement_cameras_mire.pdf: points of the table (H/E/D/d/a
  values, to be updated after tests), positioning diagram, step-by-step, record
  sheet and "every installation is unique" recompute notes.
- Manual: positioning with the mire is now step 1 (section 5), calibration
  sections renumbered 6-12, installation-is-unique note, updated mire capture.
- fiche_test_premiere_camera: planche_10 markers 5/6, --decalage usage.

Co-Authored-By: Claude Sonnet 5.5 <noreply@anthropic.com>
</commit_message>
<xml_diff>
--- a/docs/manuel_calibration_cameras.docx
+++ b/docs/manuel_calibration_cameras.docx
@@ -47,6 +47,20 @@
       </w:pPr>
       <w:r>
         <w:t>Ce manuel explique comment calibrer les 3 caméras du système Snooker Player 3.0, avec la méthode à 10 marqueurs ArUco : 4 marqueurs pour la caméra 1, 2 pour la caméra 2 et 4 pour la caméra 3, positionnés sur la bordure de la table. Les caméras 1 et 3 sont inclinées d'environ 4° vers l'extérieur (4 marqueurs, calibration par homographie) ; la caméra 2 est verticale, au centre (2 marqueurs suffisent).</w:t>
+      </w:r>
+      <w:r>
+        <w:t xml:space="preserve"> Les valeurs données (1,20 m, 97 cm, 4°…) sont celles de l'installation de référence : chaque installation est unique et se recalcule (voir section 5) ; seul le nombre de caméras, 3, ne change pas.</w:t>
+      </w:r>
+    </w:p>
+    <w:p>
+      <w:pPr>
+        <w:spacing w:after="120"/>
+      </w:pPr>
+      <w:r>
+        <w:rPr>
+          <w:b/>
+        </w:rPr>
+        <w:t>Ordre des opérations : (1) positionner et orienter les 3 caméras avec la mire (section 5) ; (2) générer et coller les marqueurs (sections 6 et 7) ; (3) calibrer (section 8) ; (4) vérifier (section 9). On ne colle les marqueurs et on ne calibre qu'une fois les 3 caméras bien positionnées.</w:t>
       </w:r>
     </w:p>
     <w:p>
@@ -109,7 +123,7 @@
         <w:spacing w:after="120"/>
       </w:pPr>
       <w:r>
-        <w:t>Les 3 caméras sont alignées avec les billes marron, bleue, et le milieu rose/noire. Jaune et verte sont de part et d'autre de la ligne centrale, à la même position que marron (ligne de baulk). Les 10 marqueurs ArUco sont collés sur la bordure de la table (le rail marron), aux positions du schéma et du tableau de la section 11.</w:t>
+        <w:t>Les 3 caméras sont alignées avec le point marron (caméra 1), le point bleu (caméra 2) et un point situé à 105 cm du bleu vers la noire (caméra 3) : voir le guide de positionnement. Jaune et verte sont de part et d'autre de la ligne centrale, à la même position que marron (ligne de baulk). Les 10 marqueurs ArUco sont collés sur la bordure de la table (le rail marron), aux positions du schéma et du tableau de la section 12.</w:t>
       </w:r>
     </w:p>
     <w:p>
@@ -222,11 +236,630 @@
     </w:p>
     <w:p>
       <w:pPr>
+        <w:pStyle w:val="ListParagraph"/>
+        <w:numPr>
+          <w:ilvl w:val="0"/>
+          <w:numId w:val="2"/>
+        </w:numPr>
+        <w:spacing w:after="60"/>
+      </w:pPr>
+      <w:r>
+        <w:t>Un mètre ruban, du ruban adhésif de peintre et 3 billes repères (pour viser les points de la table : voir le guide de positionnement).</w:t>
+      </w:r>
+    </w:p>
+    <w:p>
+      <w:pPr>
+        <w:pStyle w:val="Heading1"/>
+      </w:pPr>
+      <w:r>
+        <w:rPr/>
+        <w:t>5. Étape 1 — Positionner et orienter les caméras avec la mire</w:t>
+      </w:r>
+    </w:p>
+    <w:p>
+      <w:pPr>
+        <w:spacing w:after="120"/>
+      </w:pPr>
+      <w:r>
+        <w:rPr>
+          <w:b/>
+        </w:rPr>
+        <w:t>Pour poser et orienter les 3 caméras pas à pas, avec les 3 points à viser sur la table (point bleu pour la caméra 2, et un point à 105 cm du bleu de chaque côté pour les caméras 1 et 3), utilisez le guide guide_positionnement_cameras_mire.pdf : à faire AVANT de coller les marqueurs et de calibrer.</w:t>
+      </w:r>
+    </w:p>
+    <w:p>
+      <w:pPr>
+        <w:spacing w:after="120"/>
+      </w:pPr>
+      <w:r>
+        <w:rPr/>
+        <w:t>Le logiciel contient une « mire » : un aperçu en direct de la caméra, avec des repères dessinés par-dessus. Elle permet de vérifier, SANS marqueur et SANS calibration, que la caméra est bien placée, bien orientée et bien inclinée au-dessus de la table. À faire pour chaque caméra, juste après sa fixation, et à refaire si une caméra a bougé.</w:t>
+      </w:r>
+    </w:p>
+    <w:p>
+      <w:pPr>
+        <w:spacing w:after="120"/>
+      </w:pPr>
+      <w:r>
+        <w:rPr>
+          <w:b/>
+        </w:rPr>
+        <w:t>Ouvrir la mire</w:t>
+      </w:r>
+    </w:p>
+    <w:p>
+      <w:pPr>
+        <w:pStyle w:val="ListParagraph"/>
+        <w:numPr>
+          <w:ilvl w:val="0"/>
+          <w:numId w:val="2"/>
+        </w:numPr>
+        <w:spacing w:after="60"/>
+      </w:pPr>
+      <w:r>
+        <w:rPr/>
+        <w:t>Dans le logiciel : Paramètres &gt; Caméra, puis le bouton « Mire... » à côté de la caméra concernée (le bouton n'est actif que si la caméra est détectée).</w:t>
+      </w:r>
+    </w:p>
+    <w:p>
+      <w:pPr>
+        <w:pStyle w:val="ListParagraph"/>
+        <w:numPr>
+          <w:ilvl w:val="0"/>
+          <w:numId w:val="2"/>
+        </w:numPr>
+        <w:spacing w:after="60"/>
+      </w:pPr>
+      <w:r>
+        <w:rPr/>
+        <w:t>La caméra doit être libre : si un suivi caméra est en cours ou si un autre programme l'utilise, fermez-le puis rouvrez la mire.</w:t>
+      </w:r>
+    </w:p>
+    <w:p>
+      <w:pPr>
+        <w:pStyle w:val="ListParagraph"/>
+        <w:numPr>
+          <w:ilvl w:val="0"/>
+          <w:numId w:val="2"/>
+        </w:numPr>
+        <w:spacing w:after="60"/>
+      </w:pPr>
+      <w:r>
+        <w:rPr/>
+        <w:t>Les réglages sont mémorisés pour la prochaine ouverture (hauteur, champ de vision, orientation, inclinaison).</w:t>
+      </w:r>
+    </w:p>
+    <w:p>
+      <w:pPr>
+        <w:spacing w:after="120"/>
+      </w:pPr>
+      <w:r>
+        <w:rPr>
+          <w:b/>
+        </w:rPr>
+        <w:t>Ce que l'on voit à l'écran</w:t>
+      </w:r>
+    </w:p>
+    <w:p>
+      <w:pPr>
+        <w:pStyle w:val="ListParagraph"/>
+        <w:numPr>
+          <w:ilvl w:val="0"/>
+          <w:numId w:val="2"/>
+        </w:numPr>
+        <w:spacing w:after="60"/>
+      </w:pPr>
+      <w:r>
+        <w:rPr/>
+        <w:t>Une croix et trois cercles au centre de l'image, plus une grille en tiers : ils servent à centrer la table.</w:t>
+      </w:r>
+    </w:p>
+    <w:p>
+      <w:pPr>
+        <w:pStyle w:val="ListParagraph"/>
+        <w:numPr>
+          <w:ilvl w:val="0"/>
+          <w:numId w:val="2"/>
+        </w:numPr>
+        <w:spacing w:after="60"/>
+      </w:pPr>
+      <w:r>
+        <w:rPr/>
+        <w:t>Un cadre VERT = l'endroit où doivent tomber les bords de la table pour cette caméra : 178 cm de large, et la longueur de la zone (130 cm pour les caméras 1 et 3, 97 cm pour la caméra 2). Le cadre devient ROUGE s'il ne rentre pas entièrement dans l'image : monter la caméra ou vérifier la hauteur saisie.</w:t>
+      </w:r>
+    </w:p>
+    <w:p>
+      <w:pPr>
+        <w:pStyle w:val="ListParagraph"/>
+        <w:numPr>
+          <w:ilvl w:val="0"/>
+          <w:numId w:val="2"/>
+        </w:numPr>
+        <w:spacing w:after="60"/>
+      </w:pPr>
+      <w:r>
+        <w:rPr/>
+        <w:t>Sur Mac uniquement : les marqueurs reconnus sont entourés avec leur numéro (ceux attendus pour cette caméra en vert). Sous Windows, cette partie n'est pas disponible.</w:t>
+      </w:r>
+    </w:p>
+    <w:p>
+      <w:pPr>
+        <w:spacing w:after="120"/>
+      </w:pPr>
+      <w:r>
+        <w:rPr/>
+      </w:r>
+      <w:r>
+        <w:drawing>
+          <wp:inline xmlns:a="http://schemas.openxmlformats.org/drawingml/2006/main" xmlns:pic="http://schemas.openxmlformats.org/drawingml/2006/picture">
+            <wp:extent cx="5580000" cy="4073400"/>
+            <wp:docPr id="2" name="Picture 2"/>
+            <wp:cNvGraphicFramePr>
+              <a:graphicFrameLocks noChangeAspect="1"/>
+            </wp:cNvGraphicFramePr>
+            <a:graphic>
+              <a:graphicData uri="http://schemas.openxmlformats.org/drawingml/2006/picture">
+                <pic:pic>
+                  <pic:nvPicPr>
+                    <pic:cNvPr id="0" name="mire_tilt_crop.png"/>
+                    <pic:cNvPicPr/>
+                  </pic:nvPicPr>
+                  <pic:blipFill>
+                    <a:blip r:embed="rId11"/>
+                    <a:stretch>
+                      <a:fillRect/>
+                    </a:stretch>
+                  </pic:blipFill>
+                  <pic:spPr>
+                    <a:xfrm>
+                      <a:off x="0" y="0"/>
+                      <a:ext cx="5580000" cy="4073400"/>
+                    </a:xfrm>
+                    <a:prstGeom prst="rect"/>
+                  </pic:spPr>
+                </pic:pic>
+              </a:graphicData>
+            </a:graphic>
+          </wp:inline>
+        </w:drawing>
+      </w:r>
+    </w:p>
+    <w:p>
+      <w:pPr>
+        <w:spacing w:after="120"/>
+      </w:pPr>
+      <w:r>
+        <w:rPr/>
+        <w:t>Exemple : mire de la caméra d'index 0 (caméra 1), inclinée de 4°. Le cadre vert est un trapèze car la caméra est penchée. (L'image est noire ici car l'objectif était couvert pendant la prise de vue.)</w:t>
+      </w:r>
+    </w:p>
+    <w:p>
+      <w:pPr>
+        <w:spacing w:after="120"/>
+      </w:pPr>
+      <w:r>
+        <w:rPr>
+          <w:b/>
+        </w:rPr>
+        <w:t>Les réglages</w:t>
+      </w:r>
+    </w:p>
+    <w:p>
+      <w:pPr>
+        <w:pStyle w:val="ListParagraph"/>
+        <w:numPr>
+          <w:ilvl w:val="0"/>
+          <w:numId w:val="2"/>
+        </w:numPr>
+        <w:spacing w:after="60"/>
+      </w:pPr>
+      <w:r>
+        <w:rPr/>
+        <w:t>Hauteur de la caméra (cm) : la hauteur réelle, mesurée au mètre (120 cm par défaut, bord bas des abat-jour). Le cadre vert est calculé avec cette valeur.</w:t>
+      </w:r>
+    </w:p>
+    <w:p>
+      <w:pPr>
+        <w:pStyle w:val="ListParagraph"/>
+        <w:numPr>
+          <w:ilvl w:val="0"/>
+          <w:numId w:val="2"/>
+        </w:numPr>
+        <w:spacing w:after="60"/>
+      </w:pPr>
+      <w:r>
+        <w:rPr/>
+        <w:t>Champ de vision (degrés, diagonale) : 100° par défaut, comme les caméras ELP prévues.</w:t>
+      </w:r>
+    </w:p>
+    <w:p>
+      <w:pPr>
+        <w:pStyle w:val="ListParagraph"/>
+        <w:numPr>
+          <w:ilvl w:val="0"/>
+          <w:numId w:val="2"/>
+        </w:numPr>
+        <w:spacing w:after="60"/>
+      </w:pPr>
+      <w:r>
+        <w:rPr/>
+        <w:t>Orientation de l'image : normale, tournée de 90° (horaire ou anti-horaire), ou à l'envers (180°). Sert à remettre l'image à l'endroit si la caméra est montée de travers ou à l'envers.</w:t>
+      </w:r>
+    </w:p>
+    <w:p>
+      <w:pPr>
+        <w:pStyle w:val="ListParagraph"/>
+        <w:numPr>
+          <w:ilvl w:val="0"/>
+          <w:numId w:val="2"/>
+        </w:numPr>
+        <w:spacing w:after="60"/>
+      </w:pPr>
+      <w:r>
+        <w:rPr/>
+        <w:t>Rotation du cadre (degrés) : tourne le cadre vert d'un petit angle (−45° à +45°, pas de 0,5°).</w:t>
+      </w:r>
+    </w:p>
+    <w:p>
+      <w:pPr>
+        <w:pStyle w:val="ListParagraph"/>
+        <w:numPr>
+          <w:ilvl w:val="0"/>
+          <w:numId w:val="2"/>
+        </w:numPr>
+        <w:spacing w:after="60"/>
+      </w:pPr>
+      <w:r>
+        <w:rPr/>
+        <w:t>Inclinaison de la caméra (degrés) : penche le cadre vert comme le verrait une caméra inclinée (−20° à +20°, pas de 0,5° ; le signe + penche vers le haut de l'image).</w:t>
+      </w:r>
+    </w:p>
+    <w:p>
+      <w:pPr>
+        <w:spacing w:after="120"/>
+      </w:pPr>
+      <w:r>
+        <w:rPr>
+          <w:b/>
+        </w:rPr>
+        <w:t>Contrôle A — la POSITION</w:t>
+      </w:r>
+    </w:p>
+    <w:p>
+      <w:pPr>
+        <w:pStyle w:val="ListParagraph"/>
+        <w:numPr>
+          <w:ilvl w:val="0"/>
+          <w:numId w:val="2"/>
+        </w:numPr>
+        <w:spacing w:after="60"/>
+      </w:pPr>
+      <w:r>
+        <w:rPr/>
+        <w:t>La table doit être centrée sur la croix.</w:t>
+      </w:r>
+    </w:p>
+    <w:p>
+      <w:pPr>
+        <w:pStyle w:val="ListParagraph"/>
+        <w:numPr>
+          <w:ilvl w:val="0"/>
+          <w:numId w:val="2"/>
+        </w:numPr>
+        <w:spacing w:after="60"/>
+      </w:pPr>
+      <w:r>
+        <w:rPr/>
+        <w:t>Les bords de la table (rails marron, côté zone) doivent coïncider avec les bords du cadre vert. Trop petite dans le cadre : descendre la caméra ; trop grande (cadre rouge) : la monter.</w:t>
+      </w:r>
+    </w:p>
+    <w:p>
+      <w:pPr>
+        <w:pStyle w:val="ListParagraph"/>
+        <w:numPr>
+          <w:ilvl w:val="0"/>
+          <w:numId w:val="2"/>
+        </w:numPr>
+        <w:spacing w:after="60"/>
+      </w:pPr>
+      <w:r>
+        <w:rPr/>
+        <w:t>Sur Mac, les marqueurs déjà collés doivent apparaître entourés avec le bon numéro.</w:t>
+      </w:r>
+    </w:p>
+    <w:p>
+      <w:pPr>
+        <w:spacing w:after="120"/>
+      </w:pPr>
+      <w:r>
+        <w:rPr>
+          <w:b/>
+        </w:rPr>
+        <w:t>Contrôle B — l'ORIENTATION (la caméra est-elle de travers ?)</w:t>
+      </w:r>
+    </w:p>
+    <w:p>
+      <w:pPr>
+        <w:pStyle w:val="ListParagraph"/>
+        <w:numPr>
+          <w:ilvl w:val="0"/>
+          <w:numId w:val="2"/>
+        </w:numPr>
+        <w:spacing w:after="60"/>
+      </w:pPr>
+      <w:r>
+        <w:rPr/>
+        <w:t>Les deux grands rails de la table doivent être parallèles aux bords gauche et droit du cadre vert.</w:t>
+      </w:r>
+    </w:p>
+    <w:p>
+      <w:pPr>
+        <w:pStyle w:val="ListParagraph"/>
+        <w:numPr>
+          <w:ilvl w:val="0"/>
+          <w:numId w:val="2"/>
+        </w:numPr>
+        <w:spacing w:after="60"/>
+      </w:pPr>
+      <w:r>
+        <w:rPr/>
+        <w:t>Si ce n'est pas le cas : augmenter ou diminuer « Rotation du cadre » jusqu'à ce que le cadre vert soit parallèle aux rails. L'angle affiché est de combien la caméra est tournée : tournez la caméra de cet angle, puis remettez la rotation du cadre à 0.</w:t>
+      </w:r>
+    </w:p>
+    <w:p>
+      <w:pPr>
+        <w:pStyle w:val="ListParagraph"/>
+        <w:numPr>
+          <w:ilvl w:val="0"/>
+          <w:numId w:val="2"/>
+        </w:numPr>
+        <w:spacing w:after="60"/>
+      </w:pPr>
+      <w:r>
+        <w:rPr/>
+        <w:t>Image à l'envers ou couchée : choisir la bonne « Orientation de l'image » (ou tourner physiquement la caméra).</w:t>
+      </w:r>
+    </w:p>
+    <w:p>
+      <w:pPr>
+        <w:spacing w:after="120"/>
+      </w:pPr>
+      <w:r>
+        <w:rPr>
+          <w:b/>
+        </w:rPr>
+        <w:t>Contrôle C — l'INCLINAISON (la caméra est-elle penchée comme prévu ?)</w:t>
+      </w:r>
+    </w:p>
+    <w:p>
+      <w:pPr>
+        <w:pStyle w:val="ListParagraph"/>
+        <w:numPr>
+          <w:ilvl w:val="0"/>
+          <w:numId w:val="2"/>
+        </w:numPr>
+        <w:spacing w:after="60"/>
+      </w:pPr>
+      <w:r>
+        <w:rPr/>
+        <w:t>Caméra 2 (centre, bleue) : verticale, 0°. Le cadre vert doit rester un rectangle.</w:t>
+      </w:r>
+    </w:p>
+    <w:p>
+      <w:pPr>
+        <w:pStyle w:val="ListParagraph"/>
+        <w:numPr>
+          <w:ilvl w:val="0"/>
+          <w:numId w:val="2"/>
+        </w:numPr>
+        <w:spacing w:after="60"/>
+      </w:pPr>
+      <w:r>
+        <w:rPr/>
+        <w:t>Caméras 1 et 3 (de chaque côté) : environ 4° vers le bout de la table (voir section 1). Le cadre vert devient un trapèze : le bord le plus éloigné de la caméra paraît plus court. Le texte d'état donne le rapport entre les deux bords (par exemple « bord haut = 93 % du bord bas » à 4°).</w:t>
+      </w:r>
+    </w:p>
+    <w:p>
+      <w:pPr>
+        <w:pStyle w:val="ListParagraph"/>
+        <w:numPr>
+          <w:ilvl w:val="0"/>
+          <w:numId w:val="2"/>
+        </w:numPr>
+        <w:spacing w:after="60"/>
+      </w:pPr>
+      <w:r>
+        <w:rPr/>
+        <w:t>Régler « Inclinaison de la caméra » jusqu'à ce que le trapèze vert colle aux bords réels de la table : la valeur obtenue est l'inclinaison réelle de la caméra. Elle doit être proche de la valeur prévue.</w:t>
+      </w:r>
+    </w:p>
+    <w:p>
+      <w:pPr>
+        <w:pStyle w:val="ListParagraph"/>
+        <w:numPr>
+          <w:ilvl w:val="0"/>
+          <w:numId w:val="2"/>
+        </w:numPr>
+        <w:spacing w:after="60"/>
+      </w:pPr>
+      <w:r>
+        <w:rPr/>
+        <w:t>Remarque : avec 97 cm entre les caméras et des zones centrées à 113,5 cm de la bille bleue, le calcul géométrique à 120 cm de hauteur donne plutôt environ 8° que 4°. La mire permet de trancher au premier test : notez la valeur réellement obtenue dans la fiche de test.</w:t>
+      </w:r>
+    </w:p>
+    <w:p>
+      <w:pPr>
+        <w:spacing w:after="120"/>
+      </w:pPr>
+      <w:r>
+        <w:rPr>
+          <w:b/>
+        </w:rPr>
+        <w:t>Chaque installation est unique : comment recalculer</w:t>
+      </w:r>
+    </w:p>
+    <w:p>
+      <w:pPr>
+        <w:spacing w:after="120"/>
+      </w:pPr>
+      <w:r>
+        <w:rPr/>
+        <w:t>Les valeurs de ce manuel (120 cm de hauteur, 97 cm entre les caméras, environ 4° d'inclinaison, zones de 130 / 97 / 130 cm, distances des marqueurs) correspondent à l'installation de référence : une table de 357 × 178 cm avec des caméras à 120 cm. Elles servent de valeurs de départ. La seule donnée qui ne change jamais est le NOMBRE de caméras : 3. Pour une autre salle ou une autre table, on refait les calculs ci-dessous, puis on contrôle le résultat avec la mire.</w:t>
+      </w:r>
+    </w:p>
+    <w:p>
+      <w:pPr>
+        <w:pStyle w:val="ListParagraph"/>
+        <w:numPr>
+          <w:ilvl w:val="0"/>
+          <w:numId w:val="2"/>
+        </w:numPr>
+        <w:spacing w:after="60"/>
+      </w:pPr>
+      <w:r>
+        <w:rPr/>
+        <w:t>Mesurer : la hauteur réelle des caméras au-dessus du tapis, la distance entre les caméras, et les dimensions de la table (longueur × largeur du tapis).</w:t>
+      </w:r>
+    </w:p>
+    <w:p>
+      <w:pPr>
+        <w:pStyle w:val="ListParagraph"/>
+        <w:numPr>
+          <w:ilvl w:val="0"/>
+          <w:numId w:val="2"/>
+        </w:numPr>
+        <w:spacing w:after="60"/>
+      </w:pPr>
+      <w:r>
+        <w:rPr/>
+        <w:t>Hauteur minimale : avec un objectif de 100° (diagonale), il faut environ 86 cm de hauteur pour voir toute la largeur de 178 cm. Plus la caméra est haute, plus la zone vue est grande mais plus les billes sont petites dans l'image. La mire le dit tout de suite : cadre vert = ça rentre, cadre rouge = trop grand.</w:t>
+      </w:r>
+    </w:p>
+    <w:p>
+      <w:pPr>
+        <w:pStyle w:val="ListParagraph"/>
+        <w:numPr>
+          <w:ilvl w:val="0"/>
+          <w:numId w:val="2"/>
+        </w:numPr>
+        <w:spacing w:after="60"/>
+      </w:pPr>
+      <w:r>
+        <w:rPr/>
+        <w:t>Zones : la table est partagée entre les 3 caméras (zone du bout baulk, zone du centre, zone du bout noire) avec un léger recouvrement. Les longueurs de zone changent si la table ou l'écartement des caméras change.</w:t>
+      </w:r>
+    </w:p>
+    <w:p>
+      <w:pPr>
+        <w:pStyle w:val="ListParagraph"/>
+        <w:numPr>
+          <w:ilvl w:val="0"/>
+          <w:numId w:val="2"/>
+        </w:numPr>
+        <w:spacing w:after="60"/>
+      </w:pPr>
+      <w:r>
+        <w:rPr/>
+        <w:t>Inclinaison des caméras 1 et 3 : angle ≈ arctan(écart ÷ hauteur), où « écart » est la distance horizontale entre la caméra et le centre de la zone qu'elle doit voir. Exemple : 16,5 cm d'écart à 120 cm donne environ 8° ; à 130 cm de hauteur l'angle est un peu plus petit.</w:t>
+      </w:r>
+    </w:p>
+    <w:p>
+      <w:pPr>
+        <w:pStyle w:val="ListParagraph"/>
+        <w:numPr>
+          <w:ilvl w:val="0"/>
+          <w:numId w:val="2"/>
+        </w:numPr>
+        <w:spacing w:after="60"/>
+      </w:pPr>
+      <w:r>
+        <w:rPr/>
+        <w:t>Positions des marqueurs : toujours mesurées à partir de la poche du milieu (centre de la table). Les distances de la section 12 sont à recalculer pour la nouvelle table et les nouvelles zones, puis le décalage d est remesuré.</w:t>
+      </w:r>
+    </w:p>
+    <w:p>
+      <w:pPr>
+        <w:pStyle w:val="ListParagraph"/>
+        <w:numPr>
+          <w:ilvl w:val="0"/>
+          <w:numId w:val="2"/>
+        </w:numPr>
+        <w:spacing w:after="60"/>
+      </w:pPr>
+      <w:r>
+        <w:rPr/>
+        <w:t>Contrôler : ouvrir la mire de chaque caméra, saisir la hauteur réelle, régler l'inclinaison jusqu'à coller aux bords de la table (contrôles A, B, C), puis calibrer.</w:t>
+      </w:r>
+    </w:p>
+    <w:p>
+      <w:pPr>
+        <w:spacing w:after="120"/>
+      </w:pPr>
+      <w:r>
+        <w:rPr/>
+        <w:t>Important : une calibration n'est valable que pour l'installation sur laquelle elle a été faite. Si une caméra est déplacée, changée de hauteur ou d'angle, ou si le logiciel est installé dans une autre salle, refaire la mire puis la calibration.</w:t>
+      </w:r>
+    </w:p>
+    <w:p>
+      <w:pPr>
+        <w:spacing w:after="120"/>
+      </w:pPr>
+      <w:r>
+        <w:rPr>
+          <w:b/>
+        </w:rPr>
+        <w:t>À noter pour chaque caméra</w:t>
+      </w:r>
+    </w:p>
+    <w:p>
+      <w:pPr>
+        <w:pStyle w:val="ListParagraph"/>
+        <w:numPr>
+          <w:ilvl w:val="0"/>
+          <w:numId w:val="2"/>
+        </w:numPr>
+        <w:spacing w:after="60"/>
+      </w:pPr>
+      <w:r>
+        <w:rPr/>
+        <w:t>Hauteur mesurée, inclinaison obtenue, rotation éventuelle, orientation de l'image choisie.</w:t>
+      </w:r>
+    </w:p>
+    <w:p>
+      <w:pPr>
+        <w:pStyle w:val="ListParagraph"/>
+        <w:numPr>
+          <w:ilvl w:val="0"/>
+          <w:numId w:val="2"/>
+        </w:numPr>
+        <w:spacing w:after="60"/>
+      </w:pPr>
+      <w:r>
+        <w:rPr/>
+        <w:t>Ces valeurs servent ensuite à la calibration par marqueurs (sections 7 et 8) et au dépannage.</w:t>
+      </w:r>
+    </w:p>
+    <w:p>
+      <w:pPr>
+        <w:pStyle w:val="ListParagraph"/>
+        <w:numPr>
+          <w:ilvl w:val="0"/>
+          <w:numId w:val="2"/>
+        </w:numPr>
+        <w:spacing w:after="60"/>
+      </w:pPr>
+      <w:r>
+        <w:rPr/>
+        <w:t>Quand la mire est bonne pour les 3 caméras : coller les marqueurs (section 7), tester le positionnement avec --check, puis calibrer (section 8).</w:t>
+      </w:r>
+    </w:p>
+    <w:p>
+      <w:pPr>
         <w:pStyle w:val="Heading1"/>
         <w:spacing w:after="150" w:before="300"/>
       </w:pPr>
       <w:r>
-        <w:t>5. Étape 1 — Générer les 10 marqueurs</w:t>
+        <w:t>6. Étape 2 — Générer les 10 marqueurs</w:t>
       </w:r>
     </w:p>
     <w:p>
@@ -254,7 +887,7 @@
         <w:spacing w:after="120"/>
       </w:pPr>
       <w:r>
-        <w:t>Crée marker_1.png à marker_10.png. La planche prête à imprimer est le fichier planche_10_marqueurs_aruco_a_imprimer.pdf (section 10) — ou générez-les vous-même avec la commande ci-dessus.</w:t>
+        <w:t>Crée marker_1.png à marker_10.png. La planche prête à imprimer est le fichier planche_10_marqueurs_aruco_a_imprimer.pdf (section 11) — ou générez-les vous-même avec la commande ci-dessus.</w:t>
       </w:r>
     </w:p>
     <w:p>
@@ -263,7 +896,7 @@
         <w:spacing w:after="150" w:before="300"/>
       </w:pPr>
       <w:r>
-        <w:t>6. Étape 2 — Coller les marqueurs sur la bordure</w:t>
+        <w:t>7. Étape 3 — Coller les marqueurs sur la bordure</w:t>
       </w:r>
     </w:p>
     <w:p>
@@ -405,7 +1038,7 @@
           <w:i/>
           <w:iCs/>
         </w:rPr>
-        <w:t>Important : les marqueurs 5 et 6 sont légèrement décalés de la poche du milieu (quelques cm, notés d) pour ne pas la chevaucher : le 5 (bord haut) à droite de la poche, le 6 (bord bas) à gauche — voir le schéma. Mesurer d à l'installation et le noter (section 11) : l'outil doit connaître les vraies positions des marqueurs 5 et 6.</w:t>
+        <w:t>Important : les marqueurs 5 et 6 sont légèrement décalés de la poche du milieu (quelques cm, notés d) pour ne pas la chevaucher : le 5 (bord haut) à droite de la poche, le 6 (bord bas) à gauche — voir le schéma. Mesurer d à l'installation et le noter (section 12) : l'outil doit connaître les vraies positions des marqueurs 5 et 6.</w:t>
       </w:r>
     </w:p>
     <w:p>
@@ -414,7 +1047,7 @@
         <w:spacing w:after="150" w:before="300"/>
       </w:pPr>
       <w:r>
-        <w:t xml:space="preserve">7. Étape 3 — Lancer la calibration</w:t>
+        <w:t>8. Étape 4 — Lancer la calibration</w:t>
       </w:r>
     </w:p>
     <w:p>
@@ -444,6 +1077,9 @@
       <w:r>
         <w:t>(remplacez 0 par 1 ou 2 selon la caméra). Avant de calibrer, testez le positionnement : ArucoCalibrationTool.exe --check &lt;index caméra&gt; &lt;photo ou flux&gt;. Le programme détecte ensuite automatiquement les marqueurs de cette caméra (4 pour les caméras 1 et 3, 2 pour la caméra 2), calcule la calibration (rotation + échelle + position), et sauvegarde dans camera_0.yml (ou 1/2). Pour la caméra 2, si les marqueurs 5 et 6 sont décalés de la poche du milieu, indiquer le décalage mesuré d (en cm) avec l'option --decalage : ArucoCalibrationTool.exe --decalage &lt;d&gt; 1 &lt;photo ou flux&gt;.</w:t>
       </w:r>
+      <w:r>
+        <w:t xml:space="preserve"> Le positionnement des caméras a déjà été fait à l'étape 1 (section 5).</w:t>
+      </w:r>
     </w:p>
     <w:p>
       <w:pPr>
@@ -451,7 +1087,7 @@
         <w:spacing w:after="150" w:before="300"/>
       </w:pPr>
       <w:r>
-        <w:t xml:space="preserve">8. Vérification</w:t>
+        <w:t>9. Vérification</w:t>
       </w:r>
     </w:p>
     <w:p>
@@ -499,7 +1135,7 @@
         <w:spacing w:after="150" w:before="300"/>
       </w:pPr>
       <w:r>
-        <w:t xml:space="preserve">9. Orientation des marqueurs</w:t>
+        <w:t>10. Orientation des marqueurs</w:t>
       </w:r>
     </w:p>
     <w:p>
@@ -521,7 +1157,7 @@
         <w:spacing w:after="150" w:before="300"/>
       </w:pPr>
       <w:r>
-        <w:t>10. Planche des 10 marqueurs à imprimer</w:t>
+        <w:t>11. Planche des 10 marqueurs à imprimer</w:t>
       </w:r>
     </w:p>
     <w:p>
@@ -551,7 +1187,7 @@
         <w:pStyle w:val="Heading1"/>
       </w:pPr>
       <w:r>
-        <w:t>11. Positions des marqueurs</w:t>
+        <w:t>12. Positions des marqueurs</w:t>
       </w:r>
     </w:p>
     <w:p>

</xml_diff>

<commit_message>
Manual rewritten in installation order: 1 Objective, 2 Camera positioning, 3 Calibration
- Part 2: points of the table + positioning diagrams (from the guide), mire,
  step-by-step per camera, the three mire checks, "every installation is
  unique", values to note.
- Part 3: marker diagram, generate/print, stick, positions table, run the
  calibration, verification, marker orientation.
- Section 1 simplified (no technical detail).

Co-Authored-By: Claude Sonnet 5.5 <noreply@anthropic.com>
</commit_message>
<xml_diff>
--- a/docs/manuel_calibration_cameras.docx
+++ b/docs/manuel_calibration_cameras.docx
@@ -38,38 +38,1202 @@
         <w:spacing w:after="150" w:before="300"/>
       </w:pPr>
       <w:r>
-        <w:t xml:space="preserve">1. Objectif</w:t>
-      </w:r>
-    </w:p>
-    <w:p>
-      <w:pPr>
-        <w:spacing w:after="120"/>
-      </w:pPr>
-      <w:r>
-        <w:t>Ce manuel explique comment calibrer les 3 caméras du système Snooker Player 3.0, avec la méthode à 10 marqueurs ArUco : 4 marqueurs pour la caméra 1, 2 pour la caméra 2 et 4 pour la caméra 3, positionnés sur la bordure de la table. Les caméras 1 et 3 sont inclinées d'environ 4° vers l'extérieur (4 marqueurs, calibration par homographie) ; la caméra 2 est verticale, au centre (2 marqueurs suffisent).</w:t>
-      </w:r>
-      <w:r>
-        <w:t xml:space="preserve"> Les valeurs données (1,20 m, 97 cm, 4°…) sont celles de l'installation de référence : chaque installation est unique et se recalcule (voir section 5) ; seul le nombre de caméras, 3, ne change pas.</w:t>
-      </w:r>
-    </w:p>
-    <w:p>
-      <w:pPr>
-        <w:spacing w:after="120"/>
-      </w:pPr>
-      <w:r>
-        <w:rPr>
-          <w:b/>
-        </w:rPr>
-        <w:t>Ordre des opérations : (1) positionner et orienter les 3 caméras avec la mire (section 5) ; (2) générer et coller les marqueurs (sections 6 et 7) ; (3) calibrer (section 8) ; (4) vérifier (section 9). On ne colle les marqueurs et on ne calibre qu'une fois les 3 caméras bien positionnées.</w:t>
+        <w:t>1. Objectif</w:t>
+      </w:r>
+    </w:p>
+    <w:p>
+      <w:pPr>
+        <w:spacing w:after="120"/>
+      </w:pPr>
+      <w:r>
+        <w:t>Ce manuel explique comment installer et régler les 3 caméras du système Snooker Player. Il suit l'ordre de l'installation :</w:t>
+      </w:r>
+    </w:p>
+    <w:p>
+      <w:pPr>
+        <w:pStyle w:val="ListParagraph"/>
+        <w:numPr>
+          <w:ilvl w:val="0"/>
+          <w:numId w:val="2"/>
+        </w:numPr>
+        <w:spacing w:after="60"/>
+      </w:pPr>
+      <w:r>
+        <w:t>Partie 2 — Positionnement : poser les 3 caméras au bon endroit et bien orientées, à l'aide de la mire du logiciel.</w:t>
+      </w:r>
+    </w:p>
+    <w:p>
+      <w:pPr>
+        <w:pStyle w:val="ListParagraph"/>
+        <w:numPr>
+          <w:ilvl w:val="0"/>
+          <w:numId w:val="2"/>
+        </w:numPr>
+        <w:spacing w:after="60"/>
+      </w:pPr>
+      <w:r>
+        <w:t>Partie 3 — Calibration : coller les marqueurs sur la bordure de la table, puis lancer la calibration.</w:t>
+      </w:r>
+    </w:p>
+    <w:p>
+      <w:pPr>
+        <w:spacing w:after="120"/>
+      </w:pPr>
+      <w:r>
+        <w:t>On ne colle les marqueurs et on ne calibre qu'une fois les 3 caméras bien positionnées.</w:t>
+      </w:r>
+    </w:p>
+    <w:p>
+      <w:pPr>
+        <w:spacing w:after="120"/>
+      </w:pPr>
+      <w:r>
+        <w:t>Chaque installation est différente : les valeurs données dans ce manuel sont celles de l'installation de référence et se recalculent si besoin (voir section 2.6).</w:t>
+      </w:r>
+    </w:p>
+    <w:p>
+      <w:pPr>
+        <w:spacing w:after="120"/>
+      </w:pPr>
+      <w:r>
+        <w:rPr>
+          <w:b/>
+        </w:rPr>
+        <w:t>Quand faire cette opération</w:t>
+      </w:r>
+    </w:p>
+    <w:p>
+      <w:pPr>
+        <w:pStyle w:val="ListParagraph"/>
+        <w:numPr>
+          <w:ilvl w:val="0"/>
+          <w:numId w:val="2"/>
+        </w:numPr>
+        <w:spacing w:after="60"/>
+      </w:pPr>
+      <w:r>
+        <w:t>À l'installation initiale des caméras.</w:t>
+      </w:r>
+    </w:p>
+    <w:p>
+      <w:pPr>
+        <w:pStyle w:val="ListParagraph"/>
+        <w:numPr>
+          <w:ilvl w:val="0"/>
+          <w:numId w:val="2"/>
+        </w:numPr>
+        <w:spacing w:after="60"/>
+      </w:pPr>
+      <w:r>
+        <w:t>Si une caméra a bougé, a été changée, ou si le logiciel est installé dans une autre salle.</w:t>
+      </w:r>
+    </w:p>
+    <w:p>
+      <w:pPr>
+        <w:spacing w:after="120"/>
+      </w:pPr>
+      <w:r>
+        <w:t>Pas besoin de la refaire entre deux parties, ni après avoir éteint/rallumé le système.</w:t>
+      </w:r>
+    </w:p>
+    <w:p>
+      <w:pPr>
+        <w:spacing w:after="120"/>
+      </w:pPr>
+      <w:r>
+        <w:rPr>
+          <w:b/>
+        </w:rPr>
+        <w:t>Matériel nécessaire</w:t>
+      </w:r>
+    </w:p>
+    <w:p>
+      <w:pPr>
+        <w:pStyle w:val="ListParagraph"/>
+        <w:numPr>
+          <w:ilvl w:val="0"/>
+          <w:numId w:val="2"/>
+        </w:numPr>
+        <w:spacing w:after="60"/>
+      </w:pPr>
+      <w:r>
+        <w:t>Un ordinateur avec le logiciel Snooker Player installé.</w:t>
+      </w:r>
+    </w:p>
+    <w:p>
+      <w:pPr>
+        <w:pStyle w:val="ListParagraph"/>
+        <w:numPr>
+          <w:ilvl w:val="0"/>
+          <w:numId w:val="2"/>
+        </w:numPr>
+        <w:spacing w:after="60"/>
+      </w:pPr>
+      <w:r>
+        <w:t>Une imprimante.</w:t>
+      </w:r>
+    </w:p>
+    <w:p>
+      <w:pPr>
+        <w:pStyle w:val="ListParagraph"/>
+        <w:numPr>
+          <w:ilvl w:val="0"/>
+          <w:numId w:val="2"/>
+        </w:numPr>
+        <w:spacing w:after="60"/>
+      </w:pPr>
+      <w:r>
+        <w:t>Du ruban adhésif de peintre et de la colle repositionnable (pour les marqueurs).</w:t>
+      </w:r>
+    </w:p>
+    <w:p>
+      <w:pPr>
+        <w:pStyle w:val="ListParagraph"/>
+        <w:numPr>
+          <w:ilvl w:val="0"/>
+          <w:numId w:val="2"/>
+        </w:numPr>
+        <w:spacing w:after="60"/>
+      </w:pPr>
+      <w:r>
+        <w:t>Les 3 caméras avec leur support, et un mètre ruban.</w:t>
+      </w:r>
+    </w:p>
+    <w:p>
+      <w:pPr>
+        <w:pStyle w:val="ListParagraph"/>
+        <w:numPr>
+          <w:ilvl w:val="0"/>
+          <w:numId w:val="2"/>
+        </w:numPr>
+        <w:spacing w:after="60"/>
+      </w:pPr>
+      <w:r>
+        <w:t>3 billes repères (pour viser les points de la table, partie 2).</w:t>
       </w:r>
     </w:p>
     <w:p>
       <w:pPr>
         <w:pStyle w:val="Heading1"/>
         <w:spacing w:after="150" w:before="300"/>
-      </w:pPr>
-      <w:r>
-        <w:t xml:space="preserve">2. Schéma de disposition</w:t>
+        <w:pageBreakBefore/>
+      </w:pPr>
+      <w:r>
+        <w:t>2. Positionnement des caméras</w:t>
+      </w:r>
+    </w:p>
+    <w:p>
+      <w:pPr>
+        <w:spacing w:after="120"/>
+      </w:pPr>
+      <w:r>
+        <w:t>Cette partie se fait AVANT de coller les marqueurs et de calibrer. Chaque caméra est posée à 120 cm au-dessus du tapis et vise un point précis de la table : le centre de l'image (la croix de la mire) doit tomber dessus.</w:t>
+      </w:r>
+    </w:p>
+    <w:p>
+      <w:pPr>
+        <w:pStyle w:val="Heading2"/>
+        <w:spacing w:after="150" w:before="300"/>
+      </w:pPr>
+      <w:r>
+        <w:t>2.1 Les points de la table</w:t>
+      </w:r>
+    </w:p>
+    <w:p>
+      <w:pPr>
+        <w:spacing w:after="120"/>
+      </w:pPr>
+      <w:r>
+        <w:drawing>
+          <wp:inline xmlns:a="http://schemas.openxmlformats.org/drawingml/2006/main" xmlns:pic="http://schemas.openxmlformats.org/drawingml/2006/picture">
+            <wp:extent cx="5760000" cy="4164388"/>
+            <wp:docPr id="3" name="Picture 3"/>
+            <wp:cNvGraphicFramePr>
+              <a:graphicFrameLocks noChangeAspect="1"/>
+            </wp:cNvGraphicFramePr>
+            <a:graphic>
+              <a:graphicData uri="http://schemas.openxmlformats.org/drawingml/2006/picture">
+                <pic:pic>
+                  <pic:nvPicPr>
+                    <pic:cNvPr id="0" name="guide_points.png"/>
+                    <pic:cNvPicPr/>
+                  </pic:nvPicPr>
+                  <pic:blipFill>
+                    <a:blip r:embed="rId12"/>
+                    <a:stretch>
+                      <a:fillRect/>
+                    </a:stretch>
+                  </pic:blipFill>
+                  <pic:spPr>
+                    <a:xfrm>
+                      <a:off x="0" y="0"/>
+                      <a:ext cx="5760000" cy="4164388"/>
+                    </a:xfrm>
+                    <a:prstGeom prst="rect"/>
+                  </pic:spPr>
+                </pic:pic>
+              </a:graphicData>
+            </a:graphic>
+          </wp:inline>
+        </w:drawing>
+      </w:r>
+    </w:p>
+    <w:p>
+      <w:pPr>
+        <w:spacing w:after="120"/>
+      </w:pPr>
+      <w:r>
+        <w:t>Valeurs prévues (installation de référence), à corriger après les essais :</w:t>
+      </w:r>
+    </w:p>
+    <w:p>
+      <w:pPr>
+        <w:pStyle w:val="ListParagraph"/>
+        <w:numPr>
+          <w:ilvl w:val="0"/>
+          <w:numId w:val="2"/>
+        </w:numPr>
+        <w:spacing w:after="60"/>
+      </w:pPr>
+      <w:r>
+        <w:t>H = 120 cm : hauteur de la caméra au-dessus du tapis.</w:t>
+      </w:r>
+    </w:p>
+    <w:p>
+      <w:pPr>
+        <w:pStyle w:val="ListParagraph"/>
+        <w:numPr>
+          <w:ilvl w:val="0"/>
+          <w:numId w:val="2"/>
+        </w:numPr>
+        <w:spacing w:after="60"/>
+      </w:pPr>
+      <w:r>
+        <w:t>E = 97 cm : distance entre le point bleu et la verticale d'une caméra latérale (1 ou 3).</w:t>
+      </w:r>
+    </w:p>
+    <w:p>
+      <w:pPr>
+        <w:pStyle w:val="ListParagraph"/>
+        <w:numPr>
+          <w:ilvl w:val="0"/>
+          <w:numId w:val="2"/>
+        </w:numPr>
+        <w:spacing w:after="60"/>
+      </w:pPr>
+      <w:r>
+        <w:t>D = 105 cm : distance entre le point bleu et le point à viser de cette caméra.</w:t>
+      </w:r>
+    </w:p>
+    <w:p>
+      <w:pPr>
+        <w:pStyle w:val="ListParagraph"/>
+        <w:numPr>
+          <w:ilvl w:val="0"/>
+          <w:numId w:val="2"/>
+        </w:numPr>
+        <w:spacing w:after="60"/>
+      </w:pPr>
+      <w:r>
+        <w:t>d = D − E = 8 cm : la caméra regarde un peu plus loin que sa verticale.</w:t>
+      </w:r>
+    </w:p>
+    <w:p>
+      <w:pPr>
+        <w:pStyle w:val="ListParagraph"/>
+        <w:numPr>
+          <w:ilvl w:val="0"/>
+          <w:numId w:val="2"/>
+        </w:numPr>
+        <w:spacing w:after="60"/>
+      </w:pPr>
+      <w:r>
+        <w:t>a = arctan(d ÷ H) : environ 4° d'inclinaison pour les caméras latérales.</w:t>
+      </w:r>
+    </w:p>
+    <w:p>
+      <w:pPr>
+        <w:pStyle w:val="Heading2"/>
+        <w:spacing w:after="150" w:before="300"/>
+      </w:pPr>
+      <w:r>
+        <w:t>2.2 Schéma de positionnement</w:t>
+      </w:r>
+    </w:p>
+    <w:p>
+      <w:pPr>
+        <w:spacing w:after="120"/>
+      </w:pPr>
+      <w:r>
+        <w:drawing>
+          <wp:inline xmlns:a="http://schemas.openxmlformats.org/drawingml/2006/main" xmlns:pic="http://schemas.openxmlformats.org/drawingml/2006/picture">
+            <wp:extent cx="5760000" cy="4017951"/>
+            <wp:docPr id="3" name="Picture 3"/>
+            <wp:cNvGraphicFramePr>
+              <a:graphicFrameLocks noChangeAspect="1"/>
+            </wp:cNvGraphicFramePr>
+            <a:graphic>
+              <a:graphicData uri="http://schemas.openxmlformats.org/drawingml/2006/picture">
+                <pic:pic>
+                  <pic:nvPicPr>
+                    <pic:cNvPr id="0" name="guide_positionnement.png"/>
+                    <pic:cNvPicPr/>
+                  </pic:nvPicPr>
+                  <pic:blipFill>
+                    <a:blip r:embed="rId13"/>
+                    <a:stretch>
+                      <a:fillRect/>
+                    </a:stretch>
+                  </pic:blipFill>
+                  <pic:spPr>
+                    <a:xfrm>
+                      <a:off x="0" y="0"/>
+                      <a:ext cx="5760000" cy="4017951"/>
+                    </a:xfrm>
+                    <a:prstGeom prst="rect"/>
+                  </pic:spPr>
+                </pic:pic>
+              </a:graphicData>
+            </a:graphic>
+          </wp:inline>
+        </w:drawing>
+      </w:r>
+    </w:p>
+    <w:p>
+      <w:pPr>
+        <w:spacing w:after="120"/>
+      </w:pPr>
+      <w:r>
+        <w:t>Les 3 points à viser : le point BLEU pour la caméra 2 (verticale, au-dessus du point bleu) ; un point à 105 cm du bleu vers le baulk (c'est quasiment le point MARRON) pour la caméra 1 ; un point à 105 cm du bleu vers la noire (à mesurer au mètre, environ 16 cm après le point rose) pour la caméra 3. Poser une bille repère sur chaque point.</w:t>
+      </w:r>
+    </w:p>
+    <w:p>
+      <w:pPr>
+        <w:pStyle w:val="Heading2"/>
+        <w:spacing w:after="150" w:before="300"/>
+      </w:pPr>
+      <w:r>
+        <w:t>2.3 La mire de cadrage</w:t>
+      </w:r>
+    </w:p>
+    <w:p>
+      <w:pPr>
+        <w:spacing w:after="120"/>
+      </w:pPr>
+      <w:r>
+        <w:rPr/>
+        <w:t>Le logiciel contient une « mire » : un aperçu en direct de la caméra, avec des repères dessinés par-dessus. Elle permet de vérifier, SANS marqueur et SANS calibration, que la caméra est bien placée, bien orientée et bien inclinée au-dessus de la table. À faire pour chaque caméra, juste après sa fixation, et à refaire si une caméra a bougé.</w:t>
+      </w:r>
+    </w:p>
+    <w:p>
+      <w:pPr>
+        <w:spacing w:after="120"/>
+      </w:pPr>
+      <w:r>
+        <w:rPr>
+          <w:b/>
+        </w:rPr>
+        <w:t>Ouvrir la mire</w:t>
+      </w:r>
+    </w:p>
+    <w:p>
+      <w:pPr>
+        <w:pStyle w:val="ListParagraph"/>
+        <w:numPr>
+          <w:ilvl w:val="0"/>
+          <w:numId w:val="2"/>
+        </w:numPr>
+        <w:spacing w:after="60"/>
+      </w:pPr>
+      <w:r>
+        <w:rPr/>
+        <w:t>Dans le logiciel : Paramètres &gt; Caméra, puis le bouton « Mire... » à côté de la caméra concernée (le bouton n'est actif que si la caméra est détectée).</w:t>
+      </w:r>
+    </w:p>
+    <w:p>
+      <w:pPr>
+        <w:pStyle w:val="ListParagraph"/>
+        <w:numPr>
+          <w:ilvl w:val="0"/>
+          <w:numId w:val="2"/>
+        </w:numPr>
+        <w:spacing w:after="60"/>
+      </w:pPr>
+      <w:r>
+        <w:rPr/>
+        <w:t>La caméra doit être libre : si un suivi caméra est en cours ou si un autre programme l'utilise, fermez-le puis rouvrez la mire.</w:t>
+      </w:r>
+    </w:p>
+    <w:p>
+      <w:pPr>
+        <w:pStyle w:val="ListParagraph"/>
+        <w:numPr>
+          <w:ilvl w:val="0"/>
+          <w:numId w:val="2"/>
+        </w:numPr>
+        <w:spacing w:after="60"/>
+      </w:pPr>
+      <w:r>
+        <w:rPr/>
+        <w:t>Les réglages sont mémorisés pour la prochaine ouverture (hauteur, champ de vision, orientation, inclinaison).</w:t>
+      </w:r>
+    </w:p>
+    <w:p>
+      <w:pPr>
+        <w:spacing w:after="120"/>
+      </w:pPr>
+      <w:r>
+        <w:rPr>
+          <w:b/>
+        </w:rPr>
+        <w:t>Ce que l'on voit à l'écran</w:t>
+      </w:r>
+    </w:p>
+    <w:p>
+      <w:pPr>
+        <w:pStyle w:val="ListParagraph"/>
+        <w:numPr>
+          <w:ilvl w:val="0"/>
+          <w:numId w:val="2"/>
+        </w:numPr>
+        <w:spacing w:after="60"/>
+      </w:pPr>
+      <w:r>
+        <w:rPr/>
+        <w:t>Une croix et trois cercles au centre de l'image, plus une grille en tiers : ils servent à centrer la table.</w:t>
+      </w:r>
+    </w:p>
+    <w:p>
+      <w:pPr>
+        <w:pStyle w:val="ListParagraph"/>
+        <w:numPr>
+          <w:ilvl w:val="0"/>
+          <w:numId w:val="2"/>
+        </w:numPr>
+        <w:spacing w:after="60"/>
+      </w:pPr>
+      <w:r>
+        <w:rPr/>
+        <w:t>Un cadre VERT = l'endroit où doivent tomber les bords de la table pour cette caméra : 178 cm de large, et la longueur de la zone (130 cm pour les caméras 1 et 3, 97 cm pour la caméra 2). Le cadre devient ROUGE s'il ne rentre pas entièrement dans l'image : monter la caméra ou vérifier la hauteur saisie.</w:t>
+      </w:r>
+    </w:p>
+    <w:p>
+      <w:pPr>
+        <w:pStyle w:val="ListParagraph"/>
+        <w:numPr>
+          <w:ilvl w:val="0"/>
+          <w:numId w:val="2"/>
+        </w:numPr>
+        <w:spacing w:after="60"/>
+      </w:pPr>
+      <w:r>
+        <w:rPr/>
+        <w:t>Sur Mac uniquement : les marqueurs reconnus sont entourés avec leur numéro (ceux attendus pour cette caméra en vert). Sous Windows, cette partie n'est pas disponible.</w:t>
+      </w:r>
+    </w:p>
+    <w:p>
+      <w:pPr>
+        <w:spacing w:after="120"/>
+      </w:pPr>
+      <w:r>
+        <w:rPr/>
+      </w:r>
+      <w:r>
+        <w:drawing>
+          <wp:inline xmlns:a="http://schemas.openxmlformats.org/drawingml/2006/main" xmlns:pic="http://schemas.openxmlformats.org/drawingml/2006/picture">
+            <wp:extent cx="5580000" cy="4073400"/>
+            <wp:docPr id="2" name="Picture 2"/>
+            <wp:cNvGraphicFramePr>
+              <a:graphicFrameLocks noChangeAspect="1"/>
+            </wp:cNvGraphicFramePr>
+            <a:graphic>
+              <a:graphicData uri="http://schemas.openxmlformats.org/drawingml/2006/picture">
+                <pic:pic>
+                  <pic:nvPicPr>
+                    <pic:cNvPr id="0" name="mire_tilt_crop.png"/>
+                    <pic:cNvPicPr/>
+                  </pic:nvPicPr>
+                  <pic:blipFill>
+                    <a:blip r:embed="rId11"/>
+                    <a:stretch>
+                      <a:fillRect/>
+                    </a:stretch>
+                  </pic:blipFill>
+                  <pic:spPr>
+                    <a:xfrm>
+                      <a:off x="0" y="0"/>
+                      <a:ext cx="5580000" cy="4073400"/>
+                    </a:xfrm>
+                    <a:prstGeom prst="rect"/>
+                  </pic:spPr>
+                </pic:pic>
+              </a:graphicData>
+            </a:graphic>
+          </wp:inline>
+        </w:drawing>
+      </w:r>
+    </w:p>
+    <w:p>
+      <w:pPr>
+        <w:spacing w:after="120"/>
+      </w:pPr>
+      <w:r>
+        <w:rPr/>
+        <w:t>Exemple : mire de la caméra d'index 0 (caméra 1), inclinée de 4°. Le cadre vert est un trapèze car la caméra est penchée. (L'image est noire ici car l'objectif était couvert pendant la prise de vue.)</w:t>
+      </w:r>
+    </w:p>
+    <w:p>
+      <w:pPr>
+        <w:spacing w:after="120"/>
+      </w:pPr>
+      <w:r>
+        <w:rPr>
+          <w:b/>
+        </w:rPr>
+        <w:t>Les réglages</w:t>
+      </w:r>
+    </w:p>
+    <w:p>
+      <w:pPr>
+        <w:pStyle w:val="ListParagraph"/>
+        <w:numPr>
+          <w:ilvl w:val="0"/>
+          <w:numId w:val="2"/>
+        </w:numPr>
+        <w:spacing w:after="60"/>
+      </w:pPr>
+      <w:r>
+        <w:rPr/>
+        <w:t>Hauteur de la caméra (cm) : la hauteur réelle, mesurée au mètre (120 cm par défaut, bord bas des abat-jour). Le cadre vert est calculé avec cette valeur.</w:t>
+      </w:r>
+    </w:p>
+    <w:p>
+      <w:pPr>
+        <w:pStyle w:val="ListParagraph"/>
+        <w:numPr>
+          <w:ilvl w:val="0"/>
+          <w:numId w:val="2"/>
+        </w:numPr>
+        <w:spacing w:after="60"/>
+      </w:pPr>
+      <w:r>
+        <w:rPr/>
+        <w:t>Champ de vision (degrés, diagonale) : 100° par défaut, comme les caméras ELP prévues.</w:t>
+      </w:r>
+    </w:p>
+    <w:p>
+      <w:pPr>
+        <w:pStyle w:val="ListParagraph"/>
+        <w:numPr>
+          <w:ilvl w:val="0"/>
+          <w:numId w:val="2"/>
+        </w:numPr>
+        <w:spacing w:after="60"/>
+      </w:pPr>
+      <w:r>
+        <w:rPr/>
+        <w:t>Orientation de l'image : normale, tournée de 90° (horaire ou anti-horaire), ou à l'envers (180°). Sert à remettre l'image à l'endroit si la caméra est montée de travers ou à l'envers.</w:t>
+      </w:r>
+    </w:p>
+    <w:p>
+      <w:pPr>
+        <w:pStyle w:val="ListParagraph"/>
+        <w:numPr>
+          <w:ilvl w:val="0"/>
+          <w:numId w:val="2"/>
+        </w:numPr>
+        <w:spacing w:after="60"/>
+      </w:pPr>
+      <w:r>
+        <w:rPr/>
+        <w:t>Rotation du cadre (degrés) : tourne le cadre vert d'un petit angle (−45° à +45°, pas de 0,5°).</w:t>
+      </w:r>
+    </w:p>
+    <w:p>
+      <w:pPr>
+        <w:pStyle w:val="ListParagraph"/>
+        <w:numPr>
+          <w:ilvl w:val="0"/>
+          <w:numId w:val="2"/>
+        </w:numPr>
+        <w:spacing w:after="60"/>
+      </w:pPr>
+      <w:r>
+        <w:rPr/>
+        <w:t>Inclinaison de la caméra (degrés) : penche le cadre vert comme le verrait une caméra inclinée (−20° à +20°, pas de 0,5° ; le signe + penche vers le haut de l'image).</w:t>
+      </w:r>
+    </w:p>
+    <w:p>
+      <w:pPr>
+        <w:pStyle w:val="Heading2"/>
+        <w:spacing w:after="150" w:before="300"/>
+      </w:pPr>
+      <w:r>
+        <w:t>2.4 Positionner chaque caméra, pas à pas</w:t>
+      </w:r>
+    </w:p>
+    <w:p>
+      <w:pPr>
+        <w:spacing w:after="120"/>
+      </w:pPr>
+      <w:r>
+        <w:t>Commencer par la caméra 2 (la plus simple), puis les caméras 1 et 3. Pour CHAQUE caméra :</w:t>
+      </w:r>
+    </w:p>
+    <w:p>
+      <w:pPr>
+        <w:spacing w:after="120"/>
+      </w:pPr>
+      <w:r>
+        <w:rPr>
+          <w:b/>
+        </w:rPr>
+        <w:t xml:space="preserve">1.  </w:t>
+      </w:r>
+      <w:r>
+        <w:rPr>
+          <w:b/>
+        </w:rPr>
+        <w:t>Hauteur :</w:t>
+      </w:r>
+      <w:r>
+        <w:rPr>
+          <w:b w:val="0"/>
+        </w:rPr>
+        <w:t xml:space="preserve"> fixer la caméra à 120 cm au-dessus du tapis (mesurer au mètre, jusqu'au tapis). Noter la hauteur réelle.</w:t>
+      </w:r>
+    </w:p>
+    <w:p>
+      <w:pPr>
+        <w:spacing w:after="120"/>
+      </w:pPr>
+      <w:r>
+        <w:rPr>
+          <w:b/>
+        </w:rPr>
+        <w:t xml:space="preserve">2.  </w:t>
+      </w:r>
+      <w:r>
+        <w:rPr>
+          <w:b/>
+        </w:rPr>
+        <w:t>Emplacement :</w:t>
+      </w:r>
+      <w:r>
+        <w:rPr>
+          <w:b w:val="0"/>
+        </w:rPr>
+        <w:t xml:space="preserve"> à la verticale du point indiqué au schéma 2.2 (caméra 2 : point bleu ; caméras 1 et 3 : à 97 cm du point bleu, au milieu de la largeur de la table).</w:t>
+      </w:r>
+    </w:p>
+    <w:p>
+      <w:pPr>
+        <w:spacing w:after="120"/>
+      </w:pPr>
+      <w:r>
+        <w:rPr>
+          <w:b/>
+        </w:rPr>
+        <w:t xml:space="preserve">3.  </w:t>
+      </w:r>
+      <w:r>
+        <w:rPr>
+          <w:b/>
+        </w:rPr>
+        <w:t>Ouvrir la mire :</w:t>
+      </w:r>
+      <w:r>
+        <w:rPr>
+          <w:b w:val="0"/>
+        </w:rPr>
+        <w:t xml:space="preserve"> Paramètres &gt; Caméra &gt; Mire... de la caméra. Saisir la hauteur mesurée.</w:t>
+      </w:r>
+    </w:p>
+    <w:p>
+      <w:pPr>
+        <w:spacing w:after="120"/>
+      </w:pPr>
+      <w:r>
+        <w:rPr>
+          <w:b/>
+        </w:rPr>
+        <w:t xml:space="preserve">4.  </w:t>
+      </w:r>
+      <w:r>
+        <w:rPr>
+          <w:b/>
+        </w:rPr>
+        <w:t>Image à l'endroit :</w:t>
+      </w:r>
+      <w:r>
+        <w:rPr>
+          <w:b w:val="0"/>
+        </w:rPr>
+        <w:t xml:space="preserve"> si elle est tournée ou à l'envers, choisir « Orientation de l'image » (ou tourner la caméra).</w:t>
+      </w:r>
+    </w:p>
+    <w:p>
+      <w:pPr>
+        <w:spacing w:after="120"/>
+      </w:pPr>
+      <w:r>
+        <w:rPr>
+          <w:b/>
+        </w:rPr>
+        <w:t xml:space="preserve">5.  </w:t>
+      </w:r>
+      <w:r>
+        <w:rPr>
+          <w:b/>
+        </w:rPr>
+        <w:t>Orientation :</w:t>
+      </w:r>
+      <w:r>
+        <w:rPr>
+          <w:b w:val="0"/>
+        </w:rPr>
+        <w:t xml:space="preserve"> les deux grands rails de la table doivent être parallèles aux bords gauche et droit du cadre vert (contrôle B, section 2.5).</w:t>
+      </w:r>
+    </w:p>
+    <w:p>
+      <w:pPr>
+        <w:spacing w:after="120"/>
+      </w:pPr>
+      <w:r>
+        <w:rPr>
+          <w:b/>
+        </w:rPr>
+        <w:t xml:space="preserve">6.  </w:t>
+      </w:r>
+      <w:r>
+        <w:rPr>
+          <w:b/>
+        </w:rPr>
+        <w:t>Viser :</w:t>
+      </w:r>
+      <w:r>
+        <w:rPr>
+          <w:b w:val="0"/>
+        </w:rPr>
+        <w:t xml:space="preserve"> incliner la caméra pour que la bille repère soit pile sous la croix au centre de l'image. Caméra 2 : verticale, la bille bleue au centre.</w:t>
+      </w:r>
+    </w:p>
+    <w:p>
+      <w:pPr>
+        <w:spacing w:after="120"/>
+      </w:pPr>
+      <w:r>
+        <w:rPr>
+          <w:b/>
+        </w:rPr>
+        <w:t xml:space="preserve">7.  </w:t>
+      </w:r>
+      <w:r>
+        <w:rPr>
+          <w:b/>
+        </w:rPr>
+        <w:t>Inclinaison :</w:t>
+      </w:r>
+      <w:r>
+        <w:rPr>
+          <w:b w:val="0"/>
+        </w:rPr>
+        <w:t xml:space="preserve"> régler « Inclinaison de la caméra » dans la mire jusqu'à ce que le trapèze vert colle aux bords réels de la table (contrôle C). La valeur lue est l'inclinaison réelle.</w:t>
+      </w:r>
+    </w:p>
+    <w:p>
+      <w:pPr>
+        <w:spacing w:after="120"/>
+      </w:pPr>
+      <w:r>
+        <w:rPr>
+          <w:b/>
+        </w:rPr>
+        <w:t xml:space="preserve">8.  </w:t>
+      </w:r>
+      <w:r>
+        <w:rPr>
+          <w:b/>
+        </w:rPr>
+        <w:t>Position :</w:t>
+      </w:r>
+      <w:r>
+        <w:rPr>
+          <w:b w:val="0"/>
+        </w:rPr>
+        <w:t xml:space="preserve"> les bords de la table coïncident avec le cadre vert, la table est centrée sur la croix (contrôle A). Cadre ROUGE = il ne rentre pas dans l'image : monter la caméra ou vérifier la hauteur saisie.</w:t>
+      </w:r>
+    </w:p>
+    <w:p>
+      <w:pPr>
+        <w:spacing w:after="120"/>
+      </w:pPr>
+      <w:r>
+        <w:rPr>
+          <w:b/>
+        </w:rPr>
+        <w:t xml:space="preserve">9.  </w:t>
+      </w:r>
+      <w:r>
+        <w:rPr>
+          <w:b/>
+        </w:rPr>
+        <w:t>Serrer et re-vérifier :</w:t>
+      </w:r>
+      <w:r>
+        <w:rPr>
+          <w:b w:val="0"/>
+        </w:rPr>
+        <w:t xml:space="preserve"> serrer les fixations puis revérifier la mire (serrer une vis fait souvent bouger la caméra). Noter les valeurs (section 2.7).</w:t>
+      </w:r>
+    </w:p>
+    <w:p>
+      <w:pPr>
+        <w:pStyle w:val="Heading2"/>
+        <w:spacing w:after="150" w:before="300"/>
+      </w:pPr>
+      <w:r>
+        <w:t>2.5 Les trois contrôles de la mire</w:t>
+      </w:r>
+    </w:p>
+    <w:p>
+      <w:pPr>
+        <w:spacing w:after="120"/>
+      </w:pPr>
+      <w:r>
+        <w:rPr>
+          <w:b/>
+        </w:rPr>
+        <w:t>Contrôle A — la POSITION</w:t>
+      </w:r>
+    </w:p>
+    <w:p>
+      <w:pPr>
+        <w:pStyle w:val="ListParagraph"/>
+        <w:numPr>
+          <w:ilvl w:val="0"/>
+          <w:numId w:val="2"/>
+        </w:numPr>
+        <w:spacing w:after="60"/>
+      </w:pPr>
+      <w:r>
+        <w:rPr/>
+        <w:t>La table doit être centrée sur la croix.</w:t>
+      </w:r>
+    </w:p>
+    <w:p>
+      <w:pPr>
+        <w:pStyle w:val="ListParagraph"/>
+        <w:numPr>
+          <w:ilvl w:val="0"/>
+          <w:numId w:val="2"/>
+        </w:numPr>
+        <w:spacing w:after="60"/>
+      </w:pPr>
+      <w:r>
+        <w:rPr/>
+        <w:t>Les bords de la table (rails marron, côté zone) doivent coïncider avec les bords du cadre vert. Trop petite dans le cadre : descendre la caméra ; trop grande (cadre rouge) : la monter.</w:t>
+      </w:r>
+    </w:p>
+    <w:p>
+      <w:pPr>
+        <w:pStyle w:val="ListParagraph"/>
+        <w:numPr>
+          <w:ilvl w:val="0"/>
+          <w:numId w:val="2"/>
+        </w:numPr>
+        <w:spacing w:after="60"/>
+      </w:pPr>
+      <w:r>
+        <w:rPr/>
+        <w:t>Sur Mac, les marqueurs déjà collés doivent apparaître entourés avec le bon numéro.</w:t>
+      </w:r>
+    </w:p>
+    <w:p>
+      <w:pPr>
+        <w:spacing w:after="120"/>
+      </w:pPr>
+      <w:r>
+        <w:rPr>
+          <w:b/>
+        </w:rPr>
+        <w:t>Contrôle B — l'ORIENTATION (la caméra est-elle de travers ?)</w:t>
+      </w:r>
+    </w:p>
+    <w:p>
+      <w:pPr>
+        <w:pStyle w:val="ListParagraph"/>
+        <w:numPr>
+          <w:ilvl w:val="0"/>
+          <w:numId w:val="2"/>
+        </w:numPr>
+        <w:spacing w:after="60"/>
+      </w:pPr>
+      <w:r>
+        <w:rPr/>
+        <w:t>Les deux grands rails de la table doivent être parallèles aux bords gauche et droit du cadre vert.</w:t>
+      </w:r>
+    </w:p>
+    <w:p>
+      <w:pPr>
+        <w:pStyle w:val="ListParagraph"/>
+        <w:numPr>
+          <w:ilvl w:val="0"/>
+          <w:numId w:val="2"/>
+        </w:numPr>
+        <w:spacing w:after="60"/>
+      </w:pPr>
+      <w:r>
+        <w:rPr/>
+        <w:t>Si ce n'est pas le cas : augmenter ou diminuer « Rotation du cadre » jusqu'à ce que le cadre vert soit parallèle aux rails. L'angle affiché est de combien la caméra est tournée : tournez la caméra de cet angle, puis remettez la rotation du cadre à 0.</w:t>
+      </w:r>
+    </w:p>
+    <w:p>
+      <w:pPr>
+        <w:pStyle w:val="ListParagraph"/>
+        <w:numPr>
+          <w:ilvl w:val="0"/>
+          <w:numId w:val="2"/>
+        </w:numPr>
+        <w:spacing w:after="60"/>
+      </w:pPr>
+      <w:r>
+        <w:rPr/>
+        <w:t>Image à l'envers ou couchée : choisir la bonne « Orientation de l'image » (ou tourner physiquement la caméra).</w:t>
+      </w:r>
+    </w:p>
+    <w:p>
+      <w:pPr>
+        <w:spacing w:after="120"/>
+      </w:pPr>
+      <w:r>
+        <w:rPr>
+          <w:b/>
+        </w:rPr>
+        <w:t>Contrôle C — l'INCLINAISON (la caméra est-elle penchée comme prévu ?)</w:t>
+      </w:r>
+    </w:p>
+    <w:p>
+      <w:pPr>
+        <w:pStyle w:val="ListParagraph"/>
+        <w:numPr>
+          <w:ilvl w:val="0"/>
+          <w:numId w:val="2"/>
+        </w:numPr>
+        <w:spacing w:after="60"/>
+      </w:pPr>
+      <w:r>
+        <w:rPr/>
+        <w:t>Caméra 2 (centre, bleue) : verticale, 0°. Le cadre vert doit rester un rectangle.</w:t>
+      </w:r>
+    </w:p>
+    <w:p>
+      <w:pPr>
+        <w:pStyle w:val="ListParagraph"/>
+        <w:numPr>
+          <w:ilvl w:val="0"/>
+          <w:numId w:val="2"/>
+        </w:numPr>
+        <w:spacing w:after="60"/>
+      </w:pPr>
+      <w:r>
+        <w:rPr/>
+        <w:t>Caméras 1 et 3 (de chaque côté) : environ 4° vers le bout de la table (voir section 1). Le cadre vert devient un trapèze : le bord le plus éloigné de la caméra paraît plus court. Le texte d'état donne le rapport entre les deux bords (par exemple « bord haut = 93 % du bord bas » à 4°).</w:t>
+      </w:r>
+    </w:p>
+    <w:p>
+      <w:pPr>
+        <w:pStyle w:val="ListParagraph"/>
+        <w:numPr>
+          <w:ilvl w:val="0"/>
+          <w:numId w:val="2"/>
+        </w:numPr>
+        <w:spacing w:after="60"/>
+      </w:pPr>
+      <w:r>
+        <w:rPr/>
+        <w:t>Régler « Inclinaison de la caméra » jusqu'à ce que le trapèze vert colle aux bords réels de la table : la valeur obtenue est l'inclinaison réelle de la caméra. Elle doit être proche de la valeur prévue.</w:t>
+      </w:r>
+    </w:p>
+    <w:p>
+      <w:pPr>
+        <w:pStyle w:val="Heading2"/>
+        <w:spacing w:after="150" w:before="300"/>
+      </w:pPr>
+      <w:r>
+        <w:t>2.6 Chaque installation est unique</w:t>
+      </w:r>
+    </w:p>
+    <w:p>
+      <w:pPr>
+        <w:spacing w:after="120"/>
+      </w:pPr>
+      <w:r>
+        <w:rPr/>
+        <w:t>Les valeurs de ce manuel (120 cm de hauteur, 97 cm entre les caméras, environ 4° d'inclinaison, zones de 130 / 97 / 130 cm, distances des marqueurs) correspondent à l'installation de référence : une table de 357 × 178 cm avec des caméras à 120 cm. Elles servent de valeurs de départ. La seule donnée qui ne change jamais est le NOMBRE de caméras : 3. Pour une autre salle ou une autre table, on refait les calculs ci-dessous, puis on contrôle le résultat avec la mire.</w:t>
+      </w:r>
+    </w:p>
+    <w:p>
+      <w:pPr>
+        <w:pStyle w:val="ListParagraph"/>
+        <w:numPr>
+          <w:ilvl w:val="0"/>
+          <w:numId w:val="2"/>
+        </w:numPr>
+        <w:spacing w:after="60"/>
+      </w:pPr>
+      <w:r>
+        <w:rPr/>
+        <w:t>Mesurer : la hauteur réelle des caméras au-dessus du tapis, la distance entre les caméras, et les dimensions de la table (longueur × largeur du tapis).</w:t>
+      </w:r>
+    </w:p>
+    <w:p>
+      <w:pPr>
+        <w:pStyle w:val="ListParagraph"/>
+        <w:numPr>
+          <w:ilvl w:val="0"/>
+          <w:numId w:val="2"/>
+        </w:numPr>
+        <w:spacing w:after="60"/>
+      </w:pPr>
+      <w:r>
+        <w:rPr/>
+        <w:t>Hauteur minimale : avec un objectif de 100° (diagonale), il faut environ 86 cm de hauteur pour voir toute la largeur de 178 cm. Plus la caméra est haute, plus la zone vue est grande mais plus les billes sont petites dans l'image. La mire le dit tout de suite : cadre vert = ça rentre, cadre rouge = trop grand.</w:t>
+      </w:r>
+    </w:p>
+    <w:p>
+      <w:pPr>
+        <w:pStyle w:val="ListParagraph"/>
+        <w:numPr>
+          <w:ilvl w:val="0"/>
+          <w:numId w:val="2"/>
+        </w:numPr>
+        <w:spacing w:after="60"/>
+      </w:pPr>
+      <w:r>
+        <w:rPr/>
+        <w:t>Zones : la table est partagée entre les 3 caméras (zone du bout baulk, zone du centre, zone du bout noire) avec un léger recouvrement. Les longueurs de zone changent si la table ou l'écartement des caméras change.</w:t>
+      </w:r>
+    </w:p>
+    <w:p>
+      <w:pPr>
+        <w:pStyle w:val="ListParagraph"/>
+        <w:numPr>
+          <w:ilvl w:val="0"/>
+          <w:numId w:val="2"/>
+        </w:numPr>
+        <w:spacing w:after="60"/>
+      </w:pPr>
+      <w:r>
+        <w:rPr/>
+        <w:t>Inclinaison des caméras 1 et 3 : angle ≈ arctan(écart ÷ hauteur), où « écart » est la distance horizontale entre la caméra et le centre de la zone qu'elle doit voir. Exemple : 16,5 cm d'écart à 120 cm donne environ 8° ; à 130 cm de hauteur l'angle est un peu plus petit.</w:t>
+      </w:r>
+    </w:p>
+    <w:p>
+      <w:pPr>
+        <w:pStyle w:val="ListParagraph"/>
+        <w:numPr>
+          <w:ilvl w:val="0"/>
+          <w:numId w:val="2"/>
+        </w:numPr>
+        <w:spacing w:after="60"/>
+      </w:pPr>
+      <w:r>
+        <w:rPr/>
+        <w:t>Positions des marqueurs : toujours mesurées à partir de la poche du milieu (centre de la table). Les distances de la section 3.4 sont à recalculer pour la nouvelle table et les nouvelles zones, puis le décalage d est remesuré.</w:t>
+      </w:r>
+    </w:p>
+    <w:p>
+      <w:pPr>
+        <w:pStyle w:val="ListParagraph"/>
+        <w:numPr>
+          <w:ilvl w:val="0"/>
+          <w:numId w:val="2"/>
+        </w:numPr>
+        <w:spacing w:after="60"/>
+      </w:pPr>
+      <w:r>
+        <w:rPr/>
+        <w:t>Contrôler : ouvrir la mire de chaque caméra, saisir la hauteur réelle, régler l'inclinaison jusqu'à coller aux bords de la table (contrôles A, B, C), puis calibrer.</w:t>
+      </w:r>
+    </w:p>
+    <w:p>
+      <w:pPr>
+        <w:spacing w:after="120"/>
+      </w:pPr>
+      <w:r>
+        <w:rPr/>
+        <w:t>Important : une calibration n'est valable que pour l'installation sur laquelle elle a été faite. Si une caméra est déplacée, changée de hauteur ou d'angle, ou si le logiciel est installé dans une autre salle, refaire la mire puis la calibration.</w:t>
+      </w:r>
+    </w:p>
+    <w:p>
+      <w:pPr>
+        <w:pStyle w:val="Heading2"/>
+        <w:spacing w:after="150" w:before="300"/>
+      </w:pPr>
+      <w:r>
+        <w:t>2.7 Valeurs à noter pour chaque caméra</w:t>
+      </w:r>
+    </w:p>
+    <w:p>
+      <w:pPr>
+        <w:pStyle w:val="ListParagraph"/>
+        <w:numPr>
+          <w:ilvl w:val="0"/>
+          <w:numId w:val="2"/>
+        </w:numPr>
+        <w:spacing w:after="60"/>
+      </w:pPr>
+      <w:r>
+        <w:t>Hauteur mesurée, inclinaison obtenue, rotation éventuelle, orientation de l'image choisie, index de la caméra.</w:t>
+      </w:r>
+    </w:p>
+    <w:p>
+      <w:pPr>
+        <w:pStyle w:val="ListParagraph"/>
+        <w:numPr>
+          <w:ilvl w:val="0"/>
+          <w:numId w:val="2"/>
+        </w:numPr>
+        <w:spacing w:after="60"/>
+      </w:pPr>
+      <w:r>
+        <w:t>Ces valeurs servent à la calibration (partie 3) et au dépannage ; une fiche à remplir est fournie dans guide_positionnement_cameras_mire.pdf.</w:t>
+      </w:r>
+    </w:p>
+    <w:p>
+      <w:pPr>
+        <w:spacing w:after="120"/>
+      </w:pPr>
+      <w:r>
+        <w:t>Quand la mire est bonne pour les 3 caméras, passer à la calibration (partie 3).</w:t>
+      </w:r>
+    </w:p>
+    <w:p>
+      <w:pPr>
+        <w:pStyle w:val="Heading1"/>
+        <w:spacing w:after="150" w:before="300"/>
+        <w:pageBreakBefore/>
+      </w:pPr>
+      <w:r>
+        <w:t>3. Calibration par marqueurs</w:t>
+      </w:r>
+    </w:p>
+    <w:p>
+      <w:pPr>
+        <w:spacing w:after="120"/>
+      </w:pPr>
+      <w:r>
+        <w:t>Une fois les 3 caméras positionnées, on colle 10 marqueurs ArUco sur la bordure (rail marron) de la table, puis on lance la calibration de chaque caméra.</w:t>
+      </w:r>
+    </w:p>
+    <w:p>
+      <w:pPr>
+        <w:pStyle w:val="Heading2"/>
+        <w:spacing w:after="150" w:before="300"/>
+      </w:pPr>
+      <w:r>
+        <w:t>3.1 Schéma des marqueurs</w:t>
       </w:r>
     </w:p>
     <w:p>
@@ -123,743 +1287,16 @@
         <w:spacing w:after="120"/>
       </w:pPr>
       <w:r>
-        <w:t>Les 3 caméras sont alignées avec le point marron (caméra 1), le point bleu (caméra 2) et un point situé à 105 cm du bleu vers la noire (caméra 3) : voir le guide de positionnement. Jaune et verte sont de part et d'autre de la ligne centrale, à la même position que marron (ligne de baulk). Les 10 marqueurs ArUco sont collés sur la bordure de la table (le rail marron), aux positions du schéma et du tableau de la section 12.</w:t>
-      </w:r>
-    </w:p>
-    <w:p>
-      <w:pPr>
-        <w:pStyle w:val="Heading1"/>
+        <w:t>Les 10 marqueurs ArUco sont collés sur la bordure de la table (le rail marron), aux positions du schéma et du tableau de la section 3.4. Jaune et verte sont de part et d'autre de la ligne centrale, à la même position que marron (ligne de baulk).</w:t>
+      </w:r>
+    </w:p>
+    <w:p>
+      <w:pPr>
+        <w:pStyle w:val="Heading2"/>
         <w:spacing w:after="150" w:before="300"/>
       </w:pPr>
       <w:r>
-        <w:t xml:space="preserve">3. Quand faire cette calibration</w:t>
-      </w:r>
-    </w:p>
-    <w:p>
-      <w:pPr>
-        <w:pStyle w:val="ListParagraph"/>
-        <w:numPr>
-          <w:ilvl w:val="0"/>
-          <w:numId w:val="2"/>
-        </w:numPr>
-        <w:spacing w:after="60"/>
-      </w:pPr>
-      <w:r>
-        <w:t xml:space="preserve">À l'installation initiale des caméras.</w:t>
-      </w:r>
-    </w:p>
-    <w:p>
-      <w:pPr>
-        <w:pStyle w:val="ListParagraph"/>
-        <w:numPr>
-          <w:ilvl w:val="0"/>
-          <w:numId w:val="2"/>
-        </w:numPr>
-        <w:spacing w:after="60"/>
-      </w:pPr>
-      <w:r>
-        <w:t xml:space="preserve">Si une caméra a bougé (choc, démontage, remplacement).</w:t>
-      </w:r>
-    </w:p>
-    <w:p>
-      <w:pPr>
-        <w:spacing w:after="120"/>
-      </w:pPr>
-      <w:r>
-        <w:rPr>
-          <w:b/>
-          <w:bCs/>
-        </w:rPr>
-        <w:t xml:space="preserve">Pas besoin de refaire cette calibration entre deux parties, ni après avoir éteint/rallumé le système.</w:t>
-      </w:r>
-    </w:p>
-    <w:p>
-      <w:pPr>
-        <w:pStyle w:val="Heading1"/>
-        <w:spacing w:after="150" w:before="300"/>
-      </w:pPr>
-      <w:r>
-        <w:t xml:space="preserve">4. Matériel nécessaire</w:t>
-      </w:r>
-    </w:p>
-    <w:p>
-      <w:pPr>
-        <w:pStyle w:val="ListParagraph"/>
-        <w:numPr>
-          <w:ilvl w:val="0"/>
-          <w:numId w:val="2"/>
-        </w:numPr>
-        <w:spacing w:after="60"/>
-      </w:pPr>
-      <w:r>
-        <w:t xml:space="preserve">Un ordinateur avec le programme installé (Visual Studio + OpenCV + module ArUco/opencv_contrib).</w:t>
-      </w:r>
-    </w:p>
-    <w:p>
-      <w:pPr>
-        <w:pStyle w:val="ListParagraph"/>
-        <w:numPr>
-          <w:ilvl w:val="0"/>
-          <w:numId w:val="2"/>
-        </w:numPr>
-        <w:spacing w:after="60"/>
-      </w:pPr>
-      <w:r>
-        <w:t xml:space="preserve">Une imprimante.</w:t>
-      </w:r>
-    </w:p>
-    <w:p>
-      <w:pPr>
-        <w:pStyle w:val="ListParagraph"/>
-        <w:numPr>
-          <w:ilvl w:val="0"/>
-          <w:numId w:val="2"/>
-        </w:numPr>
-        <w:spacing w:after="60"/>
-      </w:pPr>
-      <w:r>
-        <w:t xml:space="preserve">Du ruban adhésif ou de la colle repositionnable.</w:t>
-      </w:r>
-    </w:p>
-    <w:p>
-      <w:pPr>
-        <w:pStyle w:val="ListParagraph"/>
-        <w:numPr>
-          <w:ilvl w:val="0"/>
-          <w:numId w:val="2"/>
-        </w:numPr>
-        <w:spacing w:after="60"/>
-      </w:pPr>
-      <w:r>
-        <w:t xml:space="preserve">Les 3 caméras déjà fixées à 1,20 m au-dessus de la table.</w:t>
-      </w:r>
-    </w:p>
-    <w:p>
-      <w:pPr>
-        <w:pStyle w:val="ListParagraph"/>
-        <w:numPr>
-          <w:ilvl w:val="0"/>
-          <w:numId w:val="2"/>
-        </w:numPr>
-        <w:spacing w:after="60"/>
-      </w:pPr>
-      <w:r>
-        <w:t>Un mètre ruban, du ruban adhésif de peintre et 3 billes repères (pour viser les points de la table : voir le guide de positionnement).</w:t>
-      </w:r>
-    </w:p>
-    <w:p>
-      <w:pPr>
-        <w:pStyle w:val="Heading1"/>
-      </w:pPr>
-      <w:r>
-        <w:rPr/>
-        <w:t>5. Étape 1 — Positionner et orienter les caméras avec la mire</w:t>
-      </w:r>
-    </w:p>
-    <w:p>
-      <w:pPr>
-        <w:spacing w:after="120"/>
-      </w:pPr>
-      <w:r>
-        <w:rPr>
-          <w:b/>
-        </w:rPr>
-        <w:t>Pour poser et orienter les 3 caméras pas à pas, avec les 3 points à viser sur la table (point bleu pour la caméra 2, et un point à 105 cm du bleu de chaque côté pour les caméras 1 et 3), utilisez le guide guide_positionnement_cameras_mire.pdf : à faire AVANT de coller les marqueurs et de calibrer.</w:t>
-      </w:r>
-    </w:p>
-    <w:p>
-      <w:pPr>
-        <w:spacing w:after="120"/>
-      </w:pPr>
-      <w:r>
-        <w:rPr/>
-        <w:t>Le logiciel contient une « mire » : un aperçu en direct de la caméra, avec des repères dessinés par-dessus. Elle permet de vérifier, SANS marqueur et SANS calibration, que la caméra est bien placée, bien orientée et bien inclinée au-dessus de la table. À faire pour chaque caméra, juste après sa fixation, et à refaire si une caméra a bougé.</w:t>
-      </w:r>
-    </w:p>
-    <w:p>
-      <w:pPr>
-        <w:spacing w:after="120"/>
-      </w:pPr>
-      <w:r>
-        <w:rPr>
-          <w:b/>
-        </w:rPr>
-        <w:t>Ouvrir la mire</w:t>
-      </w:r>
-    </w:p>
-    <w:p>
-      <w:pPr>
-        <w:pStyle w:val="ListParagraph"/>
-        <w:numPr>
-          <w:ilvl w:val="0"/>
-          <w:numId w:val="2"/>
-        </w:numPr>
-        <w:spacing w:after="60"/>
-      </w:pPr>
-      <w:r>
-        <w:rPr/>
-        <w:t>Dans le logiciel : Paramètres &gt; Caméra, puis le bouton « Mire... » à côté de la caméra concernée (le bouton n'est actif que si la caméra est détectée).</w:t>
-      </w:r>
-    </w:p>
-    <w:p>
-      <w:pPr>
-        <w:pStyle w:val="ListParagraph"/>
-        <w:numPr>
-          <w:ilvl w:val="0"/>
-          <w:numId w:val="2"/>
-        </w:numPr>
-        <w:spacing w:after="60"/>
-      </w:pPr>
-      <w:r>
-        <w:rPr/>
-        <w:t>La caméra doit être libre : si un suivi caméra est en cours ou si un autre programme l'utilise, fermez-le puis rouvrez la mire.</w:t>
-      </w:r>
-    </w:p>
-    <w:p>
-      <w:pPr>
-        <w:pStyle w:val="ListParagraph"/>
-        <w:numPr>
-          <w:ilvl w:val="0"/>
-          <w:numId w:val="2"/>
-        </w:numPr>
-        <w:spacing w:after="60"/>
-      </w:pPr>
-      <w:r>
-        <w:rPr/>
-        <w:t>Les réglages sont mémorisés pour la prochaine ouverture (hauteur, champ de vision, orientation, inclinaison).</w:t>
-      </w:r>
-    </w:p>
-    <w:p>
-      <w:pPr>
-        <w:spacing w:after="120"/>
-      </w:pPr>
-      <w:r>
-        <w:rPr>
-          <w:b/>
-        </w:rPr>
-        <w:t>Ce que l'on voit à l'écran</w:t>
-      </w:r>
-    </w:p>
-    <w:p>
-      <w:pPr>
-        <w:pStyle w:val="ListParagraph"/>
-        <w:numPr>
-          <w:ilvl w:val="0"/>
-          <w:numId w:val="2"/>
-        </w:numPr>
-        <w:spacing w:after="60"/>
-      </w:pPr>
-      <w:r>
-        <w:rPr/>
-        <w:t>Une croix et trois cercles au centre de l'image, plus une grille en tiers : ils servent à centrer la table.</w:t>
-      </w:r>
-    </w:p>
-    <w:p>
-      <w:pPr>
-        <w:pStyle w:val="ListParagraph"/>
-        <w:numPr>
-          <w:ilvl w:val="0"/>
-          <w:numId w:val="2"/>
-        </w:numPr>
-        <w:spacing w:after="60"/>
-      </w:pPr>
-      <w:r>
-        <w:rPr/>
-        <w:t>Un cadre VERT = l'endroit où doivent tomber les bords de la table pour cette caméra : 178 cm de large, et la longueur de la zone (130 cm pour les caméras 1 et 3, 97 cm pour la caméra 2). Le cadre devient ROUGE s'il ne rentre pas entièrement dans l'image : monter la caméra ou vérifier la hauteur saisie.</w:t>
-      </w:r>
-    </w:p>
-    <w:p>
-      <w:pPr>
-        <w:pStyle w:val="ListParagraph"/>
-        <w:numPr>
-          <w:ilvl w:val="0"/>
-          <w:numId w:val="2"/>
-        </w:numPr>
-        <w:spacing w:after="60"/>
-      </w:pPr>
-      <w:r>
-        <w:rPr/>
-        <w:t>Sur Mac uniquement : les marqueurs reconnus sont entourés avec leur numéro (ceux attendus pour cette caméra en vert). Sous Windows, cette partie n'est pas disponible.</w:t>
-      </w:r>
-    </w:p>
-    <w:p>
-      <w:pPr>
-        <w:spacing w:after="120"/>
-      </w:pPr>
-      <w:r>
-        <w:rPr/>
-      </w:r>
-      <w:r>
-        <w:drawing>
-          <wp:inline xmlns:a="http://schemas.openxmlformats.org/drawingml/2006/main" xmlns:pic="http://schemas.openxmlformats.org/drawingml/2006/picture">
-            <wp:extent cx="5580000" cy="4073400"/>
-            <wp:docPr id="2" name="Picture 2"/>
-            <wp:cNvGraphicFramePr>
-              <a:graphicFrameLocks noChangeAspect="1"/>
-            </wp:cNvGraphicFramePr>
-            <a:graphic>
-              <a:graphicData uri="http://schemas.openxmlformats.org/drawingml/2006/picture">
-                <pic:pic>
-                  <pic:nvPicPr>
-                    <pic:cNvPr id="0" name="mire_tilt_crop.png"/>
-                    <pic:cNvPicPr/>
-                  </pic:nvPicPr>
-                  <pic:blipFill>
-                    <a:blip r:embed="rId11"/>
-                    <a:stretch>
-                      <a:fillRect/>
-                    </a:stretch>
-                  </pic:blipFill>
-                  <pic:spPr>
-                    <a:xfrm>
-                      <a:off x="0" y="0"/>
-                      <a:ext cx="5580000" cy="4073400"/>
-                    </a:xfrm>
-                    <a:prstGeom prst="rect"/>
-                  </pic:spPr>
-                </pic:pic>
-              </a:graphicData>
-            </a:graphic>
-          </wp:inline>
-        </w:drawing>
-      </w:r>
-    </w:p>
-    <w:p>
-      <w:pPr>
-        <w:spacing w:after="120"/>
-      </w:pPr>
-      <w:r>
-        <w:rPr/>
-        <w:t>Exemple : mire de la caméra d'index 0 (caméra 1), inclinée de 4°. Le cadre vert est un trapèze car la caméra est penchée. (L'image est noire ici car l'objectif était couvert pendant la prise de vue.)</w:t>
-      </w:r>
-    </w:p>
-    <w:p>
-      <w:pPr>
-        <w:spacing w:after="120"/>
-      </w:pPr>
-      <w:r>
-        <w:rPr>
-          <w:b/>
-        </w:rPr>
-        <w:t>Les réglages</w:t>
-      </w:r>
-    </w:p>
-    <w:p>
-      <w:pPr>
-        <w:pStyle w:val="ListParagraph"/>
-        <w:numPr>
-          <w:ilvl w:val="0"/>
-          <w:numId w:val="2"/>
-        </w:numPr>
-        <w:spacing w:after="60"/>
-      </w:pPr>
-      <w:r>
-        <w:rPr/>
-        <w:t>Hauteur de la caméra (cm) : la hauteur réelle, mesurée au mètre (120 cm par défaut, bord bas des abat-jour). Le cadre vert est calculé avec cette valeur.</w:t>
-      </w:r>
-    </w:p>
-    <w:p>
-      <w:pPr>
-        <w:pStyle w:val="ListParagraph"/>
-        <w:numPr>
-          <w:ilvl w:val="0"/>
-          <w:numId w:val="2"/>
-        </w:numPr>
-        <w:spacing w:after="60"/>
-      </w:pPr>
-      <w:r>
-        <w:rPr/>
-        <w:t>Champ de vision (degrés, diagonale) : 100° par défaut, comme les caméras ELP prévues.</w:t>
-      </w:r>
-    </w:p>
-    <w:p>
-      <w:pPr>
-        <w:pStyle w:val="ListParagraph"/>
-        <w:numPr>
-          <w:ilvl w:val="0"/>
-          <w:numId w:val="2"/>
-        </w:numPr>
-        <w:spacing w:after="60"/>
-      </w:pPr>
-      <w:r>
-        <w:rPr/>
-        <w:t>Orientation de l'image : normale, tournée de 90° (horaire ou anti-horaire), ou à l'envers (180°). Sert à remettre l'image à l'endroit si la caméra est montée de travers ou à l'envers.</w:t>
-      </w:r>
-    </w:p>
-    <w:p>
-      <w:pPr>
-        <w:pStyle w:val="ListParagraph"/>
-        <w:numPr>
-          <w:ilvl w:val="0"/>
-          <w:numId w:val="2"/>
-        </w:numPr>
-        <w:spacing w:after="60"/>
-      </w:pPr>
-      <w:r>
-        <w:rPr/>
-        <w:t>Rotation du cadre (degrés) : tourne le cadre vert d'un petit angle (−45° à +45°, pas de 0,5°).</w:t>
-      </w:r>
-    </w:p>
-    <w:p>
-      <w:pPr>
-        <w:pStyle w:val="ListParagraph"/>
-        <w:numPr>
-          <w:ilvl w:val="0"/>
-          <w:numId w:val="2"/>
-        </w:numPr>
-        <w:spacing w:after="60"/>
-      </w:pPr>
-      <w:r>
-        <w:rPr/>
-        <w:t>Inclinaison de la caméra (degrés) : penche le cadre vert comme le verrait une caméra inclinée (−20° à +20°, pas de 0,5° ; le signe + penche vers le haut de l'image).</w:t>
-      </w:r>
-    </w:p>
-    <w:p>
-      <w:pPr>
-        <w:spacing w:after="120"/>
-      </w:pPr>
-      <w:r>
-        <w:rPr>
-          <w:b/>
-        </w:rPr>
-        <w:t>Contrôle A — la POSITION</w:t>
-      </w:r>
-    </w:p>
-    <w:p>
-      <w:pPr>
-        <w:pStyle w:val="ListParagraph"/>
-        <w:numPr>
-          <w:ilvl w:val="0"/>
-          <w:numId w:val="2"/>
-        </w:numPr>
-        <w:spacing w:after="60"/>
-      </w:pPr>
-      <w:r>
-        <w:rPr/>
-        <w:t>La table doit être centrée sur la croix.</w:t>
-      </w:r>
-    </w:p>
-    <w:p>
-      <w:pPr>
-        <w:pStyle w:val="ListParagraph"/>
-        <w:numPr>
-          <w:ilvl w:val="0"/>
-          <w:numId w:val="2"/>
-        </w:numPr>
-        <w:spacing w:after="60"/>
-      </w:pPr>
-      <w:r>
-        <w:rPr/>
-        <w:t>Les bords de la table (rails marron, côté zone) doivent coïncider avec les bords du cadre vert. Trop petite dans le cadre : descendre la caméra ; trop grande (cadre rouge) : la monter.</w:t>
-      </w:r>
-    </w:p>
-    <w:p>
-      <w:pPr>
-        <w:pStyle w:val="ListParagraph"/>
-        <w:numPr>
-          <w:ilvl w:val="0"/>
-          <w:numId w:val="2"/>
-        </w:numPr>
-        <w:spacing w:after="60"/>
-      </w:pPr>
-      <w:r>
-        <w:rPr/>
-        <w:t>Sur Mac, les marqueurs déjà collés doivent apparaître entourés avec le bon numéro.</w:t>
-      </w:r>
-    </w:p>
-    <w:p>
-      <w:pPr>
-        <w:spacing w:after="120"/>
-      </w:pPr>
-      <w:r>
-        <w:rPr>
-          <w:b/>
-        </w:rPr>
-        <w:t>Contrôle B — l'ORIENTATION (la caméra est-elle de travers ?)</w:t>
-      </w:r>
-    </w:p>
-    <w:p>
-      <w:pPr>
-        <w:pStyle w:val="ListParagraph"/>
-        <w:numPr>
-          <w:ilvl w:val="0"/>
-          <w:numId w:val="2"/>
-        </w:numPr>
-        <w:spacing w:after="60"/>
-      </w:pPr>
-      <w:r>
-        <w:rPr/>
-        <w:t>Les deux grands rails de la table doivent être parallèles aux bords gauche et droit du cadre vert.</w:t>
-      </w:r>
-    </w:p>
-    <w:p>
-      <w:pPr>
-        <w:pStyle w:val="ListParagraph"/>
-        <w:numPr>
-          <w:ilvl w:val="0"/>
-          <w:numId w:val="2"/>
-        </w:numPr>
-        <w:spacing w:after="60"/>
-      </w:pPr>
-      <w:r>
-        <w:rPr/>
-        <w:t>Si ce n'est pas le cas : augmenter ou diminuer « Rotation du cadre » jusqu'à ce que le cadre vert soit parallèle aux rails. L'angle affiché est de combien la caméra est tournée : tournez la caméra de cet angle, puis remettez la rotation du cadre à 0.</w:t>
-      </w:r>
-    </w:p>
-    <w:p>
-      <w:pPr>
-        <w:pStyle w:val="ListParagraph"/>
-        <w:numPr>
-          <w:ilvl w:val="0"/>
-          <w:numId w:val="2"/>
-        </w:numPr>
-        <w:spacing w:after="60"/>
-      </w:pPr>
-      <w:r>
-        <w:rPr/>
-        <w:t>Image à l'envers ou couchée : choisir la bonne « Orientation de l'image » (ou tourner physiquement la caméra).</w:t>
-      </w:r>
-    </w:p>
-    <w:p>
-      <w:pPr>
-        <w:spacing w:after="120"/>
-      </w:pPr>
-      <w:r>
-        <w:rPr>
-          <w:b/>
-        </w:rPr>
-        <w:t>Contrôle C — l'INCLINAISON (la caméra est-elle penchée comme prévu ?)</w:t>
-      </w:r>
-    </w:p>
-    <w:p>
-      <w:pPr>
-        <w:pStyle w:val="ListParagraph"/>
-        <w:numPr>
-          <w:ilvl w:val="0"/>
-          <w:numId w:val="2"/>
-        </w:numPr>
-        <w:spacing w:after="60"/>
-      </w:pPr>
-      <w:r>
-        <w:rPr/>
-        <w:t>Caméra 2 (centre, bleue) : verticale, 0°. Le cadre vert doit rester un rectangle.</w:t>
-      </w:r>
-    </w:p>
-    <w:p>
-      <w:pPr>
-        <w:pStyle w:val="ListParagraph"/>
-        <w:numPr>
-          <w:ilvl w:val="0"/>
-          <w:numId w:val="2"/>
-        </w:numPr>
-        <w:spacing w:after="60"/>
-      </w:pPr>
-      <w:r>
-        <w:rPr/>
-        <w:t>Caméras 1 et 3 (de chaque côté) : environ 4° vers le bout de la table (voir section 1). Le cadre vert devient un trapèze : le bord le plus éloigné de la caméra paraît plus court. Le texte d'état donne le rapport entre les deux bords (par exemple « bord haut = 93 % du bord bas » à 4°).</w:t>
-      </w:r>
-    </w:p>
-    <w:p>
-      <w:pPr>
-        <w:pStyle w:val="ListParagraph"/>
-        <w:numPr>
-          <w:ilvl w:val="0"/>
-          <w:numId w:val="2"/>
-        </w:numPr>
-        <w:spacing w:after="60"/>
-      </w:pPr>
-      <w:r>
-        <w:rPr/>
-        <w:t>Régler « Inclinaison de la caméra » jusqu'à ce que le trapèze vert colle aux bords réels de la table : la valeur obtenue est l'inclinaison réelle de la caméra. Elle doit être proche de la valeur prévue.</w:t>
-      </w:r>
-    </w:p>
-    <w:p>
-      <w:pPr>
-        <w:pStyle w:val="ListParagraph"/>
-        <w:numPr>
-          <w:ilvl w:val="0"/>
-          <w:numId w:val="2"/>
-        </w:numPr>
-        <w:spacing w:after="60"/>
-      </w:pPr>
-      <w:r>
-        <w:rPr/>
-        <w:t>Remarque : avec 97 cm entre les caméras et des zones centrées à 113,5 cm de la bille bleue, le calcul géométrique à 120 cm de hauteur donne plutôt environ 8° que 4°. La mire permet de trancher au premier test : notez la valeur réellement obtenue dans la fiche de test.</w:t>
-      </w:r>
-    </w:p>
-    <w:p>
-      <w:pPr>
-        <w:spacing w:after="120"/>
-      </w:pPr>
-      <w:r>
-        <w:rPr>
-          <w:b/>
-        </w:rPr>
-        <w:t>Chaque installation est unique : comment recalculer</w:t>
-      </w:r>
-    </w:p>
-    <w:p>
-      <w:pPr>
-        <w:spacing w:after="120"/>
-      </w:pPr>
-      <w:r>
-        <w:rPr/>
-        <w:t>Les valeurs de ce manuel (120 cm de hauteur, 97 cm entre les caméras, environ 4° d'inclinaison, zones de 130 / 97 / 130 cm, distances des marqueurs) correspondent à l'installation de référence : une table de 357 × 178 cm avec des caméras à 120 cm. Elles servent de valeurs de départ. La seule donnée qui ne change jamais est le NOMBRE de caméras : 3. Pour une autre salle ou une autre table, on refait les calculs ci-dessous, puis on contrôle le résultat avec la mire.</w:t>
-      </w:r>
-    </w:p>
-    <w:p>
-      <w:pPr>
-        <w:pStyle w:val="ListParagraph"/>
-        <w:numPr>
-          <w:ilvl w:val="0"/>
-          <w:numId w:val="2"/>
-        </w:numPr>
-        <w:spacing w:after="60"/>
-      </w:pPr>
-      <w:r>
-        <w:rPr/>
-        <w:t>Mesurer : la hauteur réelle des caméras au-dessus du tapis, la distance entre les caméras, et les dimensions de la table (longueur × largeur du tapis).</w:t>
-      </w:r>
-    </w:p>
-    <w:p>
-      <w:pPr>
-        <w:pStyle w:val="ListParagraph"/>
-        <w:numPr>
-          <w:ilvl w:val="0"/>
-          <w:numId w:val="2"/>
-        </w:numPr>
-        <w:spacing w:after="60"/>
-      </w:pPr>
-      <w:r>
-        <w:rPr/>
-        <w:t>Hauteur minimale : avec un objectif de 100° (diagonale), il faut environ 86 cm de hauteur pour voir toute la largeur de 178 cm. Plus la caméra est haute, plus la zone vue est grande mais plus les billes sont petites dans l'image. La mire le dit tout de suite : cadre vert = ça rentre, cadre rouge = trop grand.</w:t>
-      </w:r>
-    </w:p>
-    <w:p>
-      <w:pPr>
-        <w:pStyle w:val="ListParagraph"/>
-        <w:numPr>
-          <w:ilvl w:val="0"/>
-          <w:numId w:val="2"/>
-        </w:numPr>
-        <w:spacing w:after="60"/>
-      </w:pPr>
-      <w:r>
-        <w:rPr/>
-        <w:t>Zones : la table est partagée entre les 3 caméras (zone du bout baulk, zone du centre, zone du bout noire) avec un léger recouvrement. Les longueurs de zone changent si la table ou l'écartement des caméras change.</w:t>
-      </w:r>
-    </w:p>
-    <w:p>
-      <w:pPr>
-        <w:pStyle w:val="ListParagraph"/>
-        <w:numPr>
-          <w:ilvl w:val="0"/>
-          <w:numId w:val="2"/>
-        </w:numPr>
-        <w:spacing w:after="60"/>
-      </w:pPr>
-      <w:r>
-        <w:rPr/>
-        <w:t>Inclinaison des caméras 1 et 3 : angle ≈ arctan(écart ÷ hauteur), où « écart » est la distance horizontale entre la caméra et le centre de la zone qu'elle doit voir. Exemple : 16,5 cm d'écart à 120 cm donne environ 8° ; à 130 cm de hauteur l'angle est un peu plus petit.</w:t>
-      </w:r>
-    </w:p>
-    <w:p>
-      <w:pPr>
-        <w:pStyle w:val="ListParagraph"/>
-        <w:numPr>
-          <w:ilvl w:val="0"/>
-          <w:numId w:val="2"/>
-        </w:numPr>
-        <w:spacing w:after="60"/>
-      </w:pPr>
-      <w:r>
-        <w:rPr/>
-        <w:t>Positions des marqueurs : toujours mesurées à partir de la poche du milieu (centre de la table). Les distances de la section 12 sont à recalculer pour la nouvelle table et les nouvelles zones, puis le décalage d est remesuré.</w:t>
-      </w:r>
-    </w:p>
-    <w:p>
-      <w:pPr>
-        <w:pStyle w:val="ListParagraph"/>
-        <w:numPr>
-          <w:ilvl w:val="0"/>
-          <w:numId w:val="2"/>
-        </w:numPr>
-        <w:spacing w:after="60"/>
-      </w:pPr>
-      <w:r>
-        <w:rPr/>
-        <w:t>Contrôler : ouvrir la mire de chaque caméra, saisir la hauteur réelle, régler l'inclinaison jusqu'à coller aux bords de la table (contrôles A, B, C), puis calibrer.</w:t>
-      </w:r>
-    </w:p>
-    <w:p>
-      <w:pPr>
-        <w:spacing w:after="120"/>
-      </w:pPr>
-      <w:r>
-        <w:rPr/>
-        <w:t>Important : une calibration n'est valable que pour l'installation sur laquelle elle a été faite. Si une caméra est déplacée, changée de hauteur ou d'angle, ou si le logiciel est installé dans une autre salle, refaire la mire puis la calibration.</w:t>
-      </w:r>
-    </w:p>
-    <w:p>
-      <w:pPr>
-        <w:spacing w:after="120"/>
-      </w:pPr>
-      <w:r>
-        <w:rPr>
-          <w:b/>
-        </w:rPr>
-        <w:t>À noter pour chaque caméra</w:t>
-      </w:r>
-    </w:p>
-    <w:p>
-      <w:pPr>
-        <w:pStyle w:val="ListParagraph"/>
-        <w:numPr>
-          <w:ilvl w:val="0"/>
-          <w:numId w:val="2"/>
-        </w:numPr>
-        <w:spacing w:after="60"/>
-      </w:pPr>
-      <w:r>
-        <w:rPr/>
-        <w:t>Hauteur mesurée, inclinaison obtenue, rotation éventuelle, orientation de l'image choisie.</w:t>
-      </w:r>
-    </w:p>
-    <w:p>
-      <w:pPr>
-        <w:pStyle w:val="ListParagraph"/>
-        <w:numPr>
-          <w:ilvl w:val="0"/>
-          <w:numId w:val="2"/>
-        </w:numPr>
-        <w:spacing w:after="60"/>
-      </w:pPr>
-      <w:r>
-        <w:rPr/>
-        <w:t>Ces valeurs servent ensuite à la calibration par marqueurs (sections 7 et 8) et au dépannage.</w:t>
-      </w:r>
-    </w:p>
-    <w:p>
-      <w:pPr>
-        <w:pStyle w:val="ListParagraph"/>
-        <w:numPr>
-          <w:ilvl w:val="0"/>
-          <w:numId w:val="2"/>
-        </w:numPr>
-        <w:spacing w:after="60"/>
-      </w:pPr>
-      <w:r>
-        <w:rPr/>
-        <w:t>Quand la mire est bonne pour les 3 caméras : coller les marqueurs (section 7), tester le positionnement avec --check, puis calibrer (section 8).</w:t>
-      </w:r>
-    </w:p>
-    <w:p>
-      <w:pPr>
-        <w:pStyle w:val="Heading1"/>
-        <w:spacing w:after="150" w:before="300"/>
-      </w:pPr>
-      <w:r>
-        <w:t>6. Étape 2 — Générer les 10 marqueurs</w:t>
+        <w:t>3.2 Générer et imprimer les marqueurs</w:t>
       </w:r>
     </w:p>
     <w:p>
@@ -887,16 +1324,43 @@
         <w:spacing w:after="120"/>
       </w:pPr>
       <w:r>
-        <w:t>Crée marker_1.png à marker_10.png. La planche prête à imprimer est le fichier planche_10_marqueurs_aruco_a_imprimer.pdf (section 11) — ou générez-les vous-même avec la commande ci-dessus.</w:t>
-      </w:r>
-    </w:p>
-    <w:p>
-      <w:pPr>
-        <w:pStyle w:val="Heading1"/>
+        <w:t>Crée marker_1.png à marker_10.png. La planche prête à imprimer est le fichier planche_10_marqueurs_aruco_a_imprimer.pdf (voir la planche ci-dessous) — ou générez-les vous-même avec la commande ci-dessus.</w:t>
+      </w:r>
+    </w:p>
+    <w:p>
+      <w:r>
+        <w:br w:type="page"/>
+      </w:r>
+    </w:p>
+    <w:p>
+      <w:pPr>
+        <w:spacing w:after="120"/>
+      </w:pPr>
+      <w:r>
+        <w:rPr>
+          <w:b/>
+          <w:bCs/>
+        </w:rPr>
+        <w:t>La planche est fournie dans le fichier planche_10_marqueurs_aruco_a_imprimer.pdf (2 pages A4, marqueurs de 60 mm). Imprimez-la à 100% / taille réelle (PAS "ajuster à la page") et découpez chaque marqueur en suivant le trait pointillé, en gardant le bord blanc. Pour un premier test avec une seule caméra (caméra 2), seuls les marqueurs 5 et 6 sont nécessaires.</w:t>
+      </w:r>
+    </w:p>
+    <w:p>
+      <w:pPr>
+        <w:spacing w:before="300"/>
+      </w:pPr>
+    </w:p>
+    <w:p>
+      <w:r>
+        <w:br w:type="page"/>
+      </w:r>
+    </w:p>
+    <w:p>
+      <w:pPr>
+        <w:pStyle w:val="Heading2"/>
         <w:spacing w:after="150" w:before="300"/>
       </w:pPr>
       <w:r>
-        <w:t>7. Étape 3 — Coller les marqueurs sur la bordure</w:t>
+        <w:t>3.3 Coller les marqueurs sur la bordure</w:t>
       </w:r>
     </w:p>
     <w:p>
@@ -1038,164 +1502,24 @@
           <w:i/>
           <w:iCs/>
         </w:rPr>
-        <w:t>Important : les marqueurs 5 et 6 sont légèrement décalés de la poche du milieu (quelques cm, notés d) pour ne pas la chevaucher : le 5 (bord haut) à droite de la poche, le 6 (bord bas) à gauche — voir le schéma. Mesurer d à l'installation et le noter (section 12) : l'outil doit connaître les vraies positions des marqueurs 5 et 6.</w:t>
-      </w:r>
-    </w:p>
-    <w:p>
-      <w:pPr>
-        <w:pStyle w:val="Heading1"/>
+        <w:t>Important : les marqueurs 5 et 6 sont légèrement décalés de la poche du milieu (quelques cm, notés d) pour ne pas la chevaucher : le 5 (bord haut) à droite de la poche, le 6 (bord bas) à gauche — voir le schéma. Mesurer d à l'installation et le noter (section 3.4) : l'outil doit connaître les vraies positions des marqueurs 5 et 6.</w:t>
+      </w:r>
+    </w:p>
+    <w:p>
+      <w:pPr>
+        <w:pStyle w:val="Heading2"/>
         <w:spacing w:after="150" w:before="300"/>
       </w:pPr>
       <w:r>
-        <w:t>8. Étape 4 — Lancer la calibration</w:t>
-      </w:r>
-    </w:p>
-    <w:p>
-      <w:pPr>
-        <w:pBdr>
-          <w:top w:val="single" w:color="CCCCCC" w:sz="2"/>
-          <w:bottom w:val="single" w:color="CCCCCC" w:sz="2"/>
-          <w:left w:val="single" w:color="CCCCCC" w:sz="2"/>
-          <w:right w:val="single" w:color="CCCCCC" w:sz="2"/>
-        </w:pBdr>
-        <w:shd w:fill="F0F0F0" w:val="clear"/>
-        <w:spacing w:after="120"/>
-      </w:pPr>
-      <w:r>
-        <w:rPr>
-          <w:rFonts w:ascii="Consolas" w:cs="Consolas" w:eastAsia="Consolas" w:hAnsi="Consolas"/>
-          <w:sz w:val="20"/>
-          <w:szCs w:val="20"/>
-        </w:rPr>
-        <w:t>ArucoCalibrationTool.exe 0 photo_camera_0.jpg</w:t>
-      </w:r>
-    </w:p>
-    <w:p>
-      <w:pPr>
-        <w:spacing w:after="120"/>
-      </w:pPr>
-      <w:r>
-        <w:t>(remplacez 0 par 1 ou 2 selon la caméra). Avant de calibrer, testez le positionnement : ArucoCalibrationTool.exe --check &lt;index caméra&gt; &lt;photo ou flux&gt;. Le programme détecte ensuite automatiquement les marqueurs de cette caméra (4 pour les caméras 1 et 3, 2 pour la caméra 2), calcule la calibration (rotation + échelle + position), et sauvegarde dans camera_0.yml (ou 1/2). Pour la caméra 2, si les marqueurs 5 et 6 sont décalés de la poche du milieu, indiquer le décalage mesuré d (en cm) avec l'option --decalage : ArucoCalibrationTool.exe --decalage &lt;d&gt; 1 &lt;photo ou flux&gt;.</w:t>
-      </w:r>
-      <w:r>
-        <w:t xml:space="preserve"> Le positionnement des caméras a déjà été fait à l'étape 1 (section 5).</w:t>
-      </w:r>
-    </w:p>
-    <w:p>
-      <w:pPr>
-        <w:pStyle w:val="Heading1"/>
-        <w:spacing w:after="150" w:before="300"/>
-      </w:pPr>
-      <w:r>
-        <w:t>9. Vérification</w:t>
-      </w:r>
-    </w:p>
-    <w:p>
-      <w:pPr>
-        <w:pStyle w:val="ListParagraph"/>
-        <w:numPr>
-          <w:ilvl w:val="0"/>
-          <w:numId w:val="2"/>
-        </w:numPr>
-        <w:spacing w:after="60"/>
-      </w:pPr>
-      <w:r>
-        <w:t>Le programme doit afficher les marqueurs détectés (4, 2 ou 4 selon la caméra) avec leurs coordonnées.</w:t>
-      </w:r>
-    </w:p>
-    <w:p>
-      <w:pPr>
-        <w:pStyle w:val="ListParagraph"/>
-        <w:numPr>
-          <w:ilvl w:val="0"/>
-          <w:numId w:val="2"/>
-        </w:numPr>
-        <w:spacing w:after="60"/>
-      </w:pPr>
-      <w:r>
-        <w:t xml:space="preserve">Un message de succès confirme la sauvegarde du fichier .yml.</w:t>
-      </w:r>
-    </w:p>
-    <w:p>
-      <w:pPr>
-        <w:pStyle w:val="ListParagraph"/>
-        <w:numPr>
-          <w:ilvl w:val="0"/>
-          <w:numId w:val="2"/>
-        </w:numPr>
-        <w:spacing w:after="60"/>
-      </w:pPr>
-      <w:r>
-        <w:t xml:space="preserve">Si un marqueur manque : vérifiez l'éclairage, la netteté, et qu'aucun marqueur n'est masqué.</w:t>
-      </w:r>
-    </w:p>
-    <w:p>
-      <w:pPr>
-        <w:pStyle w:val="Heading1"/>
-        <w:spacing w:after="150" w:before="300"/>
-      </w:pPr>
-      <w:r>
-        <w:t>10. Orientation des marqueurs</w:t>
-      </w:r>
-    </w:p>
-    <w:p>
-      <w:pPr>
-        <w:spacing w:after="120"/>
-      </w:pPr>
-      <w:r>
-        <w:t xml:space="preserve">L'orientation (rotation) de chaque marqueur n'a aucune importance — testé et confirmé : un marqueur est reconnu quel que soit son angle (0° à 360°). Seul le bon numéro au bon endroit compte.</w:t>
-      </w:r>
-    </w:p>
-    <w:p>
-      <w:r>
-        <w:br w:type="page"/>
-      </w:r>
-    </w:p>
-    <w:p>
-      <w:pPr>
-        <w:pStyle w:val="Heading1"/>
-        <w:spacing w:after="150" w:before="300"/>
-      </w:pPr>
-      <w:r>
-        <w:t>11. Planche des 10 marqueurs à imprimer</w:t>
-      </w:r>
-    </w:p>
-    <w:p>
-      <w:pPr>
-        <w:spacing w:after="120"/>
-      </w:pPr>
-      <w:r>
-        <w:rPr>
-          <w:b/>
-          <w:bCs/>
-        </w:rPr>
-        <w:t>La planche est fournie dans le fichier planche_10_marqueurs_aruco_a_imprimer.pdf (2 pages A4, marqueurs de 60 mm). Imprimez-la à 100% / taille réelle (PAS "ajuster à la page") et découpez chaque marqueur en suivant le trait pointillé, en gardant le bord blanc. Pour un premier test avec une seule caméra (caméra 2), seuls les marqueurs 5 et 6 sont nécessaires.</w:t>
-      </w:r>
-    </w:p>
-    <w:p>
-      <w:pPr>
-        <w:spacing w:before="300"/>
-      </w:pPr>
-    </w:p>
-    <w:p>
-      <w:r>
-        <w:br w:type="page"/>
-      </w:r>
-    </w:p>
-    <w:p>
-      <w:pPr>
-        <w:pStyle w:val="Heading1"/>
-      </w:pPr>
-      <w:r>
-        <w:t>12. Positions des marqueurs</w:t>
-      </w:r>
-    </w:p>
-    <w:p>
-      <w:r>
-        <w:rPr>
-          <w:b/>
-        </w:rPr>
-        <w:t>Le tableau ci-dessous donne la position exacte de chaque marqueur, mesurée le long du bord à partir de la poche du milieu (le centre de la table, à 178,5 cm de chaque bout). Voir le schéma de la section 2.</w:t>
+        <w:t>3.4 Positions des marqueurs</w:t>
+      </w:r>
+    </w:p>
+    <w:p>
+      <w:r>
+        <w:rPr>
+          <w:b/>
+        </w:rPr>
+        <w:t>Le tableau ci-dessous donne la position exacte de chaque marqueur, mesurée le long du bord à partir de la poche du milieu (le centre de la table, à 178,5 cm de chaque bout). Voir le schéma de la section 3.1.</w:t>
       </w:r>
       <w:r/>
     </w:p>
@@ -2034,8 +2358,108 @@
       <w:r/>
     </w:p>
     <w:p>
-      <w:r>
-        <w:t>L'orientation (rotation) d'un marqueur n'a aucune importance : seuls comptent le bon numéro et le bon endroit.</w:t>
+      <w:pPr>
+        <w:pStyle w:val="Heading2"/>
+        <w:spacing w:after="150" w:before="300"/>
+      </w:pPr>
+      <w:r>
+        <w:t>3.5 Lancer la calibration</w:t>
+      </w:r>
+    </w:p>
+    <w:p>
+      <w:pPr>
+        <w:pBdr>
+          <w:top w:val="single" w:color="CCCCCC" w:sz="2"/>
+          <w:bottom w:val="single" w:color="CCCCCC" w:sz="2"/>
+          <w:left w:val="single" w:color="CCCCCC" w:sz="2"/>
+          <w:right w:val="single" w:color="CCCCCC" w:sz="2"/>
+        </w:pBdr>
+        <w:shd w:fill="F0F0F0" w:val="clear"/>
+        <w:spacing w:after="120"/>
+      </w:pPr>
+      <w:r>
+        <w:rPr>
+          <w:rFonts w:ascii="Consolas" w:cs="Consolas" w:eastAsia="Consolas" w:hAnsi="Consolas"/>
+          <w:sz w:val="20"/>
+          <w:szCs w:val="20"/>
+        </w:rPr>
+        <w:t>ArucoCalibrationTool.exe 0 photo_camera_0.jpg</w:t>
+      </w:r>
+    </w:p>
+    <w:p>
+      <w:pPr>
+        <w:spacing w:after="120"/>
+      </w:pPr>
+      <w:r>
+        <w:t>(remplacez 0 par 1 ou 2 selon la caméra). Avant de calibrer, testez la détection des marqueurs : ArucoCalibrationTool.exe --check &lt;index caméra&gt; &lt;photo ou flux&gt;. Le programme détecte ensuite automatiquement les marqueurs de cette caméra (4 pour les caméras 1 et 3, 2 pour la caméra 2), calcule la calibration (rotation + échelle + position), et sauvegarde dans camera_0.yml (ou 1/2). Pour la caméra 2, si les marqueurs 5 et 6 sont décalés de la poche du milieu, indiquer le décalage mesuré d (en cm) avec l'option --decalage : ArucoCalibrationTool.exe --decalage &lt;d&gt; 1 &lt;photo ou flux&gt;.</w:t>
+      </w:r>
+      <w:r>
+        <w:t xml:space="preserve"> Le positionnement des caméras a déjà été fait (partie 2).</w:t>
+      </w:r>
+    </w:p>
+    <w:p>
+      <w:pPr>
+        <w:pStyle w:val="Heading2"/>
+        <w:spacing w:after="150" w:before="300"/>
+      </w:pPr>
+      <w:r>
+        <w:t>3.6 Vérification</w:t>
+      </w:r>
+    </w:p>
+    <w:p>
+      <w:pPr>
+        <w:pStyle w:val="ListParagraph"/>
+        <w:numPr>
+          <w:ilvl w:val="0"/>
+          <w:numId w:val="2"/>
+        </w:numPr>
+        <w:spacing w:after="60"/>
+      </w:pPr>
+      <w:r>
+        <w:t>Le programme doit afficher les marqueurs détectés (4, 2 ou 4 selon la caméra) avec leurs coordonnées.</w:t>
+      </w:r>
+    </w:p>
+    <w:p>
+      <w:pPr>
+        <w:pStyle w:val="ListParagraph"/>
+        <w:numPr>
+          <w:ilvl w:val="0"/>
+          <w:numId w:val="2"/>
+        </w:numPr>
+        <w:spacing w:after="60"/>
+      </w:pPr>
+      <w:r>
+        <w:t xml:space="preserve">Un message de succès confirme la sauvegarde du fichier .yml.</w:t>
+      </w:r>
+    </w:p>
+    <w:p>
+      <w:pPr>
+        <w:pStyle w:val="ListParagraph"/>
+        <w:numPr>
+          <w:ilvl w:val="0"/>
+          <w:numId w:val="2"/>
+        </w:numPr>
+        <w:spacing w:after="60"/>
+      </w:pPr>
+      <w:r>
+        <w:t xml:space="preserve">Si un marqueur manque : vérifiez l'éclairage, la netteté, et qu'aucun marqueur n'est masqué.</w:t>
+      </w:r>
+    </w:p>
+    <w:p>
+      <w:pPr>
+        <w:pStyle w:val="Heading2"/>
+        <w:spacing w:after="150" w:before="300"/>
+      </w:pPr>
+      <w:r>
+        <w:t>3.7 Orientation des marqueurs</w:t>
+      </w:r>
+    </w:p>
+    <w:p>
+      <w:pPr>
+        <w:spacing w:after="120"/>
+      </w:pPr>
+      <w:r>
+        <w:t xml:space="preserve">L'orientation (rotation) de chaque marqueur n'a aucune importance — testé et confirmé : un marqueur est reconnu quel que soit son angle (0° à 360°). Seul le bon numéro au bon endroit compte.</w:t>
       </w:r>
     </w:p>
     <w:p>

</xml_diff>

<commit_message>
Manual: dimensioned marker schema from the central axis, simpler section 3.3
- 3.1: new schema with an axis through the middle pockets; every dimension goes
  to the CENTRE of the marker; markers 5 and 6 at 14 cm (start value, one remark
  under the schema).
- 3.3: stick-the-markers section reduced to four short steps.
- 3.4 table and 3.5 command wording aligned (--decalage <distance>).

Co-Authored-By: Claude Sonnet 5.5 <noreply@anthropic.com>
</commit_message>
<xml_diff>
--- a/docs/manuel_calibration_cameras.docx
+++ b/docs/manuel_calibration_cameras.docx
@@ -1140,7 +1140,7 @@
       </w:pPr>
       <w:r>
         <w:rPr/>
-        <w:t>Positions des marqueurs : toujours mesurées à partir de la poche du milieu (centre de la table). Les distances de la section 3.4 sont à recalculer pour la nouvelle table et les nouvelles zones, puis le décalage d est remesuré.</w:t>
+        <w:t>Positions des marqueurs : toujours mesurées à partir de la poche du milieu (centre de la table). Les distances de la section 3.4 sont à recalculer pour la nouvelle table et les nouvelles zones, puis la distance des marqueurs 5 et 6 est remesurée.</w:t>
       </w:r>
     </w:p>
     <w:p>
@@ -1243,37 +1243,31 @@
       </w:pPr>
       <w:r>
         <w:drawing>
-          <wp:inline distT="0" distB="0" distL="0" distR="0">
-            <wp:extent cx="5334000" cy="2133600"/>
-            <wp:effectExtent t="0" r="0" b="0" l="0"/>
-            <wp:docPr id="1" name="" descr="" title=""/>
+          <wp:inline xmlns:a="http://schemas.openxmlformats.org/drawingml/2006/main" xmlns:pic="http://schemas.openxmlformats.org/drawingml/2006/picture">
+            <wp:extent cx="5580000" cy="5684268"/>
+            <wp:docPr id="4" name="Picture 4"/>
             <wp:cNvGraphicFramePr>
-              <a:graphicFrameLocks xmlns:a="http://schemas.openxmlformats.org/drawingml/2006/main" noChangeAspect="1"/>
+              <a:graphicFrameLocks noChangeAspect="1"/>
             </wp:cNvGraphicFramePr>
-            <a:graphic xmlns:a="http://schemas.openxmlformats.org/drawingml/2006/main">
+            <a:graphic>
               <a:graphicData uri="http://schemas.openxmlformats.org/drawingml/2006/picture">
-                <pic:pic xmlns:pic="http://schemas.openxmlformats.org/drawingml/2006/picture">
+                <pic:pic>
                   <pic:nvPicPr>
-                    <pic:cNvPr id="0" name="" descr=""/>
-                    <pic:cNvPicPr>
-                      <a:picLocks noChangeAspect="1" noChangeArrowheads="1"/>
-                    </pic:cNvPicPr>
+                    <pic:cNvPr id="0" name="schema_marqueurs_cotes.png"/>
+                    <pic:cNvPicPr/>
                   </pic:nvPicPr>
                   <pic:blipFill>
-                    <a:blip r:embed="rId7" cstate="none"/>
-                    <a:srcRect/>
+                    <a:blip r:embed="rId18"/>
                     <a:stretch>
                       <a:fillRect/>
                     </a:stretch>
                   </pic:blipFill>
-                  <pic:spPr bwMode="auto">
+                  <pic:spPr>
                     <a:xfrm>
                       <a:off x="0" y="0"/>
-                      <a:ext cx="5334000" cy="2133600"/>
+                      <a:ext cx="5580000" cy="5684268"/>
                     </a:xfrm>
-                    <a:prstGeom prst="rect">
-                      <a:avLst/>
-                    </a:prstGeom>
+                    <a:prstGeom prst="rect"/>
                   </pic:spPr>
                 </pic:pic>
               </a:graphicData>
@@ -1287,7 +1281,15 @@
         <w:spacing w:after="120"/>
       </w:pPr>
       <w:r>
-        <w:t>Les 10 marqueurs ArUco sont collés sur la bordure de la table (le rail marron), aux positions du schéma et du tableau de la section 3.4. Jaune et verte sont de part et d'autre de la ligne centrale, à la même position que marron (ligne de baulk).</w:t>
+        <w:t>Les 10 marqueurs sont collés sur la bordure de la table (le rail marron), aux positions du schéma. Toutes les cotes partent de l'axe central (la ligne qui passe par les deux poches du milieu) et vont jusqu'au CENTRE de chaque marqueur, pas jusqu'à son bord. Les positions sont aussi dans le tableau de la section 3.4.</w:t>
+      </w:r>
+    </w:p>
+    <w:p>
+      <w:pPr>
+        <w:spacing w:after="120"/>
+      </w:pPr>
+      <w:r>
+        <w:t>Remarque : 14 cm est la distance de départ pour les marqueurs 5 et 6. Elle dépend de la largeur de la poche du milieu et peut être ajustée : mesurer la distance réelle sur la table et la donner à l'outil de calibration (option --decalage).</w:t>
       </w:r>
     </w:p>
     <w:p>
@@ -1373,7 +1375,7 @@
         <w:spacing w:after="80"/>
       </w:pPr>
       <w:r>
-        <w:t>marker_1.png → Caméra 1 (jaune/verte/marron), bord HAUT, coin côté baulk (178,5 cm de la poche du milieu, vers le baulk)</w:t>
+        <w:t>Coller chaque marqueur sur la bordure (le rail marron), bien à plat, sans pli ni bulle, au bon numéro et à la bonne place : voir le schéma (3.1) et le tableau (3.4).</w:t>
       </w:r>
     </w:p>
     <w:p>
@@ -1386,7 +1388,7 @@
         <w:spacing w:after="80"/>
       </w:pPr>
       <w:r>
-        <w:t>marker_2.png → Caméra 1 (jaune/verte/marron), bord HAUT, côté caméra 2 (48,5 cm de la poche du milieu, vers le baulk)</w:t>
+        <w:t>Les distances se mesurent le long du bord, à partir de la poche du milieu.</w:t>
       </w:r>
     </w:p>
     <w:p>
@@ -1399,7 +1401,7 @@
         <w:spacing w:after="80"/>
       </w:pPr>
       <w:r>
-        <w:t>marker_3.png → Caméra 1 (jaune/verte/marron), bord BAS, coin côté baulk (178,5 cm de la poche du milieu, vers le baulk)</w:t>
+        <w:t>Marqueurs 5 et 6 : à côté de la poche du milieu, pas dessus. Le 5 à droite (bord haut), le 6 à gauche (bord bas), chacun à 14 cm de l'axe central.</w:t>
       </w:r>
     </w:p>
     <w:p>
@@ -1412,97 +1414,7 @@
         <w:spacing w:after="80"/>
       </w:pPr>
       <w:r>
-        <w:t>marker_4.png → Caméra 1 (jaune/verte/marron), bord BAS, côté caméra 2 (48,5 cm de la poche du milieu, vers le baulk)</w:t>
-      </w:r>
-    </w:p>
-    <w:p>
-      <w:pPr>
-        <w:pStyle w:val="ListParagraph"/>
-        <w:numPr>
-          <w:ilvl w:val="0"/>
-          <w:numId w:val="3"/>
-        </w:numPr>
-        <w:spacing w:after="80"/>
-      </w:pPr>
-      <w:r>
-        <w:t>marker_5.png → Caméra 2 (bleue, centre), bord HAUT, à droite de la poche du milieu (décalage d vers le baulk)</w:t>
-      </w:r>
-    </w:p>
-    <w:p>
-      <w:pPr>
-        <w:pStyle w:val="ListParagraph"/>
-        <w:numPr>
-          <w:ilvl w:val="0"/>
-          <w:numId w:val="3"/>
-        </w:numPr>
-        <w:spacing w:after="80"/>
-      </w:pPr>
-      <w:r>
-        <w:t>marker_6.png → Caméra 2 (bleue, centre), bord BAS, à gauche de la poche du milieu (décalage d vers la noire)</w:t>
-      </w:r>
-    </w:p>
-    <w:p>
-      <w:pPr>
-        <w:pStyle w:val="ListParagraph"/>
-        <w:numPr>
-          <w:ilvl w:val="0"/>
-          <w:numId w:val="3"/>
-        </w:numPr>
-        <w:spacing w:after="80"/>
-      </w:pPr>
-      <w:r>
-        <w:t>marker_7.png → Caméra 3 (rouges/rose/noire), bord HAUT, côté caméra 2 (48,5 cm de la poche du milieu, vers la noire)</w:t>
-      </w:r>
-    </w:p>
-    <w:p>
-      <w:pPr>
-        <w:pStyle w:val="ListParagraph"/>
-        <w:numPr>
-          <w:ilvl w:val="0"/>
-          <w:numId w:val="3"/>
-        </w:numPr>
-        <w:spacing w:after="80"/>
-      </w:pPr>
-      <w:r>
-        <w:t>marker_8.png → Caméra 3 (rouges/rose/noire), bord HAUT, coin côté noire (178,5 cm de la poche du milieu, vers la noire)</w:t>
-      </w:r>
-    </w:p>
-    <w:p>
-      <w:pPr>
-        <w:pStyle w:val="ListParagraph"/>
-        <w:numPr>
-          <w:ilvl w:val="0"/>
-          <w:numId w:val="3"/>
-        </w:numPr>
-        <w:spacing w:after="80"/>
-      </w:pPr>
-      <w:r>
-        <w:t>marker_9.png → Caméra 3 (rouges/rose/noire), bord BAS, côté caméra 2 (48,5 cm de la poche du milieu, vers la noire)</w:t>
-      </w:r>
-    </w:p>
-    <w:p>
-      <w:pPr>
-        <w:pStyle w:val="ListParagraph"/>
-        <w:numPr>
-          <w:ilvl w:val="0"/>
-          <w:numId w:val="3"/>
-        </w:numPr>
-        <w:spacing w:after="80"/>
-      </w:pPr>
-      <w:r>
-        <w:t>marker_10.png → Caméra 3 (rouges/rose/noire), bord BAS, coin côté noire (178,5 cm de la poche du milieu, vers la noire)</w:t>
-      </w:r>
-    </w:p>
-    <w:p>
-      <w:pPr>
-        <w:spacing w:after="120"/>
-      </w:pPr>
-      <w:r>
-        <w:rPr>
-          <w:i/>
-          <w:iCs/>
-        </w:rPr>
-        <w:t>Important : les marqueurs 5 et 6 sont légèrement décalés de la poche du milieu (quelques cm, notés d) pour ne pas la chevaucher : le 5 (bord haut) à droite de la poche, le 6 (bord bas) à gauche — voir le schéma. Mesurer d à l'installation et le noter (section 3.4) : l'outil doit connaître les vraies positions des marqueurs 5 et 6.</w:t>
+        <w:t>Vérifier qu'aucun marqueur n'est caché (queue, main, craie) et qu'aucune lampe ne s'y reflète.</w:t>
       </w:r>
     </w:p>
     <w:p>
@@ -1519,7 +1431,7 @@
         <w:rPr>
           <w:b/>
         </w:rPr>
-        <w:t>Le tableau ci-dessous donne la position exacte de chaque marqueur, mesurée le long du bord à partir de la poche du milieu (le centre de la table, à 178,5 cm de chaque bout). Voir le schéma de la section 3.1.</w:t>
+        <w:t>Le tableau ci-dessous donne la position de chaque marqueur : distance mesurée le long du bord, de l'axe central (poches du milieu) jusqu'au CENTRE du marqueur. Voir le schéma de la section 3.1.</w:t>
       </w:r>
       <w:r/>
     </w:p>
@@ -1608,7 +1520,7 @@
                 <w:b/>
                 <w:sz w:val="18"/>
               </w:rPr>
-              <w:t>Distance de la poche du milieu</w:t>
+              <w:t>Distance de l'axe central au centre du marqueur</w:t>
             </w:r>
           </w:p>
         </w:tc>
@@ -1968,7 +1880,7 @@
                 <w:b w:val="0"/>
                 <w:sz w:val="18"/>
               </w:rPr>
-              <w:t>d vers le baulk</w:t>
+              <w:t>14 cm vers le baulk</w:t>
             </w:r>
           </w:p>
         </w:tc>
@@ -2040,7 +1952,7 @@
                 <w:b w:val="0"/>
                 <w:sz w:val="18"/>
               </w:rPr>
-              <w:t>d vers la noire</w:t>
+              <w:t>14 cm vers la noire</w:t>
             </w:r>
           </w:p>
         </w:tc>
@@ -2353,7 +2265,7 @@
         <w:rPr>
           <w:b/>
         </w:rPr>
-        <w:t>d = décalage de quelques centimètres par rapport à la poche du milieu, pour ne pas la chevaucher : le marqueur 5 (bord haut) à droite de la poche, le marqueur 6 (bord bas) à gauche. Mesurer d lors de l'installation.   d mesuré : ________ cm</w:t>
+        <w:t>Les marqueurs 5 et 6 sont décalés de quelques centimètres (14 cm prévus) par rapport à la poche du milieu, pour ne pas la chevaucher : le marqueur 5 (bord haut) à droite de la poche, le marqueur 6 (bord bas) à gauche. Distance mesurée : ________ cm</w:t>
       </w:r>
       <w:r/>
     </w:p>
@@ -2391,7 +2303,7 @@
         <w:spacing w:after="120"/>
       </w:pPr>
       <w:r>
-        <w:t>(remplacez 0 par 1 ou 2 selon la caméra). Avant de calibrer, testez la détection des marqueurs : ArucoCalibrationTool.exe --check &lt;index caméra&gt; &lt;photo ou flux&gt;. Le programme détecte ensuite automatiquement les marqueurs de cette caméra (4 pour les caméras 1 et 3, 2 pour la caméra 2), calcule la calibration (rotation + échelle + position), et sauvegarde dans camera_0.yml (ou 1/2). Pour la caméra 2, si les marqueurs 5 et 6 sont décalés de la poche du milieu, indiquer le décalage mesuré d (en cm) avec l'option --decalage : ArucoCalibrationTool.exe --decalage &lt;d&gt; 1 &lt;photo ou flux&gt;.</w:t>
+        <w:t>(remplacez 0 par 1 ou 2 selon la caméra). Avant de calibrer, testez la détection des marqueurs : ArucoCalibrationTool.exe --check &lt;index caméra&gt; &lt;photo ou flux&gt;. Le programme détecte ensuite automatiquement les marqueurs de cette caméra (4 pour les caméras 1 et 3, 2 pour la caméra 2), calcule la calibration (rotation + échelle + position), et sauvegarde dans camera_0.yml (ou 1/2). Pour la caméra 2, si les marqueurs 5 et 6 sont décalés de la poche du milieu, indiquer la distance mesurée (en cm ; 14 cm prévus) avec l'option --decalage : ArucoCalibrationTool.exe --decalage &lt;distance&gt; 1 &lt;photo ou flux&gt;.</w:t>
       </w:r>
       <w:r>
         <w:t xml:space="preserve"> Le positionnement des caméras a déjà été fait (partie 2).</w:t>

</xml_diff>

<commit_message>
Manual and guide: cotes from the blue spot on the positioning schema; PDF copy of the manual
- Schema 2.2 / guide page 2: 97 cm (cameras) and 105 cm (aim points) measured
  from the blue spot, which is marked as reference 0.
- docs/manuel_calibration_cameras.pdf: PDF export of the manual (opens
  everywhere, including macOS); regenerate it after each manual edit.

Co-Authored-By: Claude Sonnet 5.5 <noreply@anthropic.com>
</commit_message>
<xml_diff>
--- a/docs/manuel_calibration_cameras.docx
+++ b/docs/manuel_calibration_cameras.docx
@@ -367,8 +367,8 @@
       <w:r>
         <w:drawing>
           <wp:inline xmlns:a="http://schemas.openxmlformats.org/drawingml/2006/main" xmlns:pic="http://schemas.openxmlformats.org/drawingml/2006/picture">
-            <wp:extent cx="5760000" cy="4017951"/>
-            <wp:docPr id="3" name="Picture 3"/>
+            <wp:extent cx="5760000" cy="4272692"/>
+            <wp:docPr id="5" name="Picture 5"/>
             <wp:cNvGraphicFramePr>
               <a:graphicFrameLocks noChangeAspect="1"/>
             </wp:cNvGraphicFramePr>
@@ -380,7 +380,7 @@
                     <pic:cNvPicPr/>
                   </pic:nvPicPr>
                   <pic:blipFill>
-                    <a:blip r:embed="rId13"/>
+                    <a:blip r:embed="rId19"/>
                     <a:stretch>
                       <a:fillRect/>
                     </a:stretch>
@@ -388,7 +388,7 @@
                   <pic:spPr>
                     <a:xfrm>
                       <a:off x="0" y="0"/>
-                      <a:ext cx="5760000" cy="4017951"/>
+                      <a:ext cx="5760000" cy="4272692"/>
                     </a:xfrm>
                     <a:prstGeom prst="rect"/>
                   </pic:spPr>
@@ -404,7 +404,7 @@
         <w:spacing w:after="120"/>
       </w:pPr>
       <w:r>
-        <w:t>Les 3 points à viser : le point BLEU pour la caméra 2 (verticale, au-dessus du point bleu) ; un point à 105 cm du bleu vers le baulk (c'est quasiment le point MARRON) pour la caméra 1 ; un point à 105 cm du bleu vers la noire (à mesurer au mètre, environ 16 cm après le point rose) pour la caméra 3. Poser une bille repère sur chaque point.</w:t>
+        <w:t>Les 3 points à viser : le point BLEU pour la caméra 2 (verticale, au-dessus du point bleu) ; un point à 105 cm du bleu vers le baulk (c'est quasiment le point MARRON) pour la caméra 1 ; un point à 105 cm du bleu vers la noire (à mesurer au mètre) pour la caméra 3. Les caméras 1 et 3 sont posées à 97 cm du point bleu. Toutes les cotes partent du point bleu. Poser une bille repère sur chaque point à viser.</w:t>
       </w:r>
     </w:p>
     <w:p>

</xml_diff>

<commit_message>
Manuel : annexe 4 avec les 10 marqueurs ArUco a imprimer (taille reelle 6 cm)
Ajoute au manuel (.docx et copie .pdf) une annexe avec les 10 marqueurs,
numerotes et legendes (camera, rebord haut/bas, cote), prets a imprimer
a 100 %. Marqueurs generes par ArucoCalibrationTool --generate (DICT_4X4_50,
ids 1-10), identiques a ceux de planche_10_marqueurs_aruco_a_imprimer.pdf.
Dans le PDF ils sont dessines en vectoriel, carre noir de 60 mm exactement.

Co-Authored-By: Claude Sonnet 5.5 <noreply@anthropic.com>
</commit_message>
<xml_diff>
--- a/docs/manuel_calibration_cameras.docx
+++ b/docs/manuel_calibration_cameras.docx
@@ -2373,6 +2373,862 @@
       <w:r>
         <w:t xml:space="preserve">L'orientation (rotation) de chaque marqueur n'a aucune importance — testé et confirmé : un marqueur est reconnu quel que soit son angle (0° à 360°). Seul le bon numéro au bon endroit compte.</w:t>
       </w:r>
+    </w:p>
+    <w:p>
+      <w:pPr>
+        <w:pStyle w:val="Heading1"/>
+        <w:pageBreakBefore/>
+        <w:spacing w:after="150" w:before="300"/>
+      </w:pPr>
+      <w:r>
+        <w:t>4. Annexe — Les 10 marqueurs à imprimer</w:t>
+      </w:r>
+    </w:p>
+    <w:p>
+      <w:pPr>
+        <w:spacing w:after="80"/>
+      </w:pPr>
+      <w:r>
+        <w:rPr>
+          <w:b/>
+          <w:bCs/>
+        </w:rPr>
+        <w:t xml:space="preserve">Imprimer à 100 % (taille réelle), PAS « ajuster à la page ». </w:t>
+      </w:r>
+      <w:r>
+        <w:t xml:space="preserve">Chaque carré noir doit mesurer exactement 6 cm : vérifier avec une règle après impression. Découper en suivant le trait pointillé et garder le bord blanc autour du marqueur. Le sens de rotation n'a pas d'importance.</w:t>
+      </w:r>
+    </w:p>
+    <w:p>
+      <w:pPr>
+        <w:spacing w:after="120"/>
+      </w:pPr>
+      <w:r>
+        <w:t xml:space="preserve">Coller chaque marqueur à l'endroit indiqué par le schéma de la section 3.1 et le tableau de la section 3.4 (le numéro doit correspondre).</w:t>
+      </w:r>
+    </w:p>
+    <w:tbl>
+      <w:tblPr>
+        <w:tblW w:w="9706" w:type="dxa"/>
+        <w:jc w:val="center"/>
+        <w:tblBorders>
+          <w:top w:val="dashed" w:sz="6" w:space="0" w:color="999999"/>
+          <w:left w:val="dashed" w:sz="6" w:space="0" w:color="999999"/>
+          <w:bottom w:val="dashed" w:sz="6" w:space="0" w:color="999999"/>
+          <w:right w:val="dashed" w:sz="6" w:space="0" w:color="999999"/>
+          <w:insideH w:val="dashed" w:sz="6" w:space="0" w:color="999999"/>
+          <w:insideV w:val="dashed" w:sz="6" w:space="0" w:color="999999"/>
+        </w:tblBorders>
+        <w:tblLayout w:type="fixed"/>
+        <w:tblCellMar>
+          <w:left w:w="100" w:type="dxa"/>
+          <w:right w:w="100" w:type="dxa"/>
+        </w:tblCellMar>
+      </w:tblPr>
+      <w:tblGrid>
+        <w:gridCol w:w="4853"/>
+        <w:gridCol w:w="4853"/>
+      </w:tblGrid>
+      <w:tr>
+        <w:trPr>
+          <w:cantSplit/>
+        </w:trPr>
+        <w:tc>
+          <w:tcPr>
+            <w:tcW w:w="4853" w:type="dxa"/>
+            <w:vAlign w:val="center"/>
+          </w:tcPr>
+          <w:p>
+            <w:pPr>
+              <w:keepNext/>
+              <w:spacing w:before="360" w:after="120"/>
+              <w:jc w:val="center"/>
+            </w:pPr>
+            <w:r>
+              <w:drawing>
+                <wp:inline xmlns:a="http://schemas.openxmlformats.org/drawingml/2006/main" xmlns:pic="http://schemas.openxmlformats.org/drawingml/2006/picture">
+                  <wp:extent cx="2160000" cy="2160000"/>
+                  <wp:docPr id="201" name="Marqueur 1"/>
+                  <wp:cNvGraphicFramePr>
+                    <a:graphicFrameLocks noChangeAspect="1"/>
+                  </wp:cNvGraphicFramePr>
+                  <a:graphic>
+                    <a:graphicData uri="http://schemas.openxmlformats.org/drawingml/2006/picture">
+                      <pic:pic>
+                        <pic:nvPicPr>
+                          <pic:cNvPr id="0" name="marqueur_1.png"/>
+                          <pic:cNvPicPr/>
+                        </pic:nvPicPr>
+                        <pic:blipFill>
+                          <a:blip r:embed="rIdMk1"/>
+                          <a:stretch>
+                            <a:fillRect/>
+                          </a:stretch>
+                        </pic:blipFill>
+                        <pic:spPr>
+                          <a:xfrm>
+                            <a:off x="0" y="0"/>
+                            <a:ext cx="2160000" cy="2160000"/>
+                          </a:xfrm>
+                          <a:prstGeom prst="rect"/>
+                        </pic:spPr>
+                      </pic:pic>
+                    </a:graphicData>
+                  </a:graphic>
+                </wp:inline>
+              </w:drawing>
+            </w:r>
+          </w:p>
+          <w:p>
+            <w:pPr>
+              <w:keepLines/>
+              <w:spacing w:before="0" w:after="40"/>
+              <w:jc w:val="center"/>
+            </w:pPr>
+            <w:r>
+              <w:rPr>
+                <w:b/>
+                <w:bCs/>
+                <w:sz w:val="26"/>
+                <w:szCs w:val="26"/>
+              </w:rPr>
+              <w:t xml:space="preserve">Marqueur n° 1</w:t>
+            </w:r>
+          </w:p>
+          <w:p>
+            <w:pPr>
+              <w:spacing w:before="0" w:after="240"/>
+              <w:jc w:val="center"/>
+            </w:pPr>
+            <w:r>
+              <w:rPr>
+                <w:color w:val="555555"/>
+                <w:sz w:val="18"/>
+                <w:szCs w:val="18"/>
+              </w:rPr>
+              <w:t xml:space="preserve">Caméra 1 (jaune/verte/marron) — rebord HAUT, côté baulk</w:t>
+            </w:r>
+          </w:p>
+        </w:tc>
+        <w:tc>
+          <w:tcPr>
+            <w:tcW w:w="4853" w:type="dxa"/>
+            <w:vAlign w:val="center"/>
+          </w:tcPr>
+          <w:p>
+            <w:pPr>
+              <w:keepNext/>
+              <w:spacing w:before="360" w:after="120"/>
+              <w:jc w:val="center"/>
+            </w:pPr>
+            <w:r>
+              <w:drawing>
+                <wp:inline xmlns:a="http://schemas.openxmlformats.org/drawingml/2006/main" xmlns:pic="http://schemas.openxmlformats.org/drawingml/2006/picture">
+                  <wp:extent cx="2160000" cy="2160000"/>
+                  <wp:docPr id="202" name="Marqueur 2"/>
+                  <wp:cNvGraphicFramePr>
+                    <a:graphicFrameLocks noChangeAspect="1"/>
+                  </wp:cNvGraphicFramePr>
+                  <a:graphic>
+                    <a:graphicData uri="http://schemas.openxmlformats.org/drawingml/2006/picture">
+                      <pic:pic>
+                        <pic:nvPicPr>
+                          <pic:cNvPr id="0" name="marqueur_2.png"/>
+                          <pic:cNvPicPr/>
+                        </pic:nvPicPr>
+                        <pic:blipFill>
+                          <a:blip r:embed="rIdMk2"/>
+                          <a:stretch>
+                            <a:fillRect/>
+                          </a:stretch>
+                        </pic:blipFill>
+                        <pic:spPr>
+                          <a:xfrm>
+                            <a:off x="0" y="0"/>
+                            <a:ext cx="2160000" cy="2160000"/>
+                          </a:xfrm>
+                          <a:prstGeom prst="rect"/>
+                        </pic:spPr>
+                      </pic:pic>
+                    </a:graphicData>
+                  </a:graphic>
+                </wp:inline>
+              </w:drawing>
+            </w:r>
+          </w:p>
+          <w:p>
+            <w:pPr>
+              <w:keepLines/>
+              <w:spacing w:before="0" w:after="40"/>
+              <w:jc w:val="center"/>
+            </w:pPr>
+            <w:r>
+              <w:rPr>
+                <w:b/>
+                <w:bCs/>
+                <w:sz w:val="26"/>
+                <w:szCs w:val="26"/>
+              </w:rPr>
+              <w:t xml:space="preserve">Marqueur n° 2</w:t>
+            </w:r>
+          </w:p>
+          <w:p>
+            <w:pPr>
+              <w:spacing w:before="0" w:after="240"/>
+              <w:jc w:val="center"/>
+            </w:pPr>
+            <w:r>
+              <w:rPr>
+                <w:color w:val="555555"/>
+                <w:sz w:val="18"/>
+                <w:szCs w:val="18"/>
+              </w:rPr>
+              <w:t xml:space="preserve">Caméra 1 (jaune/verte/marron) — rebord HAUT, côté caméra 2</w:t>
+            </w:r>
+          </w:p>
+        </w:tc>
+      </w:tr>
+      <w:tr>
+        <w:trPr>
+          <w:cantSplit/>
+        </w:trPr>
+        <w:tc>
+          <w:tcPr>
+            <w:tcW w:w="4853" w:type="dxa"/>
+            <w:vAlign w:val="center"/>
+          </w:tcPr>
+          <w:p>
+            <w:pPr>
+              <w:keepNext/>
+              <w:spacing w:before="360" w:after="120"/>
+              <w:jc w:val="center"/>
+            </w:pPr>
+            <w:r>
+              <w:drawing>
+                <wp:inline xmlns:a="http://schemas.openxmlformats.org/drawingml/2006/main" xmlns:pic="http://schemas.openxmlformats.org/drawingml/2006/picture">
+                  <wp:extent cx="2160000" cy="2160000"/>
+                  <wp:docPr id="203" name="Marqueur 3"/>
+                  <wp:cNvGraphicFramePr>
+                    <a:graphicFrameLocks noChangeAspect="1"/>
+                  </wp:cNvGraphicFramePr>
+                  <a:graphic>
+                    <a:graphicData uri="http://schemas.openxmlformats.org/drawingml/2006/picture">
+                      <pic:pic>
+                        <pic:nvPicPr>
+                          <pic:cNvPr id="0" name="marqueur_3.png"/>
+                          <pic:cNvPicPr/>
+                        </pic:nvPicPr>
+                        <pic:blipFill>
+                          <a:blip r:embed="rIdMk3"/>
+                          <a:stretch>
+                            <a:fillRect/>
+                          </a:stretch>
+                        </pic:blipFill>
+                        <pic:spPr>
+                          <a:xfrm>
+                            <a:off x="0" y="0"/>
+                            <a:ext cx="2160000" cy="2160000"/>
+                          </a:xfrm>
+                          <a:prstGeom prst="rect"/>
+                        </pic:spPr>
+                      </pic:pic>
+                    </a:graphicData>
+                  </a:graphic>
+                </wp:inline>
+              </w:drawing>
+            </w:r>
+          </w:p>
+          <w:p>
+            <w:pPr>
+              <w:keepLines/>
+              <w:spacing w:before="0" w:after="40"/>
+              <w:jc w:val="center"/>
+            </w:pPr>
+            <w:r>
+              <w:rPr>
+                <w:b/>
+                <w:bCs/>
+                <w:sz w:val="26"/>
+                <w:szCs w:val="26"/>
+              </w:rPr>
+              <w:t xml:space="preserve">Marqueur n° 3</w:t>
+            </w:r>
+          </w:p>
+          <w:p>
+            <w:pPr>
+              <w:spacing w:before="0" w:after="240"/>
+              <w:jc w:val="center"/>
+            </w:pPr>
+            <w:r>
+              <w:rPr>
+                <w:color w:val="555555"/>
+                <w:sz w:val="18"/>
+                <w:szCs w:val="18"/>
+              </w:rPr>
+              <w:t xml:space="preserve">Caméra 1 (jaune/verte/marron) — rebord BAS, côté baulk</w:t>
+            </w:r>
+          </w:p>
+        </w:tc>
+        <w:tc>
+          <w:tcPr>
+            <w:tcW w:w="4853" w:type="dxa"/>
+            <w:vAlign w:val="center"/>
+          </w:tcPr>
+          <w:p>
+            <w:pPr>
+              <w:keepNext/>
+              <w:spacing w:before="360" w:after="120"/>
+              <w:jc w:val="center"/>
+            </w:pPr>
+            <w:r>
+              <w:drawing>
+                <wp:inline xmlns:a="http://schemas.openxmlformats.org/drawingml/2006/main" xmlns:pic="http://schemas.openxmlformats.org/drawingml/2006/picture">
+                  <wp:extent cx="2160000" cy="2160000"/>
+                  <wp:docPr id="204" name="Marqueur 4"/>
+                  <wp:cNvGraphicFramePr>
+                    <a:graphicFrameLocks noChangeAspect="1"/>
+                  </wp:cNvGraphicFramePr>
+                  <a:graphic>
+                    <a:graphicData uri="http://schemas.openxmlformats.org/drawingml/2006/picture">
+                      <pic:pic>
+                        <pic:nvPicPr>
+                          <pic:cNvPr id="0" name="marqueur_4.png"/>
+                          <pic:cNvPicPr/>
+                        </pic:nvPicPr>
+                        <pic:blipFill>
+                          <a:blip r:embed="rIdMk4"/>
+                          <a:stretch>
+                            <a:fillRect/>
+                          </a:stretch>
+                        </pic:blipFill>
+                        <pic:spPr>
+                          <a:xfrm>
+                            <a:off x="0" y="0"/>
+                            <a:ext cx="2160000" cy="2160000"/>
+                          </a:xfrm>
+                          <a:prstGeom prst="rect"/>
+                        </pic:spPr>
+                      </pic:pic>
+                    </a:graphicData>
+                  </a:graphic>
+                </wp:inline>
+              </w:drawing>
+            </w:r>
+          </w:p>
+          <w:p>
+            <w:pPr>
+              <w:keepLines/>
+              <w:spacing w:before="0" w:after="40"/>
+              <w:jc w:val="center"/>
+            </w:pPr>
+            <w:r>
+              <w:rPr>
+                <w:b/>
+                <w:bCs/>
+                <w:sz w:val="26"/>
+                <w:szCs w:val="26"/>
+              </w:rPr>
+              <w:t xml:space="preserve">Marqueur n° 4</w:t>
+            </w:r>
+          </w:p>
+          <w:p>
+            <w:pPr>
+              <w:spacing w:before="0" w:after="240"/>
+              <w:jc w:val="center"/>
+            </w:pPr>
+            <w:r>
+              <w:rPr>
+                <w:color w:val="555555"/>
+                <w:sz w:val="18"/>
+                <w:szCs w:val="18"/>
+              </w:rPr>
+              <w:t xml:space="preserve">Caméra 1 (jaune/verte/marron) — rebord BAS, côté caméra 2</w:t>
+            </w:r>
+          </w:p>
+        </w:tc>
+      </w:tr>
+      <w:tr>
+        <w:trPr>
+          <w:cantSplit/>
+        </w:trPr>
+        <w:tc>
+          <w:tcPr>
+            <w:tcW w:w="4853" w:type="dxa"/>
+            <w:vAlign w:val="center"/>
+          </w:tcPr>
+          <w:p>
+            <w:pPr>
+              <w:keepNext/>
+              <w:spacing w:before="360" w:after="120"/>
+              <w:jc w:val="center"/>
+            </w:pPr>
+            <w:r>
+              <w:drawing>
+                <wp:inline xmlns:a="http://schemas.openxmlformats.org/drawingml/2006/main" xmlns:pic="http://schemas.openxmlformats.org/drawingml/2006/picture">
+                  <wp:extent cx="2160000" cy="2160000"/>
+                  <wp:docPr id="205" name="Marqueur 5"/>
+                  <wp:cNvGraphicFramePr>
+                    <a:graphicFrameLocks noChangeAspect="1"/>
+                  </wp:cNvGraphicFramePr>
+                  <a:graphic>
+                    <a:graphicData uri="http://schemas.openxmlformats.org/drawingml/2006/picture">
+                      <pic:pic>
+                        <pic:nvPicPr>
+                          <pic:cNvPr id="0" name="marqueur_5.png"/>
+                          <pic:cNvPicPr/>
+                        </pic:nvPicPr>
+                        <pic:blipFill>
+                          <a:blip r:embed="rIdMk5"/>
+                          <a:stretch>
+                            <a:fillRect/>
+                          </a:stretch>
+                        </pic:blipFill>
+                        <pic:spPr>
+                          <a:xfrm>
+                            <a:off x="0" y="0"/>
+                            <a:ext cx="2160000" cy="2160000"/>
+                          </a:xfrm>
+                          <a:prstGeom prst="rect"/>
+                        </pic:spPr>
+                      </pic:pic>
+                    </a:graphicData>
+                  </a:graphic>
+                </wp:inline>
+              </w:drawing>
+            </w:r>
+          </w:p>
+          <w:p>
+            <w:pPr>
+              <w:keepLines/>
+              <w:spacing w:before="0" w:after="40"/>
+              <w:jc w:val="center"/>
+            </w:pPr>
+            <w:r>
+              <w:rPr>
+                <w:b/>
+                <w:bCs/>
+                <w:sz w:val="26"/>
+                <w:szCs w:val="26"/>
+              </w:rPr>
+              <w:t xml:space="preserve">Marqueur n° 5</w:t>
+            </w:r>
+          </w:p>
+          <w:p>
+            <w:pPr>
+              <w:spacing w:before="0" w:after="240"/>
+              <w:jc w:val="center"/>
+            </w:pPr>
+            <w:r>
+              <w:rPr>
+                <w:color w:val="555555"/>
+                <w:sz w:val="18"/>
+                <w:szCs w:val="18"/>
+              </w:rPr>
+              <w:t xml:space="preserve">Caméra 2 (bleue, centre) — rebord HAUT</w:t>
+            </w:r>
+          </w:p>
+        </w:tc>
+        <w:tc>
+          <w:tcPr>
+            <w:tcW w:w="4853" w:type="dxa"/>
+            <w:vAlign w:val="center"/>
+          </w:tcPr>
+          <w:p>
+            <w:pPr>
+              <w:keepNext/>
+              <w:spacing w:before="360" w:after="120"/>
+              <w:jc w:val="center"/>
+            </w:pPr>
+            <w:r>
+              <w:drawing>
+                <wp:inline xmlns:a="http://schemas.openxmlformats.org/drawingml/2006/main" xmlns:pic="http://schemas.openxmlformats.org/drawingml/2006/picture">
+                  <wp:extent cx="2160000" cy="2160000"/>
+                  <wp:docPr id="206" name="Marqueur 6"/>
+                  <wp:cNvGraphicFramePr>
+                    <a:graphicFrameLocks noChangeAspect="1"/>
+                  </wp:cNvGraphicFramePr>
+                  <a:graphic>
+                    <a:graphicData uri="http://schemas.openxmlformats.org/drawingml/2006/picture">
+                      <pic:pic>
+                        <pic:nvPicPr>
+                          <pic:cNvPr id="0" name="marqueur_6.png"/>
+                          <pic:cNvPicPr/>
+                        </pic:nvPicPr>
+                        <pic:blipFill>
+                          <a:blip r:embed="rIdMk6"/>
+                          <a:stretch>
+                            <a:fillRect/>
+                          </a:stretch>
+                        </pic:blipFill>
+                        <pic:spPr>
+                          <a:xfrm>
+                            <a:off x="0" y="0"/>
+                            <a:ext cx="2160000" cy="2160000"/>
+                          </a:xfrm>
+                          <a:prstGeom prst="rect"/>
+                        </pic:spPr>
+                      </pic:pic>
+                    </a:graphicData>
+                  </a:graphic>
+                </wp:inline>
+              </w:drawing>
+            </w:r>
+          </w:p>
+          <w:p>
+            <w:pPr>
+              <w:keepLines/>
+              <w:spacing w:before="0" w:after="40"/>
+              <w:jc w:val="center"/>
+            </w:pPr>
+            <w:r>
+              <w:rPr>
+                <w:b/>
+                <w:bCs/>
+                <w:sz w:val="26"/>
+                <w:szCs w:val="26"/>
+              </w:rPr>
+              <w:t xml:space="preserve">Marqueur n° 6</w:t>
+            </w:r>
+          </w:p>
+          <w:p>
+            <w:pPr>
+              <w:spacing w:before="0" w:after="240"/>
+              <w:jc w:val="center"/>
+            </w:pPr>
+            <w:r>
+              <w:rPr>
+                <w:color w:val="555555"/>
+                <w:sz w:val="18"/>
+                <w:szCs w:val="18"/>
+              </w:rPr>
+              <w:t xml:space="preserve">Caméra 2 (bleue, centre) — rebord BAS</w:t>
+            </w:r>
+          </w:p>
+        </w:tc>
+      </w:tr>
+      <w:tr>
+        <w:trPr>
+          <w:cantSplit/>
+        </w:trPr>
+        <w:tc>
+          <w:tcPr>
+            <w:tcW w:w="4853" w:type="dxa"/>
+            <w:vAlign w:val="center"/>
+          </w:tcPr>
+          <w:p>
+            <w:pPr>
+              <w:keepNext/>
+              <w:spacing w:before="360" w:after="120"/>
+              <w:jc w:val="center"/>
+            </w:pPr>
+            <w:r>
+              <w:drawing>
+                <wp:inline xmlns:a="http://schemas.openxmlformats.org/drawingml/2006/main" xmlns:pic="http://schemas.openxmlformats.org/drawingml/2006/picture">
+                  <wp:extent cx="2160000" cy="2160000"/>
+                  <wp:docPr id="207" name="Marqueur 7"/>
+                  <wp:cNvGraphicFramePr>
+                    <a:graphicFrameLocks noChangeAspect="1"/>
+                  </wp:cNvGraphicFramePr>
+                  <a:graphic>
+                    <a:graphicData uri="http://schemas.openxmlformats.org/drawingml/2006/picture">
+                      <pic:pic>
+                        <pic:nvPicPr>
+                          <pic:cNvPr id="0" name="marqueur_7.png"/>
+                          <pic:cNvPicPr/>
+                        </pic:nvPicPr>
+                        <pic:blipFill>
+                          <a:blip r:embed="rIdMk7"/>
+                          <a:stretch>
+                            <a:fillRect/>
+                          </a:stretch>
+                        </pic:blipFill>
+                        <pic:spPr>
+                          <a:xfrm>
+                            <a:off x="0" y="0"/>
+                            <a:ext cx="2160000" cy="2160000"/>
+                          </a:xfrm>
+                          <a:prstGeom prst="rect"/>
+                        </pic:spPr>
+                      </pic:pic>
+                    </a:graphicData>
+                  </a:graphic>
+                </wp:inline>
+              </w:drawing>
+            </w:r>
+          </w:p>
+          <w:p>
+            <w:pPr>
+              <w:keepLines/>
+              <w:spacing w:before="0" w:after="40"/>
+              <w:jc w:val="center"/>
+            </w:pPr>
+            <w:r>
+              <w:rPr>
+                <w:b/>
+                <w:bCs/>
+                <w:sz w:val="26"/>
+                <w:szCs w:val="26"/>
+              </w:rPr>
+              <w:t xml:space="preserve">Marqueur n° 7</w:t>
+            </w:r>
+          </w:p>
+          <w:p>
+            <w:pPr>
+              <w:spacing w:before="0" w:after="240"/>
+              <w:jc w:val="center"/>
+            </w:pPr>
+            <w:r>
+              <w:rPr>
+                <w:color w:val="555555"/>
+                <w:sz w:val="18"/>
+                <w:szCs w:val="18"/>
+              </w:rPr>
+              <w:t xml:space="preserve">Caméra 3 (rouges/rose/noire) — rebord HAUT, côté caméra 2</w:t>
+            </w:r>
+          </w:p>
+        </w:tc>
+        <w:tc>
+          <w:tcPr>
+            <w:tcW w:w="4853" w:type="dxa"/>
+            <w:vAlign w:val="center"/>
+          </w:tcPr>
+          <w:p>
+            <w:pPr>
+              <w:keepNext/>
+              <w:spacing w:before="360" w:after="120"/>
+              <w:jc w:val="center"/>
+            </w:pPr>
+            <w:r>
+              <w:drawing>
+                <wp:inline xmlns:a="http://schemas.openxmlformats.org/drawingml/2006/main" xmlns:pic="http://schemas.openxmlformats.org/drawingml/2006/picture">
+                  <wp:extent cx="2160000" cy="2160000"/>
+                  <wp:docPr id="208" name="Marqueur 8"/>
+                  <wp:cNvGraphicFramePr>
+                    <a:graphicFrameLocks noChangeAspect="1"/>
+                  </wp:cNvGraphicFramePr>
+                  <a:graphic>
+                    <a:graphicData uri="http://schemas.openxmlformats.org/drawingml/2006/picture">
+                      <pic:pic>
+                        <pic:nvPicPr>
+                          <pic:cNvPr id="0" name="marqueur_8.png"/>
+                          <pic:cNvPicPr/>
+                        </pic:nvPicPr>
+                        <pic:blipFill>
+                          <a:blip r:embed="rIdMk8"/>
+                          <a:stretch>
+                            <a:fillRect/>
+                          </a:stretch>
+                        </pic:blipFill>
+                        <pic:spPr>
+                          <a:xfrm>
+                            <a:off x="0" y="0"/>
+                            <a:ext cx="2160000" cy="2160000"/>
+                          </a:xfrm>
+                          <a:prstGeom prst="rect"/>
+                        </pic:spPr>
+                      </pic:pic>
+                    </a:graphicData>
+                  </a:graphic>
+                </wp:inline>
+              </w:drawing>
+            </w:r>
+          </w:p>
+          <w:p>
+            <w:pPr>
+              <w:keepLines/>
+              <w:spacing w:before="0" w:after="40"/>
+              <w:jc w:val="center"/>
+            </w:pPr>
+            <w:r>
+              <w:rPr>
+                <w:b/>
+                <w:bCs/>
+                <w:sz w:val="26"/>
+                <w:szCs w:val="26"/>
+              </w:rPr>
+              <w:t xml:space="preserve">Marqueur n° 8</w:t>
+            </w:r>
+          </w:p>
+          <w:p>
+            <w:pPr>
+              <w:spacing w:before="0" w:after="240"/>
+              <w:jc w:val="center"/>
+            </w:pPr>
+            <w:r>
+              <w:rPr>
+                <w:color w:val="555555"/>
+                <w:sz w:val="18"/>
+                <w:szCs w:val="18"/>
+              </w:rPr>
+              <w:t xml:space="preserve">Caméra 3 (rouges/rose/noire) — rebord HAUT, côté noire</w:t>
+            </w:r>
+          </w:p>
+        </w:tc>
+      </w:tr>
+      <w:tr>
+        <w:trPr>
+          <w:cantSplit/>
+        </w:trPr>
+        <w:tc>
+          <w:tcPr>
+            <w:tcW w:w="4853" w:type="dxa"/>
+            <w:vAlign w:val="center"/>
+          </w:tcPr>
+          <w:p>
+            <w:pPr>
+              <w:keepNext/>
+              <w:spacing w:before="360" w:after="120"/>
+              <w:jc w:val="center"/>
+            </w:pPr>
+            <w:r>
+              <w:drawing>
+                <wp:inline xmlns:a="http://schemas.openxmlformats.org/drawingml/2006/main" xmlns:pic="http://schemas.openxmlformats.org/drawingml/2006/picture">
+                  <wp:extent cx="2160000" cy="2160000"/>
+                  <wp:docPr id="209" name="Marqueur 9"/>
+                  <wp:cNvGraphicFramePr>
+                    <a:graphicFrameLocks noChangeAspect="1"/>
+                  </wp:cNvGraphicFramePr>
+                  <a:graphic>
+                    <a:graphicData uri="http://schemas.openxmlformats.org/drawingml/2006/picture">
+                      <pic:pic>
+                        <pic:nvPicPr>
+                          <pic:cNvPr id="0" name="marqueur_9.png"/>
+                          <pic:cNvPicPr/>
+                        </pic:nvPicPr>
+                        <pic:blipFill>
+                          <a:blip r:embed="rIdMk9"/>
+                          <a:stretch>
+                            <a:fillRect/>
+                          </a:stretch>
+                        </pic:blipFill>
+                        <pic:spPr>
+                          <a:xfrm>
+                            <a:off x="0" y="0"/>
+                            <a:ext cx="2160000" cy="2160000"/>
+                          </a:xfrm>
+                          <a:prstGeom prst="rect"/>
+                        </pic:spPr>
+                      </pic:pic>
+                    </a:graphicData>
+                  </a:graphic>
+                </wp:inline>
+              </w:drawing>
+            </w:r>
+          </w:p>
+          <w:p>
+            <w:pPr>
+              <w:keepLines/>
+              <w:spacing w:before="0" w:after="40"/>
+              <w:jc w:val="center"/>
+            </w:pPr>
+            <w:r>
+              <w:rPr>
+                <w:b/>
+                <w:bCs/>
+                <w:sz w:val="26"/>
+                <w:szCs w:val="26"/>
+              </w:rPr>
+              <w:t xml:space="preserve">Marqueur n° 9</w:t>
+            </w:r>
+          </w:p>
+          <w:p>
+            <w:pPr>
+              <w:spacing w:before="0" w:after="240"/>
+              <w:jc w:val="center"/>
+            </w:pPr>
+            <w:r>
+              <w:rPr>
+                <w:color w:val="555555"/>
+                <w:sz w:val="18"/>
+                <w:szCs w:val="18"/>
+              </w:rPr>
+              <w:t xml:space="preserve">Caméra 3 (rouges/rose/noire) — rebord BAS, côté caméra 2</w:t>
+            </w:r>
+          </w:p>
+        </w:tc>
+        <w:tc>
+          <w:tcPr>
+            <w:tcW w:w="4853" w:type="dxa"/>
+            <w:vAlign w:val="center"/>
+          </w:tcPr>
+          <w:p>
+            <w:pPr>
+              <w:keepNext/>
+              <w:spacing w:before="360" w:after="120"/>
+              <w:jc w:val="center"/>
+            </w:pPr>
+            <w:r>
+              <w:drawing>
+                <wp:inline xmlns:a="http://schemas.openxmlformats.org/drawingml/2006/main" xmlns:pic="http://schemas.openxmlformats.org/drawingml/2006/picture">
+                  <wp:extent cx="2160000" cy="2160000"/>
+                  <wp:docPr id="210" name="Marqueur 10"/>
+                  <wp:cNvGraphicFramePr>
+                    <a:graphicFrameLocks noChangeAspect="1"/>
+                  </wp:cNvGraphicFramePr>
+                  <a:graphic>
+                    <a:graphicData uri="http://schemas.openxmlformats.org/drawingml/2006/picture">
+                      <pic:pic>
+                        <pic:nvPicPr>
+                          <pic:cNvPr id="0" name="marqueur_10.png"/>
+                          <pic:cNvPicPr/>
+                        </pic:nvPicPr>
+                        <pic:blipFill>
+                          <a:blip r:embed="rIdMk10"/>
+                          <a:stretch>
+                            <a:fillRect/>
+                          </a:stretch>
+                        </pic:blipFill>
+                        <pic:spPr>
+                          <a:xfrm>
+                            <a:off x="0" y="0"/>
+                            <a:ext cx="2160000" cy="2160000"/>
+                          </a:xfrm>
+                          <a:prstGeom prst="rect"/>
+                        </pic:spPr>
+                      </pic:pic>
+                    </a:graphicData>
+                  </a:graphic>
+                </wp:inline>
+              </w:drawing>
+            </w:r>
+          </w:p>
+          <w:p>
+            <w:pPr>
+              <w:keepLines/>
+              <w:spacing w:before="0" w:after="40"/>
+              <w:jc w:val="center"/>
+            </w:pPr>
+            <w:r>
+              <w:rPr>
+                <w:b/>
+                <w:bCs/>
+                <w:sz w:val="26"/>
+                <w:szCs w:val="26"/>
+              </w:rPr>
+              <w:t xml:space="preserve">Marqueur n° 10</w:t>
+            </w:r>
+          </w:p>
+          <w:p>
+            <w:pPr>
+              <w:spacing w:before="0" w:after="240"/>
+              <w:jc w:val="center"/>
+            </w:pPr>
+            <w:r>
+              <w:rPr>
+                <w:color w:val="555555"/>
+                <w:sz w:val="18"/>
+                <w:szCs w:val="18"/>
+              </w:rPr>
+              <w:t xml:space="preserve">Caméra 3 (rouges/rose/noire) — rebord BAS, côté noire</w:t>
+            </w:r>
+          </w:p>
+        </w:tc>
+      </w:tr>
+    </w:tbl>
+    <w:p>
+      <w:pPr>
+        <w:spacing w:after="120"/>
+      </w:pPr>
     </w:p>
     <w:p>
       <w:pPr>

</xml_diff>

<commit_message>
Manual: section 3.2 now points to the printed-markers annex; remove the near-empty page
The Mac session added annex 4 with the 10 ArUco markers; section 3.2 still
referred to the separate planche PDF and left a nearly empty page. It now
refers to the annex (section 4) and the page breaks are removed (10 -> 9 pages).
PDF regenerated.

Co-Authored-By: Claude Sonnet 5.5 <noreply@anthropic.com>
</commit_message>
<xml_diff>
--- a/docs/manuel_calibration_cameras.docx
+++ b/docs/manuel_calibration_cameras.docx
@@ -1326,34 +1326,7 @@
         <w:spacing w:after="120"/>
       </w:pPr>
       <w:r>
-        <w:t>Crée marker_1.png à marker_10.png. La planche prête à imprimer est le fichier planche_10_marqueurs_aruco_a_imprimer.pdf (voir la planche ci-dessous) — ou générez-les vous-même avec la commande ci-dessus.</w:t>
-      </w:r>
-    </w:p>
-    <w:p>
-      <w:r>
-        <w:br w:type="page"/>
-      </w:r>
-    </w:p>
-    <w:p>
-      <w:pPr>
-        <w:spacing w:after="120"/>
-      </w:pPr>
-      <w:r>
-        <w:rPr>
-          <w:b/>
-          <w:bCs/>
-        </w:rPr>
-        <w:t>La planche est fournie dans le fichier planche_10_marqueurs_aruco_a_imprimer.pdf (2 pages A4, marqueurs de 60 mm). Imprimez-la à 100% / taille réelle (PAS "ajuster à la page") et découpez chaque marqueur en suivant le trait pointillé, en gardant le bord blanc. Pour un premier test avec une seule caméra (caméra 2), seuls les marqueurs 5 et 6 sont nécessaires.</w:t>
-      </w:r>
-    </w:p>
-    <w:p>
-      <w:pPr>
-        <w:spacing w:before="300"/>
-      </w:pPr>
-    </w:p>
-    <w:p>
-      <w:r>
-        <w:br w:type="page"/>
+        <w:t>Les 10 marqueurs à imprimer sont dans l'annexe de ce manuel (section 4) : imprimer ces deux pages à 100 % (taille réelle), sans « ajuster à la page ». Pour un premier test avec une seule caméra (caméra 2), seuls les marqueurs 5 et 6 sont nécessaires. La commande ci-dessus permet aussi de les générer soi-même (marker_1.png à marker_10.png).</w:t>
       </w:r>
     </w:p>
     <w:p>

</xml_diff>

<commit_message>
Manuel : section 1 liste maintenant la Partie 1 (Objectif)
La liste de la section 1 ne citait que les Parties 2 et 3, ce qui laissait
croire qu'une partie 1 manquait. Ajout de 'Partie 1 - Objectif (cette
partie)' dans le .docx et dans la page 1 du PDF (page refaite a
l'identique avec la ligne en plus ; les autres pages, dont l'annexe des
marqueurs, sont inchangees).

Co-Authored-By: Claude Sonnet 5.5 <noreply@anthropic.com>
</commit_message>
<xml_diff>
--- a/docs/manuel_calibration_cameras.docx
+++ b/docs/manuel_calibration_cameras.docx
@@ -47,6 +47,19 @@
       </w:pPr>
       <w:r>
         <w:t>Ce manuel explique comment installer et régler les 3 caméras du système Snooker Player. Il suit l'ordre de l'installation :</w:t>
+      </w:r>
+    </w:p>
+    <w:p>
+      <w:pPr>
+        <w:pStyle w:val="ListParagraph"/>
+        <w:numPr>
+          <w:ilvl w:val="0"/>
+          <w:numId w:val="2"/>
+        </w:numPr>
+        <w:spacing w:after="60"/>
+      </w:pPr>
+      <w:r>
+        <w:t>Partie 1 — Objectif (cette partie) : à quoi sert le manuel, quand le faire, matériel nécessaire.</w:t>
       </w:r>
     </w:p>
     <w:p>

</xml_diff>

<commit_message>
Manuel : parties renumerotees (suppression de 'Partie 1 - Objectif')
La ligne 'Partie 1 - Objectif' est retiree de la liste de la section 1 ;
'Partie 2 - Positionnement' devient 'Partie 1' et 'Partie 3 -
Calibration' devient 'Partie 2' (liste + les 5 renvois '(partie N)' du
texte), dans le .docx et dans le PDF (chiffres remplaces en place, autres
pages et annexe inchanges). Les titres de section (2., 3., 4.) ne sont pas
modifies.

Co-Authored-By: Claude Sonnet 5.5 <noreply@anthropic.com>
</commit_message>
<xml_diff>
--- a/docs/manuel_calibration_cameras.docx
+++ b/docs/manuel_calibration_cameras.docx
@@ -59,33 +59,20 @@
         <w:spacing w:after="60"/>
       </w:pPr>
       <w:r>
-        <w:t>Partie 1 — Objectif (cette partie) : à quoi sert le manuel, quand le faire, matériel nécessaire.</w:t>
-      </w:r>
-    </w:p>
-    <w:p>
-      <w:pPr>
-        <w:pStyle w:val="ListParagraph"/>
-        <w:numPr>
-          <w:ilvl w:val="0"/>
-          <w:numId w:val="2"/>
-        </w:numPr>
-        <w:spacing w:after="60"/>
-      </w:pPr>
-      <w:r>
-        <w:t>Partie 2 — Positionnement : poser les 3 caméras au bon endroit et bien orientées, à l'aide de la mire du logiciel.</w:t>
-      </w:r>
-    </w:p>
-    <w:p>
-      <w:pPr>
-        <w:pStyle w:val="ListParagraph"/>
-        <w:numPr>
-          <w:ilvl w:val="0"/>
-          <w:numId w:val="2"/>
-        </w:numPr>
-        <w:spacing w:after="60"/>
-      </w:pPr>
-      <w:r>
-        <w:t>Partie 3 — Calibration : coller les marqueurs sur la bordure de la table, puis lancer la calibration.</w:t>
+        <w:t>Partie 1 — Positionnement : poser les 3 caméras au bon endroit et bien orientées, à l'aide de la mire du logiciel.</w:t>
+      </w:r>
+    </w:p>
+    <w:p>
+      <w:pPr>
+        <w:pStyle w:val="ListParagraph"/>
+        <w:numPr>
+          <w:ilvl w:val="0"/>
+          <w:numId w:val="2"/>
+        </w:numPr>
+        <w:spacing w:after="60"/>
+      </w:pPr>
+      <w:r>
+        <w:t>Partie 2 — Calibration : coller les marqueurs sur la bordure de la table, puis lancer la calibration.</w:t>
       </w:r>
     </w:p>
     <w:p>
@@ -222,7 +209,7 @@
         <w:spacing w:after="60"/>
       </w:pPr>
       <w:r>
-        <w:t>3 billes repères (pour viser les points de la table, partie 2).</w:t>
+        <w:t>3 billes repères (pour viser les points de la table, partie 1).</w:t>
       </w:r>
     </w:p>
     <w:p>
@@ -1211,15 +1198,15 @@
         <w:spacing w:after="60"/>
       </w:pPr>
       <w:r>
-        <w:t>Ces valeurs servent à la calibration (partie 3) et au dépannage ; une fiche à remplir est fournie dans guide_positionnement_cameras_mire.pdf.</w:t>
-      </w:r>
-    </w:p>
-    <w:p>
-      <w:pPr>
-        <w:spacing w:after="120"/>
-      </w:pPr>
-      <w:r>
-        <w:t>Quand la mire est bonne pour les 3 caméras, passer à la calibration (partie 3).</w:t>
+        <w:t>Ces valeurs servent à la calibration (partie 2) et au dépannage ; une fiche à remplir est fournie dans guide_positionnement_cameras_mire.pdf.</w:t>
+      </w:r>
+    </w:p>
+    <w:p>
+      <w:pPr>
+        <w:spacing w:after="120"/>
+      </w:pPr>
+      <w:r>
+        <w:t>Quand la mire est bonne pour les 3 caméras, passer à la calibration (partie 2).</w:t>
       </w:r>
     </w:p>
     <w:p>
@@ -2292,7 +2279,7 @@
         <w:t>(remplacez 0 par 1 ou 2 selon la caméra). Avant de calibrer, testez la détection des marqueurs : ArucoCalibrationTool.exe --check &lt;index caméra&gt; &lt;photo ou flux&gt;. Le programme détecte ensuite automatiquement les marqueurs de cette caméra (4 pour les caméras 1 et 3, 2 pour la caméra 2), calcule la calibration (rotation + échelle + position), et sauvegarde dans camera_0.yml (ou 1/2). Pour la caméra 2, si les marqueurs 5 et 6 sont décalés de la poche du milieu, indiquer la distance mesurée (en cm ; 14 cm prévus) avec l'option --decalage : ArucoCalibrationTool.exe --decalage &lt;distance&gt; 1 &lt;photo ou flux&gt;.</w:t>
       </w:r>
       <w:r>
-        <w:t xml:space="preserve"> Le positionnement des caméras a déjà été fait (partie 2).</w:t>
+        <w:t xml:space="preserve"> Le positionnement des caméras a déjà été fait (partie 1).</w:t>
       </w:r>
     </w:p>
     <w:p>

</xml_diff>

<commit_message>
Manuel : titres et renvois renumerotes (1 Positionnement, 2 Calibration, 3 Annexe)
'1. Objectif' devient 'Objectif' (introduction non numerotee). Positionnement
passe de 2 a 1 (2.1-2.7 -> 1.1-1.7), Calibration de 3 a 2 (3.1-3.7 ->
2.1-2.7), Annexe de 4 a 3. Les 12 renvois du texte (section 2.6, schema
2.2, section 3.1/3.4, (3.1), (3.4), (section 4)...) sont mis a jour pour
suivre ; coherent avec 'Partie 1/Partie 2' de la liste d'introduction.
.docx et PDF (chiffres remplaces en place, 9 pages, annexe inchangee).

Co-Authored-By: Claude Sonnet 5.5 <noreply@anthropic.com>
</commit_message>
<xml_diff>
--- a/docs/manuel_calibration_cameras.docx
+++ b/docs/manuel_calibration_cameras.docx
@@ -38,7 +38,7 @@
         <w:spacing w:after="150" w:before="300"/>
       </w:pPr>
       <w:r>
-        <w:t>1. Objectif</w:t>
+        <w:t>Objectif</w:t>
       </w:r>
     </w:p>
     <w:p>
@@ -88,7 +88,7 @@
         <w:spacing w:after="120"/>
       </w:pPr>
       <w:r>
-        <w:t>Chaque installation est différente : les valeurs données dans ce manuel sont celles de l'installation de référence et se recalculent si besoin (voir section 2.6).</w:t>
+        <w:t>Chaque installation est différente : les valeurs données dans ce manuel sont celles de l'installation de référence et se recalculent si besoin (voir section 1.6).</w:t>
       </w:r>
     </w:p>
     <w:p>
@@ -219,7 +219,7 @@
         <w:pageBreakBefore/>
       </w:pPr>
       <w:r>
-        <w:t>2. Positionnement des caméras</w:t>
+        <w:t>1. Positionnement des caméras</w:t>
       </w:r>
     </w:p>
     <w:p>
@@ -236,7 +236,7 @@
         <w:spacing w:after="150" w:before="300"/>
       </w:pPr>
       <w:r>
-        <w:t>2.1 Les points de la table</w:t>
+        <w:t>1.1 Les points de la table</w:t>
       </w:r>
     </w:p>
     <w:p>
@@ -357,7 +357,7 @@
         <w:spacing w:after="150" w:before="300"/>
       </w:pPr>
       <w:r>
-        <w:t>2.2 Schéma de positionnement</w:t>
+        <w:t>1.2 Schéma de positionnement</w:t>
       </w:r>
     </w:p>
     <w:p>
@@ -413,7 +413,7 @@
         <w:spacing w:after="150" w:before="300"/>
       </w:pPr>
       <w:r>
-        <w:t>2.3 La mire de cadrage</w:t>
+        <w:t>1.3 La mire de cadrage</w:t>
       </w:r>
     </w:p>
     <w:p>
@@ -669,7 +669,7 @@
         <w:spacing w:after="150" w:before="300"/>
       </w:pPr>
       <w:r>
-        <w:t>2.4 Positionner chaque caméra, pas à pas</w:t>
+        <w:t>1.4 Positionner chaque caméra, pas à pas</w:t>
       </w:r>
     </w:p>
     <w:p>
@@ -723,7 +723,7 @@
         <w:rPr>
           <w:b w:val="0"/>
         </w:rPr>
-        <w:t xml:space="preserve"> à la verticale du point indiqué au schéma 2.2 (caméra 2 : point bleu ; caméras 1 et 3 : à 97 cm du point bleu, au milieu de la largeur de la table).</w:t>
+        <w:t xml:space="preserve"> à la verticale du point indiqué au schéma 1.2 (caméra 2 : point bleu ; caméras 1 et 3 : à 97 cm du point bleu, au milieu de la largeur de la table).</w:t>
       </w:r>
     </w:p>
     <w:p>
@@ -792,7 +792,7 @@
         <w:rPr>
           <w:b w:val="0"/>
         </w:rPr>
-        <w:t xml:space="preserve"> les deux grands rails de la table doivent être parallèles aux bords gauche et droit du cadre vert (contrôle B, section 2.5).</w:t>
+        <w:t xml:space="preserve"> les deux grands rails de la table doivent être parallèles aux bords gauche et droit du cadre vert (contrôle B, section 1.5).</w:t>
       </w:r>
     </w:p>
     <w:p>
@@ -884,7 +884,7 @@
         <w:rPr>
           <w:b w:val="0"/>
         </w:rPr>
-        <w:t xml:space="preserve"> serrer les fixations puis revérifier la mire (serrer une vis fait souvent bouger la caméra). Noter les valeurs (section 2.7).</w:t>
+        <w:t xml:space="preserve"> serrer les fixations puis revérifier la mire (serrer une vis fait souvent bouger la caméra). Noter les valeurs (section 1.7).</w:t>
       </w:r>
     </w:p>
     <w:p>
@@ -893,7 +893,7 @@
         <w:spacing w:after="150" w:before="300"/>
       </w:pPr>
       <w:r>
-        <w:t>2.5 Les trois contrôles de la mire</w:t>
+        <w:t>1.5 Les trois contrôles de la mire</w:t>
       </w:r>
     </w:p>
     <w:p>
@@ -1061,7 +1061,7 @@
         <w:spacing w:after="150" w:before="300"/>
       </w:pPr>
       <w:r>
-        <w:t>2.6 Chaque installation est unique</w:t>
+        <w:t>1.6 Chaque installation est unique</w:t>
       </w:r>
     </w:p>
     <w:p>
@@ -1140,7 +1140,7 @@
       </w:pPr>
       <w:r>
         <w:rPr/>
-        <w:t>Positions des marqueurs : toujours mesurées à partir de la poche du milieu (centre de la table). Les distances de la section 3.4 sont à recalculer pour la nouvelle table et les nouvelles zones, puis la distance des marqueurs 5 et 6 est remesurée.</w:t>
+        <w:t>Positions des marqueurs : toujours mesurées à partir de la poche du milieu (centre de la table). Les distances de la section 2.4 sont à recalculer pour la nouvelle table et les nouvelles zones, puis la distance des marqueurs 5 et 6 est remesurée.</w:t>
       </w:r>
     </w:p>
     <w:p>
@@ -1172,7 +1172,7 @@
         <w:spacing w:after="150" w:before="300"/>
       </w:pPr>
       <w:r>
-        <w:t>2.7 Valeurs à noter pour chaque caméra</w:t>
+        <w:t>1.7 Valeurs à noter pour chaque caméra</w:t>
       </w:r>
     </w:p>
     <w:p>
@@ -1216,7 +1216,7 @@
         <w:pageBreakBefore/>
       </w:pPr>
       <w:r>
-        <w:t>3. Calibration par marqueurs</w:t>
+        <w:t>2. Calibration par marqueurs</w:t>
       </w:r>
     </w:p>
     <w:p>
@@ -1233,7 +1233,7 @@
         <w:spacing w:after="150" w:before="300"/>
       </w:pPr>
       <w:r>
-        <w:t>3.1 Schéma des marqueurs</w:t>
+        <w:t>2.1 Schéma des marqueurs</w:t>
       </w:r>
     </w:p>
     <w:p>
@@ -1281,7 +1281,7 @@
         <w:spacing w:after="120"/>
       </w:pPr>
       <w:r>
-        <w:t>Les 10 marqueurs sont collés sur la bordure de la table (le rail marron), aux positions du schéma. Toutes les cotes partent de l'axe central (la ligne qui passe par les deux poches du milieu) et vont jusqu'au CENTRE de chaque marqueur, pas jusqu'à son bord. Les positions sont aussi dans le tableau de la section 3.4.</w:t>
+        <w:t>Les 10 marqueurs sont collés sur la bordure de la table (le rail marron), aux positions du schéma. Toutes les cotes partent de l'axe central (la ligne qui passe par les deux poches du milieu) et vont jusqu'au CENTRE de chaque marqueur, pas jusqu'à son bord. Les positions sont aussi dans le tableau de la section 2.4.</w:t>
       </w:r>
     </w:p>
     <w:p>
@@ -1298,7 +1298,7 @@
         <w:spacing w:after="150" w:before="300"/>
       </w:pPr>
       <w:r>
-        <w:t>3.2 Générer et imprimer les marqueurs</w:t>
+        <w:t>2.2 Générer et imprimer les marqueurs</w:t>
       </w:r>
     </w:p>
     <w:p>
@@ -1326,7 +1326,7 @@
         <w:spacing w:after="120"/>
       </w:pPr>
       <w:r>
-        <w:t>Les 10 marqueurs à imprimer sont dans l'annexe de ce manuel (section 4) : imprimer ces deux pages à 100 % (taille réelle), sans « ajuster à la page ». Pour un premier test avec une seule caméra (caméra 2), seuls les marqueurs 5 et 6 sont nécessaires. La commande ci-dessus permet aussi de les générer soi-même (marker_1.png à marker_10.png).</w:t>
+        <w:t>Les 10 marqueurs à imprimer sont dans l'annexe de ce manuel (section 3) : imprimer ces deux pages à 100 % (taille réelle), sans « ajuster à la page ». Pour un premier test avec une seule caméra (caméra 2), seuls les marqueurs 5 et 6 sont nécessaires. La commande ci-dessus permet aussi de les générer soi-même (marker_1.png à marker_10.png).</w:t>
       </w:r>
     </w:p>
     <w:p>
@@ -1335,7 +1335,7 @@
         <w:spacing w:after="150" w:before="300"/>
       </w:pPr>
       <w:r>
-        <w:t>3.3 Coller les marqueurs sur la bordure</w:t>
+        <w:t>2.3 Coller les marqueurs sur la bordure</w:t>
       </w:r>
     </w:p>
     <w:p>
@@ -1348,7 +1348,7 @@
         <w:spacing w:after="80"/>
       </w:pPr>
       <w:r>
-        <w:t>Coller chaque marqueur sur la bordure (le rail marron), bien à plat, sans pli ni bulle, au bon numéro et à la bonne place : voir le schéma (3.1) et le tableau (3.4).</w:t>
+        <w:t>Coller chaque marqueur sur la bordure (le rail marron), bien à plat, sans pli ni bulle, au bon numéro et à la bonne place : voir le schéma (2.1) et le tableau (2.4).</w:t>
       </w:r>
     </w:p>
     <w:p>
@@ -1396,7 +1396,7 @@
         <w:spacing w:after="150" w:before="300"/>
       </w:pPr>
       <w:r>
-        <w:t>3.4 Positions des marqueurs</w:t>
+        <w:t>2.4 Positions des marqueurs</w:t>
       </w:r>
     </w:p>
     <w:p>
@@ -1404,7 +1404,7 @@
         <w:rPr>
           <w:b/>
         </w:rPr>
-        <w:t>Le tableau ci-dessous donne la position de chaque marqueur : distance mesurée le long du bord, de l'axe central (poches du milieu) jusqu'au CENTRE du marqueur. Voir le schéma de la section 3.1.</w:t>
+        <w:t>Le tableau ci-dessous donne la position de chaque marqueur : distance mesurée le long du bord, de l'axe central (poches du milieu) jusqu'au CENTRE du marqueur. Voir le schéma de la section 2.1.</w:t>
       </w:r>
       <w:r/>
     </w:p>
@@ -2248,7 +2248,7 @@
         <w:spacing w:after="150" w:before="300"/>
       </w:pPr>
       <w:r>
-        <w:t>3.5 Lancer la calibration</w:t>
+        <w:t>2.5 Lancer la calibration</w:t>
       </w:r>
     </w:p>
     <w:p>
@@ -2288,7 +2288,7 @@
         <w:spacing w:after="150" w:before="300"/>
       </w:pPr>
       <w:r>
-        <w:t>3.6 Vérification</w:t>
+        <w:t>2.6 Vérification</w:t>
       </w:r>
     </w:p>
     <w:p>
@@ -2336,7 +2336,7 @@
         <w:spacing w:after="150" w:before="300"/>
       </w:pPr>
       <w:r>
-        <w:t>3.7 Orientation des marqueurs</w:t>
+        <w:t>2.7 Orientation des marqueurs</w:t>
       </w:r>
     </w:p>
     <w:p>
@@ -2354,7 +2354,7 @@
         <w:spacing w:after="150" w:before="300"/>
       </w:pPr>
       <w:r>
-        <w:t>4. Annexe — Les 10 marqueurs à imprimer</w:t>
+        <w:t>3. Annexe — Les 10 marqueurs à imprimer</w:t>
       </w:r>
     </w:p>
     <w:p>
@@ -2377,7 +2377,7 @@
         <w:spacing w:after="120"/>
       </w:pPr>
       <w:r>
-        <w:t xml:space="preserve">Coller chaque marqueur à l'endroit indiqué par le schéma de la section 3.1 et le tableau de la section 3.4 (le numéro doit correspondre).</w:t>
+        <w:t xml:space="preserve">Coller chaque marqueur à l'endroit indiqué par le schéma de la section 2.1 et le tableau de la section 2.4 (le numéro doit correspondre).</w:t>
       </w:r>
     </w:p>
     <w:tbl>

</xml_diff>